<commit_message>
Cambios para la versión 2.4.0_000
</commit_message>
<xml_diff>
--- a/Integra-parent/documentacion/@Firma-Integra-services-InstalacionDespliegueYAdministracion-MAN.docx
+++ b/Integra-parent/documentacion/@Firma-Integra-services-InstalacionDespliegueYAdministracion-MAN.docx
@@ -76,7 +76,7 @@
           <w:sz w:val="36"/>
           <w:szCs w:val="36"/>
         </w:rPr>
-        <w:t>Integra 2.2.4_000</w:t>
+        <w:t>Integra 2.4.0_000</w:t>
       </w:r>
       <w:r>
         <w:rPr>
@@ -342,7 +342,7 @@
               <w:t>1</w:t>
             </w:r>
             <w:r>
-              <w:t>1</w:t>
+              <w:t>3</w:t>
             </w:r>
             <w:bookmarkEnd w:id="3"/>
             <w:bookmarkEnd w:id="4"/>
@@ -375,7 +375,10 @@
             </w:pPr>
             <w:bookmarkStart w:id="5" w:name="fecha_doc"/>
             <w:r>
-              <w:t>29</w:t>
+              <w:t>0</w:t>
+            </w:r>
+            <w:r>
+              <w:t>4</w:t>
             </w:r>
             <w:r>
               <w:t>-</w:t>
@@ -384,13 +387,13 @@
               <w:t>0</w:t>
             </w:r>
             <w:r>
-              <w:t>1</w:t>
+              <w:t>2</w:t>
             </w:r>
             <w:r>
               <w:t>-202</w:t>
             </w:r>
             <w:r>
-              <w:t>4</w:t>
+              <w:t>5</w:t>
             </w:r>
             <w:bookmarkEnd w:id="5"/>
           </w:p>
@@ -551,7 +554,7 @@
               <w:t>0</w:t>
             </w:r>
             <w:r>
-              <w:t>11</w:t>
+              <w:t>13</w:t>
             </w:r>
             <w:r>
               <w:fldChar w:fldCharType="end"/>
@@ -596,7 +599,7 @@
               <w:fldChar w:fldCharType="separate"/>
             </w:r>
             <w:r>
-              <w:t>29-01-2024</w:t>
+              <w:t>04-02-2025</w:t>
             </w:r>
             <w:r>
               <w:fldChar w:fldCharType="end"/>
@@ -1947,7 +1950,28 @@
               <w:suppressOverlap w:val="0"/>
             </w:pPr>
             <w:r>
-              <w:t>Se actualiza el documento para hacer referencia a la versión 2.2.4_000 de Integr@</w:t>
+              <w:t xml:space="preserve">Se actualiza el documento para hacer referencia a la versión </w:t>
+            </w:r>
+            <w:r>
+              <w:t>2.</w:t>
+            </w:r>
+            <w:r>
+              <w:t>2</w:t>
+            </w:r>
+            <w:r>
+              <w:t>.</w:t>
+            </w:r>
+            <w:r>
+              <w:t>4</w:t>
+            </w:r>
+            <w:r>
+              <w:t>_00</w:t>
+            </w:r>
+            <w:r>
+              <w:t>1</w:t>
+            </w:r>
+            <w:r>
+              <w:t xml:space="preserve"> de Integr@</w:t>
             </w:r>
             <w:r>
               <w:t xml:space="preserve"> y</w:t>
@@ -1963,6 +1987,252 @@
             </w:r>
             <w:r>
               <w:t>.</w:t>
+            </w:r>
+          </w:p>
+        </w:tc>
+      </w:tr>
+      <w:tr>
+        <w:tc>
+          <w:tcPr>
+            <w:tcW w:w="1488" w:type="dxa"/>
+          </w:tcPr>
+          <w:p>
+            <w:pPr>
+              <w:pStyle w:val="Tabla"/>
+              <w:framePr w:hSpace="0" w:wrap="auto" w:vAnchor="margin" w:yAlign="inline"/>
+              <w:suppressOverlap w:val="0"/>
+            </w:pPr>
+          </w:p>
+        </w:tc>
+        <w:tc>
+          <w:tcPr>
+            <w:tcW w:w="8080" w:type="dxa"/>
+          </w:tcPr>
+          <w:p>
+            <w:pPr>
+              <w:pStyle w:val="Tabla"/>
+              <w:framePr w:hSpace="0" w:wrap="auto" w:vAnchor="margin" w:yAlign="inline"/>
+              <w:suppressOverlap w:val="0"/>
+            </w:pPr>
+          </w:p>
+        </w:tc>
+      </w:tr>
+      <w:tr>
+        <w:tc>
+          <w:tcPr>
+            <w:tcW w:w="1488" w:type="dxa"/>
+          </w:tcPr>
+          <w:p>
+            <w:pPr>
+              <w:pStyle w:val="Tabla"/>
+              <w:framePr w:hSpace="0" w:wrap="auto" w:vAnchor="margin" w:yAlign="inline"/>
+              <w:suppressOverlap w:val="0"/>
+            </w:pPr>
+            <w:r>
+              <w:t>Rev.</w:t>
+            </w:r>
+          </w:p>
+        </w:tc>
+        <w:tc>
+          <w:tcPr>
+            <w:tcW w:w="8080" w:type="dxa"/>
+          </w:tcPr>
+          <w:p>
+            <w:pPr>
+              <w:pStyle w:val="Tabla"/>
+              <w:framePr w:hSpace="0" w:wrap="auto" w:vAnchor="margin" w:yAlign="inline"/>
+              <w:suppressOverlap w:val="0"/>
+            </w:pPr>
+            <w:r>
+              <w:t>0</w:t>
+            </w:r>
+            <w:r>
+              <w:t>12</w:t>
+            </w:r>
+          </w:p>
+        </w:tc>
+      </w:tr>
+      <w:tr>
+        <w:tc>
+          <w:tcPr>
+            <w:tcW w:w="1488" w:type="dxa"/>
+          </w:tcPr>
+          <w:p>
+            <w:pPr>
+              <w:pStyle w:val="Tabla"/>
+              <w:framePr w:hSpace="0" w:wrap="auto" w:vAnchor="margin" w:yAlign="inline"/>
+              <w:suppressOverlap w:val="0"/>
+            </w:pPr>
+            <w:r>
+              <w:t>Fecha</w:t>
+            </w:r>
+          </w:p>
+        </w:tc>
+        <w:tc>
+          <w:tcPr>
+            <w:tcW w:w="8080" w:type="dxa"/>
+          </w:tcPr>
+          <w:p>
+            <w:pPr>
+              <w:pStyle w:val="Tabla"/>
+              <w:framePr w:hSpace="0" w:wrap="auto" w:vAnchor="margin" w:yAlign="inline"/>
+              <w:suppressOverlap w:val="0"/>
+            </w:pPr>
+            <w:r>
+              <w:t>03-02-2025</w:t>
+            </w:r>
+          </w:p>
+        </w:tc>
+      </w:tr>
+      <w:tr>
+        <w:tc>
+          <w:tcPr>
+            <w:tcW w:w="1488" w:type="dxa"/>
+          </w:tcPr>
+          <w:p>
+            <w:pPr>
+              <w:pStyle w:val="Tabla"/>
+              <w:framePr w:hSpace="0" w:wrap="auto" w:vAnchor="margin" w:yAlign="inline"/>
+              <w:suppressOverlap w:val="0"/>
+            </w:pPr>
+            <w:r>
+              <w:t>Descripción</w:t>
+            </w:r>
+          </w:p>
+        </w:tc>
+        <w:tc>
+          <w:tcPr>
+            <w:tcW w:w="8080" w:type="dxa"/>
+          </w:tcPr>
+          <w:p>
+            <w:pPr>
+              <w:pStyle w:val="Tabla"/>
+              <w:framePr w:hSpace="0" w:wrap="auto" w:vAnchor="margin" w:yAlign="inline"/>
+              <w:suppressOverlap w:val="0"/>
+            </w:pPr>
+            <w:r>
+              <w:t>Se actualiza el documento para hacer referencia a la versión 2.3.0_000 de Integr@ y se corrige la versión de algunas librerías.</w:t>
+            </w:r>
+          </w:p>
+          <w:p>
+            <w:pPr>
+              <w:pStyle w:val="Tabla"/>
+              <w:framePr w:hSpace="0" w:wrap="auto" w:vAnchor="margin" w:yAlign="inline"/>
+              <w:suppressOverlap w:val="0"/>
+            </w:pPr>
+          </w:p>
+        </w:tc>
+      </w:tr>
+      <w:tr>
+        <w:tc>
+          <w:tcPr>
+            <w:tcW w:w="1488" w:type="dxa"/>
+          </w:tcPr>
+          <w:p>
+            <w:pPr>
+              <w:pStyle w:val="Tabla"/>
+              <w:framePr w:hSpace="0" w:wrap="auto" w:vAnchor="margin" w:yAlign="inline"/>
+              <w:suppressOverlap w:val="0"/>
+            </w:pPr>
+            <w:r>
+              <w:t>Rev.</w:t>
+            </w:r>
+          </w:p>
+        </w:tc>
+        <w:tc>
+          <w:tcPr>
+            <w:tcW w:w="8080" w:type="dxa"/>
+          </w:tcPr>
+          <w:p>
+            <w:pPr>
+              <w:pStyle w:val="Tabla"/>
+              <w:framePr w:hSpace="0" w:wrap="auto" w:vAnchor="margin" w:yAlign="inline"/>
+              <w:suppressOverlap w:val="0"/>
+            </w:pPr>
+            <w:r>
+              <w:t>0</w:t>
+            </w:r>
+            <w:r>
+              <w:t>1</w:t>
+            </w:r>
+            <w:r>
+              <w:t>3</w:t>
+            </w:r>
+          </w:p>
+        </w:tc>
+      </w:tr>
+      <w:tr>
+        <w:tc>
+          <w:tcPr>
+            <w:tcW w:w="1488" w:type="dxa"/>
+          </w:tcPr>
+          <w:p>
+            <w:pPr>
+              <w:pStyle w:val="Tabla"/>
+              <w:framePr w:hSpace="0" w:wrap="auto" w:vAnchor="margin" w:yAlign="inline"/>
+              <w:suppressOverlap w:val="0"/>
+            </w:pPr>
+            <w:r>
+              <w:t>Fecha</w:t>
+            </w:r>
+          </w:p>
+        </w:tc>
+        <w:tc>
+          <w:tcPr>
+            <w:tcW w:w="8080" w:type="dxa"/>
+          </w:tcPr>
+          <w:p>
+            <w:pPr>
+              <w:pStyle w:val="Tabla"/>
+              <w:framePr w:hSpace="0" w:wrap="auto" w:vAnchor="margin" w:yAlign="inline"/>
+              <w:suppressOverlap w:val="0"/>
+            </w:pPr>
+            <w:r>
+              <w:t>0</w:t>
+            </w:r>
+            <w:r>
+              <w:t>4</w:t>
+            </w:r>
+            <w:r>
+              <w:t>-02-2025</w:t>
+            </w:r>
+          </w:p>
+        </w:tc>
+      </w:tr>
+      <w:tr>
+        <w:tc>
+          <w:tcPr>
+            <w:tcW w:w="1488" w:type="dxa"/>
+          </w:tcPr>
+          <w:p>
+            <w:pPr>
+              <w:pStyle w:val="Tabla"/>
+              <w:framePr w:hSpace="0" w:wrap="auto" w:vAnchor="margin" w:yAlign="inline"/>
+              <w:suppressOverlap w:val="0"/>
+            </w:pPr>
+            <w:r>
+              <w:t>Descripción</w:t>
+            </w:r>
+          </w:p>
+        </w:tc>
+        <w:tc>
+          <w:tcPr>
+            <w:tcW w:w="8080" w:type="dxa"/>
+          </w:tcPr>
+          <w:p>
+            <w:pPr>
+              <w:pStyle w:val="Tabla"/>
+              <w:framePr w:hSpace="0" w:wrap="auto" w:vAnchor="margin" w:yAlign="inline"/>
+              <w:suppressOverlap w:val="0"/>
+            </w:pPr>
+            <w:r>
+              <w:t>Se actualiza el documento para hacer referencia a la versión 2.</w:t>
+            </w:r>
+            <w:r>
+              <w:t>4</w:t>
+            </w:r>
+            <w:r>
+              <w:t>.0_000 de Integr@.</w:t>
             </w:r>
           </w:p>
         </w:tc>
@@ -2092,7 +2362,7 @@
               <w:t>0</w:t>
             </w:r>
             <w:r>
-              <w:t>11</w:t>
+              <w:t>13</w:t>
             </w:r>
             <w:r>
               <w:fldChar w:fldCharType="end"/>
@@ -2139,7 +2409,7 @@
               <w:fldChar w:fldCharType="separate"/>
             </w:r>
             <w:r>
-              <w:t>29-01-2024</w:t>
+              <w:t>04-02-2025</w:t>
             </w:r>
             <w:r>
               <w:fldChar w:fldCharType="end"/>
@@ -2226,8 +2496,8 @@
           <w:b w:val="0"/>
           <w:spacing w:val="0"/>
           <w:kern w:val="2"/>
-          <w:sz w:val="22"/>
-          <w:szCs w:val="22"/>
+          <w:sz w:val="24"/>
+          <w:szCs w:val="24"/>
         </w:rPr>
       </w:pPr>
       <w:r>
@@ -2251,7 +2521,7 @@
         </w:rPr>
         <w:fldChar w:fldCharType="separate"/>
       </w:r>
-      <w:hyperlink w:anchor="_Toc157416997" w:history="1">
+      <w:hyperlink w:anchor="_Toc189562336" w:history="1">
         <w:r>
           <w:rPr>
             <w:rStyle w:val="Hipervnculo"/>
@@ -2264,8 +2534,8 @@
             <w:b w:val="0"/>
             <w:spacing w:val="0"/>
             <w:kern w:val="2"/>
-            <w:sz w:val="22"/>
-            <w:szCs w:val="22"/>
+            <w:sz w:val="24"/>
+            <w:szCs w:val="24"/>
           </w:rPr>
           <w:tab/>
         </w:r>
@@ -2292,7 +2562,7 @@
           <w:rPr>
             <w:webHidden/>
           </w:rPr>
-          <w:instrText xml:space="preserve"> PAGEREF _Toc157416997 \h </w:instrText>
+          <w:instrText xml:space="preserve"> PAGEREF _Toc189562336 \h </w:instrText>
         </w:r>
         <w:r>
           <w:rPr>
@@ -2329,11 +2599,11 @@
           <w:b w:val="0"/>
           <w:spacing w:val="0"/>
           <w:kern w:val="2"/>
-          <w:sz w:val="22"/>
-          <w:szCs w:val="22"/>
-        </w:rPr>
-      </w:pPr>
-      <w:hyperlink w:anchor="_Toc157416998" w:history="1">
+          <w:sz w:val="24"/>
+          <w:szCs w:val="24"/>
+        </w:rPr>
+      </w:pPr>
+      <w:hyperlink w:anchor="_Toc189562337" w:history="1">
         <w:r>
           <w:rPr>
             <w:rStyle w:val="Hipervnculo"/>
@@ -2346,8 +2616,8 @@
             <w:b w:val="0"/>
             <w:spacing w:val="0"/>
             <w:kern w:val="2"/>
-            <w:sz w:val="22"/>
-            <w:szCs w:val="22"/>
+            <w:sz w:val="24"/>
+            <w:szCs w:val="24"/>
           </w:rPr>
           <w:tab/>
         </w:r>
@@ -2374,7 +2644,7 @@
           <w:rPr>
             <w:webHidden/>
           </w:rPr>
-          <w:instrText xml:space="preserve"> PAGEREF _Toc157416998 \h </w:instrText>
+          <w:instrText xml:space="preserve"> PAGEREF _Toc189562337 \h </w:instrText>
         </w:r>
         <w:r>
           <w:rPr>
@@ -2411,11 +2681,11 @@
           <w:b w:val="0"/>
           <w:spacing w:val="0"/>
           <w:kern w:val="2"/>
-          <w:sz w:val="22"/>
-          <w:szCs w:val="22"/>
-        </w:rPr>
-      </w:pPr>
-      <w:hyperlink w:anchor="_Toc157416999" w:history="1">
+          <w:sz w:val="24"/>
+          <w:szCs w:val="24"/>
+        </w:rPr>
+      </w:pPr>
+      <w:hyperlink w:anchor="_Toc189562338" w:history="1">
         <w:r>
           <w:rPr>
             <w:rStyle w:val="Hipervnculo"/>
@@ -2428,8 +2698,8 @@
             <w:b w:val="0"/>
             <w:spacing w:val="0"/>
             <w:kern w:val="2"/>
-            <w:sz w:val="22"/>
-            <w:szCs w:val="22"/>
+            <w:sz w:val="24"/>
+            <w:szCs w:val="24"/>
           </w:rPr>
           <w:tab/>
         </w:r>
@@ -2456,7 +2726,7 @@
           <w:rPr>
             <w:webHidden/>
           </w:rPr>
-          <w:instrText xml:space="preserve"> PAGEREF _Toc157416999 \h </w:instrText>
+          <w:instrText xml:space="preserve"> PAGEREF _Toc189562338 \h </w:instrText>
         </w:r>
         <w:r>
           <w:rPr>
@@ -2493,11 +2763,11 @@
           <w:b w:val="0"/>
           <w:spacing w:val="0"/>
           <w:kern w:val="2"/>
-          <w:sz w:val="22"/>
-          <w:szCs w:val="22"/>
-        </w:rPr>
-      </w:pPr>
-      <w:hyperlink w:anchor="_Toc157417000" w:history="1">
+          <w:sz w:val="24"/>
+          <w:szCs w:val="24"/>
+        </w:rPr>
+      </w:pPr>
+      <w:hyperlink w:anchor="_Toc189562339" w:history="1">
         <w:r>
           <w:rPr>
             <w:rStyle w:val="Hipervnculo"/>
@@ -2509,8 +2779,8 @@
             <w:b w:val="0"/>
             <w:spacing w:val="0"/>
             <w:kern w:val="2"/>
-            <w:sz w:val="22"/>
-            <w:szCs w:val="22"/>
+            <w:sz w:val="24"/>
+            <w:szCs w:val="24"/>
           </w:rPr>
           <w:tab/>
         </w:r>
@@ -2536,7 +2806,7 @@
           <w:rPr>
             <w:webHidden/>
           </w:rPr>
-          <w:instrText xml:space="preserve"> PAGEREF _Toc157417000 \h </w:instrText>
+          <w:instrText xml:space="preserve"> PAGEREF _Toc189562339 \h </w:instrText>
         </w:r>
         <w:r>
           <w:rPr>
@@ -2573,11 +2843,11 @@
           <w:b w:val="0"/>
           <w:spacing w:val="0"/>
           <w:kern w:val="2"/>
-          <w:sz w:val="22"/>
-          <w:szCs w:val="22"/>
-        </w:rPr>
-      </w:pPr>
-      <w:hyperlink w:anchor="_Toc157417001" w:history="1">
+          <w:sz w:val="24"/>
+          <w:szCs w:val="24"/>
+        </w:rPr>
+      </w:pPr>
+      <w:hyperlink w:anchor="_Toc189562340" w:history="1">
         <w:r>
           <w:rPr>
             <w:rStyle w:val="Hipervnculo"/>
@@ -2590,8 +2860,8 @@
             <w:b w:val="0"/>
             <w:spacing w:val="0"/>
             <w:kern w:val="2"/>
-            <w:sz w:val="22"/>
-            <w:szCs w:val="22"/>
+            <w:sz w:val="24"/>
+            <w:szCs w:val="24"/>
           </w:rPr>
           <w:tab/>
         </w:r>
@@ -2618,7 +2888,7 @@
           <w:rPr>
             <w:webHidden/>
           </w:rPr>
-          <w:instrText xml:space="preserve"> PAGEREF _Toc157417001 \h </w:instrText>
+          <w:instrText xml:space="preserve"> PAGEREF _Toc189562340 \h </w:instrText>
         </w:r>
         <w:r>
           <w:rPr>
@@ -2651,11 +2921,11 @@
         <w:rPr>
           <w:spacing w:val="0"/>
           <w:kern w:val="2"/>
-          <w:sz w:val="22"/>
-          <w:szCs w:val="22"/>
-        </w:rPr>
-      </w:pPr>
-      <w:hyperlink w:anchor="_Toc157417002" w:history="1">
+          <w:sz w:val="24"/>
+          <w:szCs w:val="24"/>
+        </w:rPr>
+      </w:pPr>
+      <w:hyperlink w:anchor="_Toc189562341" w:history="1">
         <w:r>
           <w:rPr>
             <w:rStyle w:val="Hipervnculo"/>
@@ -2667,8 +2937,8 @@
           <w:rPr>
             <w:spacing w:val="0"/>
             <w:kern w:val="2"/>
-            <w:sz w:val="22"/>
-            <w:szCs w:val="22"/>
+            <w:sz w:val="24"/>
+            <w:szCs w:val="24"/>
           </w:rPr>
           <w:tab/>
         </w:r>
@@ -2695,7 +2965,7 @@
           <w:rPr>
             <w:webHidden/>
           </w:rPr>
-          <w:instrText xml:space="preserve"> PAGEREF _Toc157417002 \h </w:instrText>
+          <w:instrText xml:space="preserve"> PAGEREF _Toc189562341 \h </w:instrText>
         </w:r>
         <w:r>
           <w:rPr>
@@ -2728,11 +2998,11 @@
         <w:rPr>
           <w:spacing w:val="0"/>
           <w:kern w:val="2"/>
-          <w:sz w:val="22"/>
-          <w:szCs w:val="22"/>
-        </w:rPr>
-      </w:pPr>
-      <w:hyperlink w:anchor="_Toc157417003" w:history="1">
+          <w:sz w:val="24"/>
+          <w:szCs w:val="24"/>
+        </w:rPr>
+      </w:pPr>
+      <w:hyperlink w:anchor="_Toc189562342" w:history="1">
         <w:r>
           <w:rPr>
             <w:rStyle w:val="Hipervnculo"/>
@@ -2744,8 +3014,8 @@
           <w:rPr>
             <w:spacing w:val="0"/>
             <w:kern w:val="2"/>
-            <w:sz w:val="22"/>
-            <w:szCs w:val="22"/>
+            <w:sz w:val="24"/>
+            <w:szCs w:val="24"/>
           </w:rPr>
           <w:tab/>
         </w:r>
@@ -2772,7 +3042,7 @@
           <w:rPr>
             <w:webHidden/>
           </w:rPr>
-          <w:instrText xml:space="preserve"> PAGEREF _Toc157417003 \h </w:instrText>
+          <w:instrText xml:space="preserve"> PAGEREF _Toc189562342 \h </w:instrText>
         </w:r>
         <w:r>
           <w:rPr>
@@ -2809,11 +3079,11 @@
           <w:b w:val="0"/>
           <w:spacing w:val="0"/>
           <w:kern w:val="2"/>
-          <w:sz w:val="22"/>
-          <w:szCs w:val="22"/>
-        </w:rPr>
-      </w:pPr>
-      <w:hyperlink w:anchor="_Toc157417004" w:history="1">
+          <w:sz w:val="24"/>
+          <w:szCs w:val="24"/>
+        </w:rPr>
+      </w:pPr>
+      <w:hyperlink w:anchor="_Toc189562343" w:history="1">
         <w:r>
           <w:rPr>
             <w:rStyle w:val="Hipervnculo"/>
@@ -2826,8 +3096,8 @@
             <w:b w:val="0"/>
             <w:spacing w:val="0"/>
             <w:kern w:val="2"/>
-            <w:sz w:val="22"/>
-            <w:szCs w:val="22"/>
+            <w:sz w:val="24"/>
+            <w:szCs w:val="24"/>
           </w:rPr>
           <w:tab/>
         </w:r>
@@ -2854,7 +3124,7 @@
           <w:rPr>
             <w:webHidden/>
           </w:rPr>
-          <w:instrText xml:space="preserve"> PAGEREF _Toc157417004 \h </w:instrText>
+          <w:instrText xml:space="preserve"> PAGEREF _Toc189562343 \h </w:instrText>
         </w:r>
         <w:r>
           <w:rPr>
@@ -2887,11 +3157,11 @@
         <w:rPr>
           <w:spacing w:val="0"/>
           <w:kern w:val="2"/>
-          <w:sz w:val="22"/>
-          <w:szCs w:val="22"/>
-        </w:rPr>
-      </w:pPr>
-      <w:hyperlink w:anchor="_Toc157417005" w:history="1">
+          <w:sz w:val="24"/>
+          <w:szCs w:val="24"/>
+        </w:rPr>
+      </w:pPr>
+      <w:hyperlink w:anchor="_Toc189562344" w:history="1">
         <w:r>
           <w:rPr>
             <w:rStyle w:val="Hipervnculo"/>
@@ -2903,8 +3173,8 @@
           <w:rPr>
             <w:spacing w:val="0"/>
             <w:kern w:val="2"/>
-            <w:sz w:val="22"/>
-            <w:szCs w:val="22"/>
+            <w:sz w:val="24"/>
+            <w:szCs w:val="24"/>
           </w:rPr>
           <w:tab/>
         </w:r>
@@ -2931,7 +3201,7 @@
           <w:rPr>
             <w:webHidden/>
           </w:rPr>
-          <w:instrText xml:space="preserve"> PAGEREF _Toc157417005 \h </w:instrText>
+          <w:instrText xml:space="preserve"> PAGEREF _Toc189562344 \h </w:instrText>
         </w:r>
         <w:r>
           <w:rPr>
@@ -2964,11 +3234,11 @@
         <w:rPr>
           <w:spacing w:val="0"/>
           <w:kern w:val="2"/>
-          <w:sz w:val="22"/>
-          <w:szCs w:val="22"/>
-        </w:rPr>
-      </w:pPr>
-      <w:hyperlink w:anchor="_Toc157417006" w:history="1">
+          <w:sz w:val="24"/>
+          <w:szCs w:val="24"/>
+        </w:rPr>
+      </w:pPr>
+      <w:hyperlink w:anchor="_Toc189562345" w:history="1">
         <w:r>
           <w:rPr>
             <w:rStyle w:val="Hipervnculo"/>
@@ -2980,8 +3250,8 @@
           <w:rPr>
             <w:spacing w:val="0"/>
             <w:kern w:val="2"/>
-            <w:sz w:val="22"/>
-            <w:szCs w:val="22"/>
+            <w:sz w:val="24"/>
+            <w:szCs w:val="24"/>
           </w:rPr>
           <w:tab/>
         </w:r>
@@ -3008,7 +3278,7 @@
           <w:rPr>
             <w:webHidden/>
           </w:rPr>
-          <w:instrText xml:space="preserve"> PAGEREF _Toc157417006 \h </w:instrText>
+          <w:instrText xml:space="preserve"> PAGEREF _Toc189562345 \h </w:instrText>
         </w:r>
         <w:r>
           <w:rPr>
@@ -3045,11 +3315,11 @@
           <w:b w:val="0"/>
           <w:spacing w:val="0"/>
           <w:kern w:val="2"/>
-          <w:sz w:val="22"/>
-          <w:szCs w:val="22"/>
-        </w:rPr>
-      </w:pPr>
-      <w:hyperlink w:anchor="_Toc157417007" w:history="1">
+          <w:sz w:val="24"/>
+          <w:szCs w:val="24"/>
+        </w:rPr>
+      </w:pPr>
+      <w:hyperlink w:anchor="_Toc189562346" w:history="1">
         <w:r>
           <w:rPr>
             <w:rStyle w:val="Hipervnculo"/>
@@ -3062,8 +3332,8 @@
             <w:b w:val="0"/>
             <w:spacing w:val="0"/>
             <w:kern w:val="2"/>
-            <w:sz w:val="22"/>
-            <w:szCs w:val="22"/>
+            <w:sz w:val="24"/>
+            <w:szCs w:val="24"/>
           </w:rPr>
           <w:tab/>
         </w:r>
@@ -3090,7 +3360,7 @@
           <w:rPr>
             <w:webHidden/>
           </w:rPr>
-          <w:instrText xml:space="preserve"> PAGEREF _Toc157417007 \h </w:instrText>
+          <w:instrText xml:space="preserve"> PAGEREF _Toc189562346 \h </w:instrText>
         </w:r>
         <w:r>
           <w:rPr>
@@ -3123,11 +3393,11 @@
         <w:rPr>
           <w:spacing w:val="0"/>
           <w:kern w:val="2"/>
-          <w:sz w:val="22"/>
-          <w:szCs w:val="22"/>
-        </w:rPr>
-      </w:pPr>
-      <w:hyperlink w:anchor="_Toc157417008" w:history="1">
+          <w:sz w:val="24"/>
+          <w:szCs w:val="24"/>
+        </w:rPr>
+      </w:pPr>
+      <w:hyperlink w:anchor="_Toc189562347" w:history="1">
         <w:r>
           <w:rPr>
             <w:rStyle w:val="Hipervnculo"/>
@@ -3138,8 +3408,8 @@
           <w:rPr>
             <w:spacing w:val="0"/>
             <w:kern w:val="2"/>
-            <w:sz w:val="22"/>
-            <w:szCs w:val="22"/>
+            <w:sz w:val="24"/>
+            <w:szCs w:val="24"/>
           </w:rPr>
           <w:tab/>
         </w:r>
@@ -3165,7 +3435,7 @@
           <w:rPr>
             <w:webHidden/>
           </w:rPr>
-          <w:instrText xml:space="preserve"> PAGEREF _Toc157417008 \h </w:instrText>
+          <w:instrText xml:space="preserve"> PAGEREF _Toc189562347 \h </w:instrText>
         </w:r>
         <w:r>
           <w:rPr>
@@ -3198,11 +3468,11 @@
         <w:rPr>
           <w:spacing w:val="0"/>
           <w:kern w:val="2"/>
-          <w:sz w:val="22"/>
-          <w:szCs w:val="22"/>
-        </w:rPr>
-      </w:pPr>
-      <w:hyperlink w:anchor="_Toc157417009" w:history="1">
+          <w:sz w:val="24"/>
+          <w:szCs w:val="24"/>
+        </w:rPr>
+      </w:pPr>
+      <w:hyperlink w:anchor="_Toc189562348" w:history="1">
         <w:r>
           <w:rPr>
             <w:rStyle w:val="Hipervnculo"/>
@@ -3213,8 +3483,8 @@
           <w:rPr>
             <w:spacing w:val="0"/>
             <w:kern w:val="2"/>
-            <w:sz w:val="22"/>
-            <w:szCs w:val="22"/>
+            <w:sz w:val="24"/>
+            <w:szCs w:val="24"/>
           </w:rPr>
           <w:tab/>
         </w:r>
@@ -3240,7 +3510,7 @@
           <w:rPr>
             <w:webHidden/>
           </w:rPr>
-          <w:instrText xml:space="preserve"> PAGEREF _Toc157417009 \h </w:instrText>
+          <w:instrText xml:space="preserve"> PAGEREF _Toc189562348 \h </w:instrText>
         </w:r>
         <w:r>
           <w:rPr>
@@ -3273,11 +3543,11 @@
         <w:rPr>
           <w:spacing w:val="0"/>
           <w:kern w:val="2"/>
-          <w:sz w:val="22"/>
-          <w:szCs w:val="22"/>
-        </w:rPr>
-      </w:pPr>
-      <w:hyperlink w:anchor="_Toc157417010" w:history="1">
+          <w:sz w:val="24"/>
+          <w:szCs w:val="24"/>
+        </w:rPr>
+      </w:pPr>
+      <w:hyperlink w:anchor="_Toc189562349" w:history="1">
         <w:r>
           <w:rPr>
             <w:rStyle w:val="Hipervnculo"/>
@@ -3288,8 +3558,8 @@
           <w:rPr>
             <w:spacing w:val="0"/>
             <w:kern w:val="2"/>
-            <w:sz w:val="22"/>
-            <w:szCs w:val="22"/>
+            <w:sz w:val="24"/>
+            <w:szCs w:val="24"/>
           </w:rPr>
           <w:tab/>
         </w:r>
@@ -3315,7 +3585,7 @@
           <w:rPr>
             <w:webHidden/>
           </w:rPr>
-          <w:instrText xml:space="preserve"> PAGEREF _Toc157417010 \h </w:instrText>
+          <w:instrText xml:space="preserve"> PAGEREF _Toc189562349 \h </w:instrText>
         </w:r>
         <w:r>
           <w:rPr>
@@ -3348,11 +3618,11 @@
         <w:rPr>
           <w:spacing w:val="0"/>
           <w:kern w:val="2"/>
-          <w:sz w:val="22"/>
-          <w:szCs w:val="22"/>
-        </w:rPr>
-      </w:pPr>
-      <w:hyperlink w:anchor="_Toc157417011" w:history="1">
+          <w:sz w:val="24"/>
+          <w:szCs w:val="24"/>
+        </w:rPr>
+      </w:pPr>
+      <w:hyperlink w:anchor="_Toc189562350" w:history="1">
         <w:r>
           <w:rPr>
             <w:rStyle w:val="Hipervnculo"/>
@@ -3363,8 +3633,8 @@
           <w:rPr>
             <w:spacing w:val="0"/>
             <w:kern w:val="2"/>
-            <w:sz w:val="22"/>
-            <w:szCs w:val="22"/>
+            <w:sz w:val="24"/>
+            <w:szCs w:val="24"/>
           </w:rPr>
           <w:tab/>
         </w:r>
@@ -3390,7 +3660,7 @@
           <w:rPr>
             <w:webHidden/>
           </w:rPr>
-          <w:instrText xml:space="preserve"> PAGEREF _Toc157417011 \h </w:instrText>
+          <w:instrText xml:space="preserve"> PAGEREF _Toc189562350 \h </w:instrText>
         </w:r>
         <w:r>
           <w:rPr>
@@ -3423,11 +3693,11 @@
         <w:rPr>
           <w:spacing w:val="0"/>
           <w:kern w:val="2"/>
-          <w:sz w:val="22"/>
-          <w:szCs w:val="22"/>
-        </w:rPr>
-      </w:pPr>
-      <w:hyperlink w:anchor="_Toc157417012" w:history="1">
+          <w:sz w:val="24"/>
+          <w:szCs w:val="24"/>
+        </w:rPr>
+      </w:pPr>
+      <w:hyperlink w:anchor="_Toc189562351" w:history="1">
         <w:r>
           <w:rPr>
             <w:rStyle w:val="Hipervnculo"/>
@@ -3438,8 +3708,8 @@
           <w:rPr>
             <w:spacing w:val="0"/>
             <w:kern w:val="2"/>
-            <w:sz w:val="22"/>
-            <w:szCs w:val="22"/>
+            <w:sz w:val="24"/>
+            <w:szCs w:val="24"/>
           </w:rPr>
           <w:tab/>
         </w:r>
@@ -3465,7 +3735,7 @@
           <w:rPr>
             <w:webHidden/>
           </w:rPr>
-          <w:instrText xml:space="preserve"> PAGEREF _Toc157417012 \h </w:instrText>
+          <w:instrText xml:space="preserve"> PAGEREF _Toc189562351 \h </w:instrText>
         </w:r>
         <w:r>
           <w:rPr>
@@ -3502,11 +3772,11 @@
           <w:b w:val="0"/>
           <w:spacing w:val="0"/>
           <w:kern w:val="2"/>
-          <w:sz w:val="22"/>
-          <w:szCs w:val="22"/>
-        </w:rPr>
-      </w:pPr>
-      <w:hyperlink w:anchor="_Toc157417013" w:history="1">
+          <w:sz w:val="24"/>
+          <w:szCs w:val="24"/>
+        </w:rPr>
+      </w:pPr>
+      <w:hyperlink w:anchor="_Toc189562352" w:history="1">
         <w:r>
           <w:rPr>
             <w:rStyle w:val="Hipervnculo"/>
@@ -3518,8 +3788,8 @@
             <w:b w:val="0"/>
             <w:spacing w:val="0"/>
             <w:kern w:val="2"/>
-            <w:sz w:val="22"/>
-            <w:szCs w:val="22"/>
+            <w:sz w:val="24"/>
+            <w:szCs w:val="24"/>
           </w:rPr>
           <w:tab/>
         </w:r>
@@ -3545,7 +3815,7 @@
           <w:rPr>
             <w:webHidden/>
           </w:rPr>
-          <w:instrText xml:space="preserve"> PAGEREF _Toc157417013 \h </w:instrText>
+          <w:instrText xml:space="preserve"> PAGEREF _Toc189562352 \h </w:instrText>
         </w:r>
         <w:r>
           <w:rPr>
@@ -3578,11 +3848,11 @@
         <w:rPr>
           <w:spacing w:val="0"/>
           <w:kern w:val="2"/>
-          <w:sz w:val="22"/>
-          <w:szCs w:val="22"/>
-        </w:rPr>
-      </w:pPr>
-      <w:hyperlink w:anchor="_Toc157417014" w:history="1">
+          <w:sz w:val="24"/>
+          <w:szCs w:val="24"/>
+        </w:rPr>
+      </w:pPr>
+      <w:hyperlink w:anchor="_Toc189562353" w:history="1">
         <w:r>
           <w:rPr>
             <w:rStyle w:val="Hipervnculo"/>
@@ -3593,8 +3863,8 @@
           <w:rPr>
             <w:spacing w:val="0"/>
             <w:kern w:val="2"/>
-            <w:sz w:val="22"/>
-            <w:szCs w:val="22"/>
+            <w:sz w:val="24"/>
+            <w:szCs w:val="24"/>
           </w:rPr>
           <w:tab/>
         </w:r>
@@ -3620,7 +3890,7 @@
           <w:rPr>
             <w:webHidden/>
           </w:rPr>
-          <w:instrText xml:space="preserve"> PAGEREF _Toc157417014 \h </w:instrText>
+          <w:instrText xml:space="preserve"> PAGEREF _Toc189562353 \h </w:instrText>
         </w:r>
         <w:r>
           <w:rPr>
@@ -3653,11 +3923,11 @@
         <w:rPr>
           <w:spacing w:val="0"/>
           <w:kern w:val="2"/>
-          <w:sz w:val="22"/>
-          <w:szCs w:val="22"/>
-        </w:rPr>
-      </w:pPr>
-      <w:hyperlink w:anchor="_Toc157417015" w:history="1">
+          <w:sz w:val="24"/>
+          <w:szCs w:val="24"/>
+        </w:rPr>
+      </w:pPr>
+      <w:hyperlink w:anchor="_Toc189562354" w:history="1">
         <w:r>
           <w:rPr>
             <w:rStyle w:val="Hipervnculo"/>
@@ -3668,8 +3938,8 @@
           <w:rPr>
             <w:spacing w:val="0"/>
             <w:kern w:val="2"/>
-            <w:sz w:val="22"/>
-            <w:szCs w:val="22"/>
+            <w:sz w:val="24"/>
+            <w:szCs w:val="24"/>
           </w:rPr>
           <w:tab/>
         </w:r>
@@ -3695,7 +3965,7 @@
           <w:rPr>
             <w:webHidden/>
           </w:rPr>
-          <w:instrText xml:space="preserve"> PAGEREF _Toc157417015 \h </w:instrText>
+          <w:instrText xml:space="preserve"> PAGEREF _Toc189562354 \h </w:instrText>
         </w:r>
         <w:r>
           <w:rPr>
@@ -3728,11 +3998,11 @@
         <w:rPr>
           <w:spacing w:val="0"/>
           <w:kern w:val="2"/>
-          <w:sz w:val="22"/>
-          <w:szCs w:val="22"/>
-        </w:rPr>
-      </w:pPr>
-      <w:hyperlink w:anchor="_Toc157417016" w:history="1">
+          <w:sz w:val="24"/>
+          <w:szCs w:val="24"/>
+        </w:rPr>
+      </w:pPr>
+      <w:hyperlink w:anchor="_Toc189562355" w:history="1">
         <w:r>
           <w:rPr>
             <w:rStyle w:val="Hipervnculo"/>
@@ -3743,8 +4013,8 @@
           <w:rPr>
             <w:spacing w:val="0"/>
             <w:kern w:val="2"/>
-            <w:sz w:val="22"/>
-            <w:szCs w:val="22"/>
+            <w:sz w:val="24"/>
+            <w:szCs w:val="24"/>
           </w:rPr>
           <w:tab/>
         </w:r>
@@ -3770,7 +4040,7 @@
           <w:rPr>
             <w:webHidden/>
           </w:rPr>
-          <w:instrText xml:space="preserve"> PAGEREF _Toc157417016 \h </w:instrText>
+          <w:instrText xml:space="preserve"> PAGEREF _Toc189562355 \h </w:instrText>
         </w:r>
         <w:r>
           <w:rPr>
@@ -3803,11 +4073,11 @@
         <w:rPr>
           <w:spacing w:val="0"/>
           <w:kern w:val="2"/>
-          <w:sz w:val="22"/>
-          <w:szCs w:val="22"/>
-        </w:rPr>
-      </w:pPr>
-      <w:hyperlink w:anchor="_Toc157417017" w:history="1">
+          <w:sz w:val="24"/>
+          <w:szCs w:val="24"/>
+        </w:rPr>
+      </w:pPr>
+      <w:hyperlink w:anchor="_Toc189562356" w:history="1">
         <w:r>
           <w:rPr>
             <w:rStyle w:val="Hipervnculo"/>
@@ -3818,8 +4088,8 @@
           <w:rPr>
             <w:spacing w:val="0"/>
             <w:kern w:val="2"/>
-            <w:sz w:val="22"/>
-            <w:szCs w:val="22"/>
+            <w:sz w:val="24"/>
+            <w:szCs w:val="24"/>
           </w:rPr>
           <w:tab/>
         </w:r>
@@ -3845,7 +4115,7 @@
           <w:rPr>
             <w:webHidden/>
           </w:rPr>
-          <w:instrText xml:space="preserve"> PAGEREF _Toc157417017 \h </w:instrText>
+          <w:instrText xml:space="preserve"> PAGEREF _Toc189562356 \h </w:instrText>
         </w:r>
         <w:r>
           <w:rPr>
@@ -3878,11 +4148,11 @@
         <w:rPr>
           <w:spacing w:val="0"/>
           <w:kern w:val="2"/>
-          <w:sz w:val="22"/>
-          <w:szCs w:val="22"/>
-        </w:rPr>
-      </w:pPr>
-      <w:hyperlink w:anchor="_Toc157417018" w:history="1">
+          <w:sz w:val="24"/>
+          <w:szCs w:val="24"/>
+        </w:rPr>
+      </w:pPr>
+      <w:hyperlink w:anchor="_Toc189562357" w:history="1">
         <w:r>
           <w:rPr>
             <w:rStyle w:val="Hipervnculo"/>
@@ -3893,8 +4163,8 @@
           <w:rPr>
             <w:spacing w:val="0"/>
             <w:kern w:val="2"/>
-            <w:sz w:val="22"/>
-            <w:szCs w:val="22"/>
+            <w:sz w:val="24"/>
+            <w:szCs w:val="24"/>
           </w:rPr>
           <w:tab/>
         </w:r>
@@ -3920,7 +4190,7 @@
           <w:rPr>
             <w:webHidden/>
           </w:rPr>
-          <w:instrText xml:space="preserve"> PAGEREF _Toc157417018 \h </w:instrText>
+          <w:instrText xml:space="preserve"> PAGEREF _Toc189562357 \h </w:instrText>
         </w:r>
         <w:r>
           <w:rPr>
@@ -3953,11 +4223,11 @@
         <w:rPr>
           <w:spacing w:val="0"/>
           <w:kern w:val="2"/>
-          <w:sz w:val="22"/>
-          <w:szCs w:val="22"/>
-        </w:rPr>
-      </w:pPr>
-      <w:hyperlink w:anchor="_Toc157417019" w:history="1">
+          <w:sz w:val="24"/>
+          <w:szCs w:val="24"/>
+        </w:rPr>
+      </w:pPr>
+      <w:hyperlink w:anchor="_Toc189562358" w:history="1">
         <w:r>
           <w:rPr>
             <w:rStyle w:val="Hipervnculo"/>
@@ -3968,8 +4238,8 @@
           <w:rPr>
             <w:spacing w:val="0"/>
             <w:kern w:val="2"/>
-            <w:sz w:val="22"/>
-            <w:szCs w:val="22"/>
+            <w:sz w:val="24"/>
+            <w:szCs w:val="24"/>
           </w:rPr>
           <w:tab/>
         </w:r>
@@ -3995,7 +4265,7 @@
           <w:rPr>
             <w:webHidden/>
           </w:rPr>
-          <w:instrText xml:space="preserve"> PAGEREF _Toc157417019 \h </w:instrText>
+          <w:instrText xml:space="preserve"> PAGEREF _Toc189562358 \h </w:instrText>
         </w:r>
         <w:r>
           <w:rPr>
@@ -4028,11 +4298,11 @@
         <w:rPr>
           <w:spacing w:val="0"/>
           <w:kern w:val="2"/>
-          <w:sz w:val="22"/>
-          <w:szCs w:val="22"/>
-        </w:rPr>
-      </w:pPr>
-      <w:hyperlink w:anchor="_Toc157417020" w:history="1">
+          <w:sz w:val="24"/>
+          <w:szCs w:val="24"/>
+        </w:rPr>
+      </w:pPr>
+      <w:hyperlink w:anchor="_Toc189562359" w:history="1">
         <w:r>
           <w:rPr>
             <w:rStyle w:val="Hipervnculo"/>
@@ -4043,8 +4313,8 @@
           <w:rPr>
             <w:spacing w:val="0"/>
             <w:kern w:val="2"/>
-            <w:sz w:val="22"/>
-            <w:szCs w:val="22"/>
+            <w:sz w:val="24"/>
+            <w:szCs w:val="24"/>
           </w:rPr>
           <w:tab/>
         </w:r>
@@ -4070,7 +4340,7 @@
           <w:rPr>
             <w:webHidden/>
           </w:rPr>
-          <w:instrText xml:space="preserve"> PAGEREF _Toc157417020 \h </w:instrText>
+          <w:instrText xml:space="preserve"> PAGEREF _Toc189562359 \h </w:instrText>
         </w:r>
         <w:r>
           <w:rPr>
@@ -4103,11 +4373,11 @@
         <w:rPr>
           <w:spacing w:val="0"/>
           <w:kern w:val="2"/>
-          <w:sz w:val="22"/>
-          <w:szCs w:val="22"/>
-        </w:rPr>
-      </w:pPr>
-      <w:hyperlink w:anchor="_Toc157417021" w:history="1">
+          <w:sz w:val="24"/>
+          <w:szCs w:val="24"/>
+        </w:rPr>
+      </w:pPr>
+      <w:hyperlink w:anchor="_Toc189562360" w:history="1">
         <w:r>
           <w:rPr>
             <w:rStyle w:val="Hipervnculo"/>
@@ -4118,8 +4388,8 @@
           <w:rPr>
             <w:spacing w:val="0"/>
             <w:kern w:val="2"/>
-            <w:sz w:val="22"/>
-            <w:szCs w:val="22"/>
+            <w:sz w:val="24"/>
+            <w:szCs w:val="24"/>
           </w:rPr>
           <w:tab/>
         </w:r>
@@ -4145,7 +4415,7 @@
           <w:rPr>
             <w:webHidden/>
           </w:rPr>
-          <w:instrText xml:space="preserve"> PAGEREF _Toc157417021 \h </w:instrText>
+          <w:instrText xml:space="preserve"> PAGEREF _Toc189562360 \h </w:instrText>
         </w:r>
         <w:r>
           <w:rPr>
@@ -4178,11 +4448,11 @@
         <w:rPr>
           <w:spacing w:val="0"/>
           <w:kern w:val="2"/>
-          <w:sz w:val="22"/>
-          <w:szCs w:val="22"/>
-        </w:rPr>
-      </w:pPr>
-      <w:hyperlink w:anchor="_Toc157417022" w:history="1">
+          <w:sz w:val="24"/>
+          <w:szCs w:val="24"/>
+        </w:rPr>
+      </w:pPr>
+      <w:hyperlink w:anchor="_Toc189562361" w:history="1">
         <w:r>
           <w:rPr>
             <w:rStyle w:val="Hipervnculo"/>
@@ -4193,8 +4463,8 @@
           <w:rPr>
             <w:spacing w:val="0"/>
             <w:kern w:val="2"/>
-            <w:sz w:val="22"/>
-            <w:szCs w:val="22"/>
+            <w:sz w:val="24"/>
+            <w:szCs w:val="24"/>
           </w:rPr>
           <w:tab/>
         </w:r>
@@ -4220,7 +4490,7 @@
           <w:rPr>
             <w:webHidden/>
           </w:rPr>
-          <w:instrText xml:space="preserve"> PAGEREF _Toc157417022 \h </w:instrText>
+          <w:instrText xml:space="preserve"> PAGEREF _Toc189562361 \h </w:instrText>
         </w:r>
         <w:r>
           <w:rPr>
@@ -4253,11 +4523,11 @@
         <w:rPr>
           <w:spacing w:val="0"/>
           <w:kern w:val="2"/>
-          <w:sz w:val="22"/>
-          <w:szCs w:val="22"/>
-        </w:rPr>
-      </w:pPr>
-      <w:hyperlink w:anchor="_Toc157417023" w:history="1">
+          <w:sz w:val="24"/>
+          <w:szCs w:val="24"/>
+        </w:rPr>
+      </w:pPr>
+      <w:hyperlink w:anchor="_Toc189562362" w:history="1">
         <w:r>
           <w:rPr>
             <w:rStyle w:val="Hipervnculo"/>
@@ -4268,8 +4538,8 @@
           <w:rPr>
             <w:spacing w:val="0"/>
             <w:kern w:val="2"/>
-            <w:sz w:val="22"/>
-            <w:szCs w:val="22"/>
+            <w:sz w:val="24"/>
+            <w:szCs w:val="24"/>
           </w:rPr>
           <w:tab/>
         </w:r>
@@ -4295,7 +4565,7 @@
           <w:rPr>
             <w:webHidden/>
           </w:rPr>
-          <w:instrText xml:space="preserve"> PAGEREF _Toc157417023 \h </w:instrText>
+          <w:instrText xml:space="preserve"> PAGEREF _Toc189562362 \h </w:instrText>
         </w:r>
         <w:r>
           <w:rPr>
@@ -4328,11 +4598,11 @@
         <w:rPr>
           <w:spacing w:val="0"/>
           <w:kern w:val="2"/>
-          <w:sz w:val="22"/>
-          <w:szCs w:val="22"/>
-        </w:rPr>
-      </w:pPr>
-      <w:hyperlink w:anchor="_Toc157417024" w:history="1">
+          <w:sz w:val="24"/>
+          <w:szCs w:val="24"/>
+        </w:rPr>
+      </w:pPr>
+      <w:hyperlink w:anchor="_Toc189562363" w:history="1">
         <w:r>
           <w:rPr>
             <w:rStyle w:val="Hipervnculo"/>
@@ -4343,8 +4613,8 @@
           <w:rPr>
             <w:spacing w:val="0"/>
             <w:kern w:val="2"/>
-            <w:sz w:val="22"/>
-            <w:szCs w:val="22"/>
+            <w:sz w:val="24"/>
+            <w:szCs w:val="24"/>
           </w:rPr>
           <w:tab/>
         </w:r>
@@ -4370,7 +4640,7 @@
           <w:rPr>
             <w:webHidden/>
           </w:rPr>
-          <w:instrText xml:space="preserve"> PAGEREF _Toc157417024 \h </w:instrText>
+          <w:instrText xml:space="preserve"> PAGEREF _Toc189562363 \h </w:instrText>
         </w:r>
         <w:r>
           <w:rPr>
@@ -4403,11 +4673,11 @@
         <w:rPr>
           <w:spacing w:val="0"/>
           <w:kern w:val="2"/>
-          <w:sz w:val="22"/>
-          <w:szCs w:val="22"/>
-        </w:rPr>
-      </w:pPr>
-      <w:hyperlink w:anchor="_Toc157417025" w:history="1">
+          <w:sz w:val="24"/>
+          <w:szCs w:val="24"/>
+        </w:rPr>
+      </w:pPr>
+      <w:hyperlink w:anchor="_Toc189562364" w:history="1">
         <w:r>
           <w:rPr>
             <w:rStyle w:val="Hipervnculo"/>
@@ -4418,8 +4688,8 @@
           <w:rPr>
             <w:spacing w:val="0"/>
             <w:kern w:val="2"/>
-            <w:sz w:val="22"/>
-            <w:szCs w:val="22"/>
+            <w:sz w:val="24"/>
+            <w:szCs w:val="24"/>
           </w:rPr>
           <w:tab/>
         </w:r>
@@ -4445,7 +4715,7 @@
           <w:rPr>
             <w:webHidden/>
           </w:rPr>
-          <w:instrText xml:space="preserve"> PAGEREF _Toc157417025 \h </w:instrText>
+          <w:instrText xml:space="preserve"> PAGEREF _Toc189562364 \h </w:instrText>
         </w:r>
         <w:r>
           <w:rPr>
@@ -4462,7 +4732,7 @@
           <w:rPr>
             <w:webHidden/>
           </w:rPr>
-          <w:t>47</w:t>
+          <w:t>48</w:t>
         </w:r>
         <w:r>
           <w:rPr>
@@ -4478,11 +4748,11 @@
         <w:rPr>
           <w:spacing w:val="0"/>
           <w:kern w:val="2"/>
-          <w:sz w:val="22"/>
-          <w:szCs w:val="22"/>
-        </w:rPr>
-      </w:pPr>
-      <w:hyperlink w:anchor="_Toc157417026" w:history="1">
+          <w:sz w:val="24"/>
+          <w:szCs w:val="24"/>
+        </w:rPr>
+      </w:pPr>
+      <w:hyperlink w:anchor="_Toc189562365" w:history="1">
         <w:r>
           <w:rPr>
             <w:rStyle w:val="Hipervnculo"/>
@@ -4493,8 +4763,8 @@
           <w:rPr>
             <w:spacing w:val="0"/>
             <w:kern w:val="2"/>
-            <w:sz w:val="22"/>
-            <w:szCs w:val="22"/>
+            <w:sz w:val="24"/>
+            <w:szCs w:val="24"/>
           </w:rPr>
           <w:tab/>
         </w:r>
@@ -4520,7 +4790,7 @@
           <w:rPr>
             <w:webHidden/>
           </w:rPr>
-          <w:instrText xml:space="preserve"> PAGEREF _Toc157417026 \h </w:instrText>
+          <w:instrText xml:space="preserve"> PAGEREF _Toc189562365 \h </w:instrText>
         </w:r>
         <w:r>
           <w:rPr>
@@ -4575,7 +4845,7 @@
         </w:rPr>
         <w:br w:type="page"/>
       </w:r>
-      <w:bookmarkStart w:id="17" w:name="_Toc157416997"/>
+      <w:bookmarkStart w:id="17" w:name="_Toc189562336"/>
       <w:r>
         <w:rPr>
           <w:rFonts w:cs="Calibri"/>
@@ -4594,6 +4864,7 @@
     <w:p>
       <w:pPr>
         <w:pStyle w:val="Texto"/>
+        <w:ind w:left="709" w:hanging="709"/>
         <w:rPr>
           <w:rFonts w:ascii="Calibri" w:hAnsi="Calibri" w:cs="Calibri"/>
           <w:sz w:val="24"/>
@@ -4667,7 +4938,7 @@
           <w:rFonts w:ascii="Calibri" w:hAnsi="Calibri" w:cs="Calibri"/>
           <w:sz w:val="24"/>
         </w:rPr>
-        <w:t>2.2.4_000</w:t>
+        <w:t>2.4.0_000</w:t>
       </w:r>
       <w:r>
         <w:rPr>
@@ -4726,7 +4997,7 @@
           <w:rFonts w:cs="Calibri"/>
         </w:rPr>
       </w:pPr>
-      <w:bookmarkStart w:id="18" w:name="_Toc157416998"/>
+      <w:bookmarkStart w:id="18" w:name="_Toc189562337"/>
       <w:r>
         <w:rPr>
           <w:rFonts w:cs="Calibri"/>
@@ -4821,7 +5092,7 @@
           <w:rFonts w:cs="Calibri"/>
         </w:rPr>
       </w:pPr>
-      <w:bookmarkStart w:id="19" w:name="_Toc157416999"/>
+      <w:bookmarkStart w:id="19" w:name="_Toc189562338"/>
       <w:r>
         <w:rPr>
           <w:rFonts w:cs="Calibri"/>
@@ -8316,7 +8587,7 @@
         <w:lastRenderedPageBreak/>
         <w:t xml:space="preserve"> </w:t>
       </w:r>
-      <w:bookmarkStart w:id="20" w:name="_Toc157417000"/>
+      <w:bookmarkStart w:id="20" w:name="_Toc189562339"/>
       <w:r>
         <w:t>Introducción</w:t>
       </w:r>
@@ -8486,7 +8757,7 @@
           <w:rFonts w:cs="Calibri"/>
           <w:snapToGrid w:val="0"/>
         </w:rPr>
-        <w:t>2.2.4_000</w:t>
+        <w:t>2.4.0_000</w:t>
       </w:r>
       <w:r>
         <w:rPr>
@@ -8516,7 +8787,7 @@
         </w:rPr>
         <w:br w:type="page"/>
       </w:r>
-      <w:bookmarkStart w:id="21" w:name="_Toc157417001"/>
+      <w:bookmarkStart w:id="21" w:name="_Toc189562340"/>
       <w:r>
         <w:rPr>
           <w:rFonts w:cs="Calibri"/>
@@ -8558,7 +8829,7 @@
           <w:rFonts w:cs="Calibri"/>
         </w:rPr>
       </w:pPr>
-      <w:bookmarkStart w:id="22" w:name="_Toc157417002"/>
+      <w:bookmarkStart w:id="22" w:name="_Toc189562341"/>
       <w:r>
         <w:rPr>
           <w:rFonts w:cs="Calibri"/>
@@ -8743,13 +9014,13 @@
               <w:rPr>
                 <w:rFonts w:cs="Calibri"/>
               </w:rPr>
-              <w:t>JDK 1.</w:t>
+              <w:t>JDK 1</w:t>
             </w:r>
             <w:r>
               <w:rPr>
                 <w:rFonts w:cs="Calibri"/>
               </w:rPr>
-              <w:t>8</w:t>
+              <w:t>7</w:t>
             </w:r>
             <w:r>
               <w:rPr>
@@ -8863,7 +9134,7 @@
           <w:rFonts w:cs="Calibri"/>
         </w:rPr>
       </w:pPr>
-      <w:bookmarkStart w:id="23" w:name="_Toc157417003"/>
+      <w:bookmarkStart w:id="23" w:name="_Toc189562342"/>
       <w:r>
         <w:rPr>
           <w:rFonts w:cs="Calibri"/>
@@ -9078,7 +9349,25 @@
               <w:rPr>
                 <w:rFonts w:cs="Calibri"/>
               </w:rPr>
-              <w:t>20.0</w:t>
+              <w:t>2</w:t>
+            </w:r>
+            <w:r>
+              <w:rPr>
+                <w:rFonts w:cs="Calibri"/>
+              </w:rPr>
+              <w:t>3</w:t>
+            </w:r>
+            <w:r>
+              <w:rPr>
+                <w:rFonts w:cs="Calibri"/>
+              </w:rPr>
+              <w:t>.</w:t>
+            </w:r>
+            <w:r>
+              <w:rPr>
+                <w:rFonts w:cs="Calibri"/>
+              </w:rPr>
+              <w:t>1</w:t>
             </w:r>
           </w:p>
         </w:tc>
@@ -9147,7 +9436,19 @@
               <w:rPr>
                 <w:rFonts w:cs="Calibri"/>
               </w:rPr>
-              <w:t>2.3</w:t>
+              <w:t>3</w:t>
+            </w:r>
+            <w:r>
+              <w:rPr>
+                <w:rFonts w:cs="Calibri"/>
+              </w:rPr>
+              <w:t>.</w:t>
+            </w:r>
+            <w:r>
+              <w:rPr>
+                <w:rFonts w:cs="Calibri"/>
+              </w:rPr>
+              <w:t>9.9</w:t>
             </w:r>
           </w:p>
         </w:tc>
@@ -9197,7 +9498,7 @@
           <w:rFonts w:cs="Calibri"/>
         </w:rPr>
       </w:pPr>
-      <w:bookmarkStart w:id="24" w:name="_Toc157417004"/>
+      <w:bookmarkStart w:id="24" w:name="_Toc189562343"/>
       <w:r>
         <w:rPr>
           <w:rFonts w:cs="Calibri"/>
@@ -9251,7 +9552,7 @@
           <w:rFonts w:cs="Calibri"/>
         </w:rPr>
       </w:pPr>
-      <w:bookmarkStart w:id="25" w:name="_Toc157417005"/>
+      <w:bookmarkStart w:id="25" w:name="_Toc189562344"/>
       <w:r>
         <w:rPr>
           <w:rFonts w:cs="Calibri"/>
@@ -9327,7 +9628,7 @@
           <w:rFonts w:cs="Calibri"/>
           <w:b/>
         </w:rPr>
-        <w:t>2.2.4_000</w:t>
+        <w:t>2.4.0_000</w:t>
       </w:r>
       <w:r>
         <w:rPr>
@@ -9390,7 +9691,7 @@
           <w:rFonts w:cs="Calibri"/>
           <w:b/>
         </w:rPr>
-        <w:t>2.2.4_000</w:t>
+        <w:t>2.4.0_000</w:t>
       </w:r>
       <w:r>
         <w:rPr>
@@ -9418,20 +9719,27 @@
           <w:rFonts w:cs="Calibri"/>
           <w:lang w:val="es-ES_tradnl"/>
         </w:rPr>
-        <w:t>Instalar JDK 1.</w:t>
+        <w:t xml:space="preserve">Instalar JDK </w:t>
       </w:r>
       <w:r>
         <w:rPr>
           <w:rFonts w:cs="Calibri"/>
           <w:lang w:val="es-ES_tradnl"/>
         </w:rPr>
-        <w:t>8</w:t>
+        <w:t>1</w:t>
       </w:r>
       <w:r>
         <w:rPr>
           <w:rFonts w:cs="Calibri"/>
           <w:lang w:val="es-ES_tradnl"/>
         </w:rPr>
+        <w:t>7</w:t>
+      </w:r>
+      <w:r>
+        <w:rPr>
+          <w:rFonts w:cs="Calibri"/>
+          <w:lang w:val="es-ES_tradnl"/>
+        </w:rPr>
         <w:t xml:space="preserve"> en la máquina del Servidor</w:t>
       </w:r>
       <w:r>
@@ -9446,35 +9754,28 @@
           <w:rFonts w:cs="Calibri"/>
           <w:lang w:val="es-ES_tradnl"/>
         </w:rPr>
-        <w:t>1.</w:t>
+        <w:t>1</w:t>
       </w:r>
       <w:r>
         <w:rPr>
           <w:rFonts w:cs="Calibri"/>
           <w:lang w:val="es-ES_tradnl"/>
         </w:rPr>
-        <w:t>8</w:t>
+        <w:t>7</w:t>
       </w:r>
       <w:r>
         <w:rPr>
           <w:rFonts w:cs="Calibri"/>
           <w:lang w:val="es-ES_tradnl"/>
         </w:rPr>
-        <w:t>.0</w:t>
+        <w:t>.0.</w:t>
       </w:r>
       <w:r>
         <w:rPr>
           <w:rFonts w:cs="Calibri"/>
           <w:lang w:val="es-ES_tradnl"/>
         </w:rPr>
-        <w:t>_28</w:t>
-      </w:r>
-      <w:r>
-        <w:rPr>
-          <w:rFonts w:cs="Calibri"/>
-          <w:lang w:val="es-ES_tradnl"/>
-        </w:rPr>
-        <w:t>1</w:t>
+        <w:t>11</w:t>
       </w:r>
       <w:r>
         <w:rPr>
@@ -9538,7 +9839,7 @@
           <w:rFonts w:cs="Calibri"/>
           <w:lang w:val="es-ES_tradnl"/>
         </w:rPr>
-        <w:t>67</w:t>
+        <w:t>96</w:t>
       </w:r>
       <w:r>
         <w:rPr>
@@ -9657,7 +9958,7 @@
           <w:rFonts w:cs="Calibri"/>
         </w:rPr>
       </w:pPr>
-      <w:bookmarkStart w:id="26" w:name="_Toc157417006"/>
+      <w:bookmarkStart w:id="26" w:name="_Toc189562345"/>
       <w:r>
         <w:rPr>
           <w:rFonts w:cs="Calibri"/>
@@ -9844,7 +10145,7 @@
           <w:rFonts w:cs="Calibri"/>
         </w:rPr>
       </w:pPr>
-      <w:bookmarkStart w:id="27" w:name="_Toc157417007"/>
+      <w:bookmarkStart w:id="27" w:name="_Toc189562346"/>
       <w:r>
         <w:rPr>
           <w:rFonts w:cs="Calibri"/>
@@ -9906,7 +10207,7 @@
       <w:pPr>
         <w:pStyle w:val="Ttulo2"/>
       </w:pPr>
-      <w:bookmarkStart w:id="28" w:name="_Toc157417008"/>
+      <w:bookmarkStart w:id="28" w:name="_Toc189562347"/>
       <w:proofErr w:type="spellStart"/>
       <w:r>
         <w:t>AfirmaServices</w:t>
@@ -10080,7 +10381,7 @@
       <w:pPr>
         <w:pStyle w:val="Ttulo2"/>
       </w:pPr>
-      <w:bookmarkStart w:id="29" w:name="_Toc157417009"/>
+      <w:bookmarkStart w:id="29" w:name="_Toc189562348"/>
       <w:proofErr w:type="spellStart"/>
       <w:r>
         <w:t>IntegraServices</w:t>
@@ -10254,7 +10555,7 @@
       <w:pPr>
         <w:pStyle w:val="Ttulo2"/>
       </w:pPr>
-      <w:bookmarkStart w:id="30" w:name="_Toc157417010"/>
+      <w:bookmarkStart w:id="30" w:name="_Toc189562349"/>
       <w:proofErr w:type="spellStart"/>
       <w:r>
         <w:t>TSAServices</w:t>
@@ -10396,7 +10697,7 @@
       <w:pPr>
         <w:pStyle w:val="Ttulo2"/>
       </w:pPr>
-      <w:bookmarkStart w:id="31" w:name="_Toc157417011"/>
+      <w:bookmarkStart w:id="31" w:name="_Toc189562350"/>
       <w:proofErr w:type="spellStart"/>
       <w:r>
         <w:t>EvisorServices</w:t>
@@ -10555,7 +10856,7 @@
       <w:pPr>
         <w:pStyle w:val="Ttulo2"/>
       </w:pPr>
-      <w:bookmarkStart w:id="32" w:name="_Toc157417012"/>
+      <w:bookmarkStart w:id="32" w:name="_Toc189562351"/>
       <w:proofErr w:type="spellStart"/>
       <w:r>
         <w:t>CipherServices</w:t>
@@ -10730,7 +11031,7 @@
       <w:r>
         <w:br w:type="page"/>
       </w:r>
-      <w:bookmarkStart w:id="33" w:name="_Toc157417013"/>
+      <w:bookmarkStart w:id="33" w:name="_Toc189562352"/>
       <w:r>
         <w:lastRenderedPageBreak/>
         <w:t>Configuración</w:t>
@@ -10755,7 +11056,7 @@
       <w:pPr>
         <w:pStyle w:val="Ttulo2"/>
       </w:pPr>
-      <w:bookmarkStart w:id="34" w:name="_Toc157417014"/>
+      <w:bookmarkStart w:id="34" w:name="_Toc189562353"/>
       <w:r>
         <w:t>Configuración estática</w:t>
       </w:r>
@@ -10867,6 +11168,10 @@
         <w:t xml:space="preserve">Archivo </w:t>
       </w:r>
       <w:r>
+        <w:rPr>
+          <w:b/>
+          <w:bCs/>
+        </w:rPr>
         <w:t>integra-</w:t>
       </w:r>
       <w:r>
@@ -10950,7 +11255,7 @@
       <w:pPr>
         <w:pStyle w:val="Ttulo3"/>
       </w:pPr>
-      <w:bookmarkStart w:id="36" w:name="_Toc157417015"/>
+      <w:bookmarkStart w:id="36" w:name="_Toc189562354"/>
       <w:r>
         <w:t>Carpeta transformersTemplates</w:t>
       </w:r>
@@ -14501,7 +14806,7 @@
         <w:pStyle w:val="Ttulo3"/>
       </w:pPr>
       <w:bookmarkStart w:id="44" w:name="_Toc453065742"/>
-      <w:bookmarkStart w:id="45" w:name="_Toc157417016"/>
+      <w:bookmarkStart w:id="45" w:name="_Toc189562355"/>
       <w:r>
         <w:t xml:space="preserve">Archivo </w:t>
       </w:r>
@@ -14880,7 +15185,7 @@
         <w:pStyle w:val="Ttulo3"/>
       </w:pPr>
       <w:bookmarkStart w:id="46" w:name="_Toc453065743"/>
-      <w:bookmarkStart w:id="47" w:name="_Toc157417017"/>
+      <w:bookmarkStart w:id="47" w:name="_Toc189562356"/>
       <w:r>
         <w:lastRenderedPageBreak/>
         <w:t xml:space="preserve">Archivo </w:t>
@@ -15062,7 +15367,7 @@
         <w:pStyle w:val="Ttulo3"/>
       </w:pPr>
       <w:bookmarkStart w:id="48" w:name="_Toc453065744"/>
-      <w:bookmarkStart w:id="49" w:name="_Toc157417018"/>
+      <w:bookmarkStart w:id="49" w:name="_Toc189562357"/>
       <w:r>
         <w:t xml:space="preserve">Archivo </w:t>
       </w:r>
@@ -15097,7 +15402,7 @@
         <w:pStyle w:val="Ttulo3"/>
       </w:pPr>
       <w:bookmarkStart w:id="50" w:name="_Toc453065745"/>
-      <w:bookmarkStart w:id="51" w:name="_Toc157417019"/>
+      <w:bookmarkStart w:id="51" w:name="_Toc189562358"/>
       <w:r>
         <w:t xml:space="preserve">Archivo </w:t>
       </w:r>
@@ -15307,7 +15612,7 @@
         <w:pStyle w:val="Ttulo3"/>
       </w:pPr>
       <w:bookmarkStart w:id="52" w:name="_Toc453065746"/>
-      <w:bookmarkStart w:id="53" w:name="_Toc157417020"/>
+      <w:bookmarkStart w:id="53" w:name="_Toc189562359"/>
       <w:r>
         <w:t xml:space="preserve">Archivo </w:t>
       </w:r>
@@ -15830,7 +16135,7 @@
       <w:pPr>
         <w:pStyle w:val="Ttulo2"/>
       </w:pPr>
-      <w:bookmarkStart w:id="56" w:name="_Toc157417021"/>
+      <w:bookmarkStart w:id="56" w:name="_Toc189562360"/>
       <w:r>
         <w:t>Configuración dinámica</w:t>
       </w:r>
@@ -16406,7 +16711,7 @@
       <w:pPr>
         <w:pStyle w:val="Ttulo3"/>
       </w:pPr>
-      <w:bookmarkStart w:id="59" w:name="_Toc157417022"/>
+      <w:bookmarkStart w:id="59" w:name="_Toc189562361"/>
       <w:r>
         <w:t>Archivo mappingFiles</w:t>
       </w:r>
@@ -16515,7 +16820,7 @@
       <w:pPr>
         <w:pStyle w:val="Ttulo3"/>
       </w:pPr>
-      <w:bookmarkStart w:id="60" w:name="_Toc157417023"/>
+      <w:bookmarkStart w:id="60" w:name="_Toc189562362"/>
       <w:bookmarkEnd w:id="58"/>
       <w:r>
         <w:t>Configuraciones generales Integr@</w:t>
@@ -17183,7 +17488,21 @@
         <w:rPr>
           <w:lang w:val="es-ES_tradnl"/>
         </w:rPr>
-        <w:t xml:space="preserve"> o no), XAdES (</w:t>
+        <w:t xml:space="preserve"> o no), </w:t>
+      </w:r>
+      <w:proofErr w:type="spellStart"/>
+      <w:r>
+        <w:rPr>
+          <w:lang w:val="es-ES_tradnl"/>
+        </w:rPr>
+        <w:t>XAdES</w:t>
+      </w:r>
+      <w:proofErr w:type="spellEnd"/>
+      <w:r>
+        <w:rPr>
+          <w:lang w:val="es-ES_tradnl"/>
+        </w:rPr>
+        <w:t xml:space="preserve"> (</w:t>
       </w:r>
       <w:proofErr w:type="spellStart"/>
       <w:r>
@@ -17955,6 +18274,74 @@
     <w:p>
       <w:pPr>
         <w:numPr>
+          <w:ilvl w:val="2"/>
+          <w:numId w:val="28"/>
+        </w:numPr>
+        <w:rPr>
+          <w:b/>
+        </w:rPr>
+      </w:pPr>
+      <w:r>
+        <w:rPr>
+          <w:b/>
+        </w:rPr>
+        <w:t>SHA1withECDSA</w:t>
+      </w:r>
+    </w:p>
+    <w:p>
+      <w:pPr>
+        <w:numPr>
+          <w:ilvl w:val="2"/>
+          <w:numId w:val="28"/>
+        </w:numPr>
+        <w:rPr>
+          <w:b/>
+        </w:rPr>
+      </w:pPr>
+      <w:r>
+        <w:rPr>
+          <w:b/>
+        </w:rPr>
+        <w:t>SHA256withECDSA</w:t>
+      </w:r>
+    </w:p>
+    <w:p>
+      <w:pPr>
+        <w:numPr>
+          <w:ilvl w:val="2"/>
+          <w:numId w:val="28"/>
+        </w:numPr>
+        <w:rPr>
+          <w:b/>
+        </w:rPr>
+      </w:pPr>
+      <w:r>
+        <w:rPr>
+          <w:b/>
+        </w:rPr>
+        <w:t>SHA384withECDSA</w:t>
+      </w:r>
+    </w:p>
+    <w:p>
+      <w:pPr>
+        <w:numPr>
+          <w:ilvl w:val="2"/>
+          <w:numId w:val="28"/>
+        </w:numPr>
+        <w:rPr>
+          <w:b/>
+        </w:rPr>
+      </w:pPr>
+      <w:r>
+        <w:rPr>
+          <w:b/>
+        </w:rPr>
+        <w:t>SHA512withECDSA</w:t>
+      </w:r>
+    </w:p>
+    <w:p>
+      <w:pPr>
+        <w:numPr>
           <w:ilvl w:val="0"/>
           <w:numId w:val="28"/>
         </w:numPr>
@@ -18207,6 +18594,7 @@
         <w:rPr>
           <w:b/>
         </w:rPr>
+        <w:lastRenderedPageBreak/>
         <w:t>JCEKS</w:t>
       </w:r>
     </w:p>
@@ -18281,7 +18669,6 @@
       </w:pPr>
       <w:bookmarkStart w:id="68" w:name="_Toc453065734"/>
       <w:r>
-        <w:lastRenderedPageBreak/>
         <w:t>Propiedades de política</w:t>
       </w:r>
       <w:bookmarkEnd w:id="68"/>
@@ -18912,6 +19299,7 @@
       <w:bookmarkStart w:id="72" w:name="_Ref411519373"/>
       <w:bookmarkEnd w:id="71"/>
       <w:r>
+        <w:lastRenderedPageBreak/>
         <w:t xml:space="preserve">Listado de </w:t>
       </w:r>
       <w:proofErr w:type="spellStart"/>
@@ -18999,7 +19387,6 @@
           <w:b/>
           <w:lang w:val="es-ES_tradnl"/>
         </w:rPr>
-        <w:lastRenderedPageBreak/>
         <w:t>XML_HASH</w:t>
       </w:r>
       <w:r>
@@ -19572,6 +19959,7 @@
           <w:b/>
           <w:lang w:val="es-ES_tradnl"/>
         </w:rPr>
+        <w:lastRenderedPageBreak/>
         <w:t>HASH_ALGORITHM</w:t>
       </w:r>
       <w:r>
@@ -19682,7 +20070,6 @@
           <w:noProof/>
           <w:sz w:val="20"/>
         </w:rPr>
-        <w:lastRenderedPageBreak/>
         <w:t>ASN1_HASH-SHA512 = 2.16.840.1.101.3.4.2.3</w:t>
       </w:r>
     </w:p>
@@ -20134,6 +20521,7 @@
         <w:rPr>
           <w:b/>
         </w:rPr>
+        <w:lastRenderedPageBreak/>
         <w:t>PDF_POLICY_ID:</w:t>
       </w:r>
       <w:r>
@@ -20181,7 +20569,6 @@
           <w:sz w:val="20"/>
           <w:lang w:val="en-US"/>
         </w:rPr>
-        <w:lastRenderedPageBreak/>
         <w:t>PDF_POLICY_ID = PDF_AGE_1.9</w:t>
       </w:r>
     </w:p>
@@ -20525,6 +20912,7 @@
     </w:p>
     <w:p>
       <w:r>
+        <w:lastRenderedPageBreak/>
         <w:t>Por ejemplo:</w:t>
       </w:r>
     </w:p>
@@ -20953,6 +21341,7 @@
         <w:ind w:left="63"/>
       </w:pPr>
       <w:r>
+        <w:lastRenderedPageBreak/>
         <w:t>Por ejemplo:</w:t>
       </w:r>
     </w:p>
@@ -20988,7 +21377,6 @@
         <w:pStyle w:val="Ttulo6"/>
       </w:pPr>
       <w:r>
-        <w:lastRenderedPageBreak/>
         <w:t>Algoritmos de R</w:t>
       </w:r>
       <w:r>
@@ -21507,6 +21895,7 @@
           <w:sz w:val="20"/>
           <w:lang w:val="en-US"/>
         </w:rPr>
+        <w:lastRenderedPageBreak/>
         <w:t>XML_AGE_1.9_URL-ALLOWED_SIGN_ALGORITHM = XML_SIGN_HASH-SHA1WithRSA,XML_SIGN_HASH-SHA256WithRSA,XML_SIGN_HASH-SHA512WithRSA</w:t>
       </w:r>
     </w:p>
@@ -21536,7 +21925,6 @@
     </w:p>
     <w:p>
       <w:r>
-        <w:lastRenderedPageBreak/>
         <w:t xml:space="preserve">Tendrá el formato </w:t>
       </w:r>
       <w:r>
@@ -21941,6 +22329,7 @@
     </w:p>
     <w:p>
       <w:r>
+        <w:lastRenderedPageBreak/>
         <w:t>Los elementos pueden ser XML o ASN.1. Cada elemento estará separado por coma (,). Para especificar que se debe elegir entre varios se usará el operador lógico OR (|).</w:t>
       </w:r>
       <w:r>
@@ -22015,7 +22404,6 @@
         </w:rPr>
       </w:pPr>
       <w:r>
-        <w:lastRenderedPageBreak/>
         <w:t xml:space="preserve">Si el elemento es ASN.1 su nombre se cogerá de la lista de </w:t>
       </w:r>
       <w:proofErr w:type="spellStart"/>
@@ -22522,6 +22910,7 @@
     </w:p>
     <w:p>
       <w:r>
+        <w:lastRenderedPageBreak/>
         <w:t>Los elementos pueden ser XML o ASN.1. Cada elemento estará separado por coma (,). Para especificar que se debe elegir entre varios se usará el operador lógico OR (|).</w:t>
       </w:r>
       <w:r>
@@ -22591,7 +22980,6 @@
     </w:p>
     <w:p>
       <w:r>
-        <w:lastRenderedPageBreak/>
         <w:t xml:space="preserve">Si el elemento es ASN.1 su nombre se cogerá de la lista de </w:t>
       </w:r>
       <w:proofErr w:type="spellStart"/>
@@ -23071,6 +23459,7 @@
     </w:p>
     <w:p>
       <w:r>
+        <w:lastRenderedPageBreak/>
         <w:t>Los elementos pueden ser XML o ASN.1. Cada elemento estará separado por coma (,).</w:t>
       </w:r>
       <w:r>
@@ -23134,7 +23523,6 @@
     </w:p>
     <w:p>
       <w:r>
-        <w:lastRenderedPageBreak/>
         <w:t xml:space="preserve">Si el elemento es ASN.1 su nombre se cogerá de la lista de </w:t>
       </w:r>
       <w:proofErr w:type="spellStart"/>
@@ -23586,6 +23974,7 @@
         <w:rPr>
           <w:lang w:val="en-US"/>
         </w:rPr>
+        <w:lastRenderedPageBreak/>
         <w:t xml:space="preserve">Por </w:t>
       </w:r>
       <w:r>
@@ -23646,7 +24035,6 @@
     </w:p>
     <w:p>
       <w:r>
-        <w:lastRenderedPageBreak/>
         <w:t>Incluye una lista con los nombres de las entradas que no puede contener la firma. Cada entrada se incl</w:t>
       </w:r>
       <w:r>
@@ -24034,6 +24422,7 @@
         </w:rPr>
       </w:pPr>
       <w:r>
+        <w:lastRenderedPageBreak/>
         <w:t xml:space="preserve">Para un elemento se puede especificar su lista de hijos </w:t>
       </w:r>
       <w:r>
@@ -24149,7 +24538,6 @@
         <w:rPr>
           <w:b/>
         </w:rPr>
-        <w:lastRenderedPageBreak/>
         <w:t>OPTIONAL_CHILD</w:t>
       </w:r>
       <w:r>
@@ -24579,6 +24967,7 @@
         <w:rPr>
           <w:b/>
         </w:rPr>
+        <w:lastRenderedPageBreak/>
         <w:t>REQUIRED_VALUE</w:t>
       </w:r>
       <w:r>
@@ -24736,7 +25125,6 @@
           <w:sz w:val="20"/>
           <w:lang w:val="en-US"/>
         </w:rPr>
-        <w:lastRenderedPageBreak/>
         <w:t>XML_AGE_1.9_URL-[ClaimedRoles]-REQUIRED_VALUE = supplier|emisor|customer|receptor|third party|tercero</w:t>
       </w:r>
     </w:p>
@@ -24905,7 +25293,6 @@
         <w:t xml:space="preserve">ID_POLICY-[ELEMENT_NAME]-NOT_ALLOWED_VALUE </w:t>
       </w:r>
       <w:proofErr w:type="spellStart"/>
-      <w:proofErr w:type="gramStart"/>
       <w:r>
         <w:rPr>
           <w:lang w:val="en-US"/>
@@ -24913,7 +25300,6 @@
         <w:t>donde</w:t>
       </w:r>
       <w:proofErr w:type="spellEnd"/>
-      <w:proofErr w:type="gramEnd"/>
     </w:p>
     <w:p>
       <w:pPr>
@@ -25290,6 +25676,7 @@
     </w:p>
     <w:p>
       <w:r>
+        <w:lastRenderedPageBreak/>
         <w:t>Sólo ap</w:t>
       </w:r>
       <w:r>
@@ -25348,7 +25735,6 @@
     </w:p>
     <w:p>
       <w:r>
-        <w:lastRenderedPageBreak/>
         <w:t>Por ejemplo, para indicar que los modos de firma permitidos para firmas ASN.1 son ambos, (implícito y explícito), se definiría:</w:t>
       </w:r>
     </w:p>
@@ -25748,6 +26134,7 @@
         <w:rPr>
           <w:b/>
         </w:rPr>
+        <w:lastRenderedPageBreak/>
         <w:t>JCEKS</w:t>
       </w:r>
     </w:p>
@@ -25838,7 +26225,6 @@
           <w:b/>
           <w:lang w:val="es-ES_tradnl"/>
         </w:rPr>
-        <w:lastRenderedPageBreak/>
         <w:t>OCSP_TIMEOUT:</w:t>
       </w:r>
       <w:r>
@@ -26273,6 +26659,7 @@
           <w:b/>
           <w:lang w:val="es-ES_tradnl"/>
         </w:rPr>
+        <w:lastRenderedPageBreak/>
         <w:t>false</w:t>
       </w:r>
       <w:r>
@@ -26354,7 +26741,6 @@
         <w:rPr>
           <w:b/>
         </w:rPr>
-        <w:lastRenderedPageBreak/>
         <w:t>OCSP_HTTPS_USE_AUTH_CLIENT:</w:t>
       </w:r>
       <w:r>
@@ -26570,7 +26956,7 @@
       <w:pPr>
         <w:pStyle w:val="Ttulo3"/>
       </w:pPr>
-      <w:bookmarkStart w:id="80" w:name="_Toc157417024"/>
+      <w:bookmarkStart w:id="80" w:name="_Toc189562363"/>
       <w:r>
         <w:t>Configuraciones de acceso a TS@</w:t>
       </w:r>
@@ -26773,6 +27159,7 @@
         <w:rPr>
           <w:b/>
         </w:rPr>
+        <w:lastRenderedPageBreak/>
         <w:t>renewTimeStampWS.validationLevel</w:t>
       </w:r>
       <w:proofErr w:type="spellEnd"/>
@@ -26820,7 +27207,6 @@
         </w:numPr>
       </w:pPr>
       <w:r>
-        <w:lastRenderedPageBreak/>
         <w:t xml:space="preserve">1 </w:t>
       </w:r>
       <w:r>
@@ -27265,6 +27651,7 @@
         <w:rPr>
           <w:b/>
         </w:rPr>
+        <w:lastRenderedPageBreak/>
         <w:t>JKS</w:t>
       </w:r>
     </w:p>
@@ -27316,7 +27703,6 @@
         <w:rPr>
           <w:b/>
         </w:rPr>
-        <w:lastRenderedPageBreak/>
         <w:t>X509CertificateToken.privateKeyAlias:</w:t>
       </w:r>
       <w:r>
@@ -27689,6 +28075,7 @@
         <w:rPr>
           <w:b/>
         </w:rPr>
+        <w:lastRenderedPageBreak/>
         <w:t>true</w:t>
       </w:r>
       <w:r>
@@ -27773,7 +28160,6 @@
         <w:rPr>
           <w:b/>
         </w:rPr>
-        <w:lastRenderedPageBreak/>
         <w:t>request.symmetricKey.value</w:t>
       </w:r>
       <w:proofErr w:type="spellEnd"/>
@@ -28140,6 +28526,7 @@
         <w:rPr>
           <w:b/>
         </w:rPr>
+        <w:lastRenderedPageBreak/>
         <w:t>response.SAML.keystoreType</w:t>
       </w:r>
       <w:proofErr w:type="spellEnd"/>
@@ -28224,7 +28611,6 @@
         <w:rPr>
           <w:b/>
         </w:rPr>
-        <w:lastRenderedPageBreak/>
         <w:t>response.SAML.keystorePassword</w:t>
       </w:r>
       <w:proofErr w:type="spellEnd"/>
@@ -28543,6 +28929,7 @@
         <w:rPr>
           <w:b/>
         </w:rPr>
+        <w:lastRenderedPageBreak/>
         <w:t>rfc3161HTTPS.portNumber:</w:t>
       </w:r>
       <w:r>
@@ -28629,7 +29016,6 @@
         <w:rPr>
           <w:b/>
         </w:rPr>
-        <w:lastRenderedPageBreak/>
         <w:t>false</w:t>
       </w:r>
       <w:r>
@@ -28921,8 +29307,9 @@
         <w:pStyle w:val="Ttulo3"/>
       </w:pPr>
       <w:bookmarkStart w:id="82" w:name="_Toc453065738"/>
-      <w:bookmarkStart w:id="83" w:name="_Toc157417025"/>
-      <w:r>
+      <w:bookmarkStart w:id="83" w:name="_Toc189562364"/>
+      <w:r>
+        <w:lastRenderedPageBreak/>
         <w:t>Configuraciones de acceso a @firma</w:t>
       </w:r>
       <w:bookmarkEnd w:id="82"/>
@@ -29092,7 +29479,6 @@
       </w:pPr>
       <w:bookmarkStart w:id="84" w:name="_Toc453065739"/>
       <w:r>
-        <w:lastRenderedPageBreak/>
         <w:t>Parámetros Específicos a Cada Una de las Aplicaciones Configuradas en la Plataforma de @Firma</w:t>
       </w:r>
       <w:r>
@@ -29585,6 +29971,7 @@
         <w:rPr>
           <w:b/>
         </w:rPr>
+        <w:lastRenderedPageBreak/>
         <w:t>authorizationMethod.passwordType</w:t>
       </w:r>
       <w:proofErr w:type="spellEnd"/>
@@ -29719,7 +30106,6 @@
         <w:rPr>
           <w:b/>
         </w:rPr>
-        <w:lastRenderedPageBreak/>
         <w:t>authorizationMethod.userKeystorePassword</w:t>
       </w:r>
       <w:proofErr w:type="spellEnd"/>
@@ -29960,7 +30346,7 @@
         <w:pStyle w:val="Ttulo3"/>
       </w:pPr>
       <w:bookmarkStart w:id="85" w:name="_Toc453065740"/>
-      <w:bookmarkStart w:id="86" w:name="_Toc157417026"/>
+      <w:bookmarkStart w:id="86" w:name="_Toc189562365"/>
       <w:r>
         <w:t>Configuraciones de acceso a eVisor</w:t>
       </w:r>
@@ -30304,7 +30690,6 @@
         <w:rPr>
           <w:b/>
         </w:rPr>
-        <w:lastRenderedPageBreak/>
         <w:t>endPoint</w:t>
       </w:r>
       <w:proofErr w:type="spellEnd"/>
@@ -30781,6 +31166,7 @@
         <w:rPr>
           <w:b/>
         </w:rPr>
+        <w:lastRenderedPageBreak/>
         <w:t>authorizationMethod.userKeystore</w:t>
       </w:r>
       <w:proofErr w:type="spellEnd"/>
@@ -30900,7 +31286,6 @@
         <w:rPr>
           <w:b/>
         </w:rPr>
-        <w:lastRenderedPageBreak/>
         <w:t>JKS</w:t>
       </w:r>
     </w:p>
@@ -31404,7 +31789,7 @@
           <v:path o:extrusionok="f" gradientshapeok="t" o:connecttype="rect"/>
           <o:lock v:ext="edit" aspectratio="t"/>
         </v:shapetype>
-        <v:shape id="Imagen 1" o:spid="_x0000_s1035" type="#_x0000_t75" style="position:absolute;left:0;text-align:left;margin-left:-.45pt;margin-top:1.15pt;width:94.2pt;height:37.55pt;z-index:-251658752;visibility:visible">
+        <v:shape id="Imagen 1" o:spid="_x0000_s1035" type="#_x0000_t75" style="position:absolute;left:0;text-align:left;margin-left:-.45pt;margin-top:1.15pt;width:94.2pt;height:37.55pt;z-index:-1;visibility:visible">
           <v:imagedata r:id="rId1" o:title=""/>
         </v:shape>
       </w:pict>
@@ -31509,7 +31894,7 @@
       <w:rPr>
         <w:rFonts w:cs="Calibri"/>
       </w:rPr>
-      <w:t>011</w:t>
+      <w:t>013</w:t>
     </w:r>
     <w:r>
       <w:rPr>
@@ -37504,6 +37889,19 @@
 </file>
 
 <file path=customXml/item1.xml><?xml version="1.0" encoding="utf-8"?>
+<b:Sources xmlns:b="http://schemas.openxmlformats.org/officeDocument/2006/bibliography" xmlns="http://schemas.openxmlformats.org/officeDocument/2006/bibliography" SelectedStyle="\APA.XSL" StyleName="APA"/>
+</file>
+
+<file path=customXml/item2.xml><?xml version="1.0" encoding="utf-8"?>
+<?mso-contentType ?>
+<FormTemplates xmlns="http://schemas.microsoft.com/sharepoint/v3/contenttype/forms">
+  <Display>DocumentLibraryForm</Display>
+  <Edit>DocumentLibraryForm</Edit>
+  <New>DocumentLibraryForm</New>
+</FormTemplates>
+</file>
+
+<file path=customXml/item3.xml><?xml version="1.0" encoding="utf-8"?>
 <ct:contentTypeSchema xmlns:ct="http://schemas.microsoft.com/office/2006/metadata/contentType" xmlns:ma="http://schemas.microsoft.com/office/2006/metadata/properties/metaAttributes" ct:_="" ma:_="" ma:contentTypeName="Document" ma:contentTypeID="0x010100F37872BBB1B48948A69B496DD8700896" ma:contentTypeVersion="30" ma:contentTypeDescription="Create a new document." ma:contentTypeScope="" ma:versionID="db6ec5eae62717a2112663bfc8d11fc5">
   <xsd:schema xmlns:xsd="http://www.w3.org/2001/XMLSchema" xmlns:xs="http://www.w3.org/2001/XMLSchema" xmlns:p="http://schemas.microsoft.com/office/2006/metadata/properties" xmlns:ns2="e3c6f3b3-f88f-4e57-8294-d53de8f54b2b" xmlns:ns3="0e9fbc54-175b-41a1-a915-0ab6c7e45301" xmlns:ns4="30c688ba-d7e6-407b-8c35-f2a020af6bce" targetNamespace="http://schemas.microsoft.com/office/2006/metadata/properties" ma:root="true" ma:fieldsID="b607cbe47cf360e8877db2581acfff36" ns2:_="" ns3:_="" ns4:_="">
     <xsd:import namespace="e3c6f3b3-f88f-4e57-8294-d53de8f54b2b"/>
@@ -37813,7 +38211,7 @@
 </ct:contentTypeSchema>
 </file>
 
-<file path=customXml/item2.xml><?xml version="1.0" encoding="utf-8"?>
+<file path=customXml/item4.xml><?xml version="1.0" encoding="utf-8"?>
 <p:properties xmlns:p="http://schemas.microsoft.com/office/2006/metadata/properties" xmlns:xsi="http://www.w3.org/2001/XMLSchema-instance" xmlns:pc="http://schemas.microsoft.com/office/infopath/2007/PartnerControls">
   <documentManagement>
     <Location xmlns="e3c6f3b3-f88f-4e57-8294-d53de8f54b2b" xsi:nil="true"/>
@@ -37826,20 +38224,23 @@
 </p:properties>
 </file>
 
-<file path=customXml/item3.xml><?xml version="1.0" encoding="utf-8"?>
-<b:Sources xmlns:b="http://schemas.openxmlformats.org/officeDocument/2006/bibliography" xmlns="http://schemas.openxmlformats.org/officeDocument/2006/bibliography" SelectedStyle="\APA.XSL" StyleName="APA"/>
+<file path=customXml/itemProps1.xml><?xml version="1.0" encoding="utf-8"?>
+<ds:datastoreItem xmlns:ds="http://schemas.openxmlformats.org/officeDocument/2006/customXml" ds:itemID="{E3ED58A4-5EAD-440B-9F54-4CA4F76A7F32}">
+  <ds:schemaRefs>
+    <ds:schemaRef ds:uri="http://schemas.openxmlformats.org/officeDocument/2006/bibliography"/>
+  </ds:schemaRefs>
+</ds:datastoreItem>
 </file>
 
-<file path=customXml/item4.xml><?xml version="1.0" encoding="utf-8"?>
-<?mso-contentType ?>
-<FormTemplates xmlns="http://schemas.microsoft.com/sharepoint/v3/contenttype/forms">
-  <Display>DocumentLibraryForm</Display>
-  <Edit>DocumentLibraryForm</Edit>
-  <New>DocumentLibraryForm</New>
-</FormTemplates>
+<file path=customXml/itemProps2.xml><?xml version="1.0" encoding="utf-8"?>
+<ds:datastoreItem xmlns:ds="http://schemas.openxmlformats.org/officeDocument/2006/customXml" ds:itemID="{21A4DB45-409C-4DEF-8812-8665FC39DFA9}">
+  <ds:schemaRefs>
+    <ds:schemaRef ds:uri="http://schemas.microsoft.com/sharepoint/v3/contenttype/forms"/>
+  </ds:schemaRefs>
+</ds:datastoreItem>
 </file>
 
-<file path=customXml/itemProps1.xml><?xml version="1.0" encoding="utf-8"?>
+<file path=customXml/itemProps3.xml><?xml version="1.0" encoding="utf-8"?>
 <ds:datastoreItem xmlns:ds="http://schemas.openxmlformats.org/officeDocument/2006/customXml" ds:itemID="{50C9621E-EFBA-4851-AC04-F8929A7CE694}">
   <ds:schemaRefs>
     <ds:schemaRef ds:uri="http://schemas.microsoft.com/office/2006/metadata/contentType"/>
@@ -37859,36 +38260,13 @@
 </ds:datastoreItem>
 </file>
 
-<file path=customXml/itemProps2.xml><?xml version="1.0" encoding="utf-8"?>
+<file path=customXml/itemProps4.xml><?xml version="1.0" encoding="utf-8"?>
 <ds:datastoreItem xmlns:ds="http://schemas.openxmlformats.org/officeDocument/2006/customXml" ds:itemID="{F5EE0990-2639-455E-ADD9-A07D4919791F}">
   <ds:schemaRefs>
-    <ds:schemaRef ds:uri="0e9fbc54-175b-41a1-a915-0ab6c7e45301"/>
-    <ds:schemaRef ds:uri="http://purl.org/dc/terms/"/>
+    <ds:schemaRef ds:uri="http://schemas.microsoft.com/office/2006/metadata/properties"/>
+    <ds:schemaRef ds:uri="http://schemas.microsoft.com/office/infopath/2007/PartnerControls"/>
+    <ds:schemaRef ds:uri="e3c6f3b3-f88f-4e57-8294-d53de8f54b2b"/>
     <ds:schemaRef ds:uri="30c688ba-d7e6-407b-8c35-f2a020af6bce"/>
-    <ds:schemaRef ds:uri="http://schemas.microsoft.com/office/2006/documentManagement/types"/>
-    <ds:schemaRef ds:uri="http://www.w3.org/XML/1998/namespace"/>
-    <ds:schemaRef ds:uri="http://schemas.microsoft.com/office/infopath/2007/PartnerControls"/>
-    <ds:schemaRef ds:uri="http://purl.org/dc/elements/1.1/"/>
-    <ds:schemaRef ds:uri="http://schemas.microsoft.com/office/2006/metadata/properties"/>
-    <ds:schemaRef ds:uri="http://schemas.openxmlformats.org/package/2006/metadata/core-properties"/>
-    <ds:schemaRef ds:uri="e3c6f3b3-f88f-4e57-8294-d53de8f54b2b"/>
-    <ds:schemaRef ds:uri="http://purl.org/dc/dcmitype/"/>
-  </ds:schemaRefs>
-</ds:datastoreItem>
-</file>
-
-<file path=customXml/itemProps3.xml><?xml version="1.0" encoding="utf-8"?>
-<ds:datastoreItem xmlns:ds="http://schemas.openxmlformats.org/officeDocument/2006/customXml" ds:itemID="{E3ED58A4-5EAD-440B-9F54-4CA4F76A7F32}">
-  <ds:schemaRefs>
-    <ds:schemaRef ds:uri="http://schemas.openxmlformats.org/officeDocument/2006/bibliography"/>
-  </ds:schemaRefs>
-</ds:datastoreItem>
-</file>
-
-<file path=customXml/itemProps4.xml><?xml version="1.0" encoding="utf-8"?>
-<ds:datastoreItem xmlns:ds="http://schemas.openxmlformats.org/officeDocument/2006/customXml" ds:itemID="{21A4DB45-409C-4DEF-8812-8665FC39DFA9}">
-  <ds:schemaRefs>
-    <ds:schemaRef ds:uri="http://schemas.microsoft.com/sharepoint/v3/contenttype/forms"/>
   </ds:schemaRefs>
 </ds:datastoreItem>
 </file>
</xml_diff>

<commit_message>
inc P118734 - Se actualiza documlentación y fichero integra.properties con los datos correctos de las propiedades XML_AGE_1.9_URL-IDENTIFIER_XML y XML_AGE_1.9_URL-HASH_VALUE de la política.
</commit_message>
<xml_diff>
--- a/Integra-parent/documentacion/@Firma-Integra-services-InstalacionDespliegueYAdministracion-MAN.docx
+++ b/Integra-parent/documentacion/@Firma-Integra-services-InstalacionDespliegueYAdministracion-MAN.docx
@@ -1,6 +1,6 @@
 
 <file path=word/document.xml><?xml version="1.0" encoding="utf-8"?>
-<w:document xmlns:wpc="http://schemas.microsoft.com/office/word/2010/wordprocessingCanvas" xmlns:cx="http://schemas.microsoft.com/office/drawing/2014/chartex" xmlns:cx1="http://schemas.microsoft.com/office/drawing/2015/9/8/chartex" xmlns:cx2="http://schemas.microsoft.com/office/drawing/2015/10/21/chartex" xmlns:cx3="http://schemas.microsoft.com/office/drawing/2016/5/9/chartex" xmlns:cx4="http://schemas.microsoft.com/office/drawing/2016/5/10/chartex" xmlns:cx5="http://schemas.microsoft.com/office/drawing/2016/5/11/chartex" xmlns:cx6="http://schemas.microsoft.com/office/drawing/2016/5/12/chartex" xmlns:cx7="http://schemas.microsoft.com/office/drawing/2016/5/13/chartex" xmlns:cx8="http://schemas.microsoft.com/office/drawing/2016/5/14/chartex" xmlns:mc="http://schemas.openxmlformats.org/markup-compatibility/2006" xmlns:aink="http://schemas.microsoft.com/office/drawing/2016/ink" xmlns:am3d="http://schemas.microsoft.com/office/drawing/2017/model3d" xmlns:o="urn:schemas-microsoft-com:office:office" xmlns:oel="http://schemas.microsoft.com/office/2019/extlst" xmlns:r="http://schemas.openxmlformats.org/officeDocument/2006/relationships" xmlns:m="http://schemas.openxmlformats.org/officeDocument/2006/math" xmlns:v="urn:schemas-microsoft-com:vml" xmlns:wp14="http://schemas.microsoft.com/office/word/2010/wordprocessingDrawing" xmlns:wp="http://schemas.openxmlformats.org/drawingml/2006/wordprocessingDrawing" xmlns:w10="urn:schemas-microsoft-com:office:word" xmlns:w="http://schemas.openxmlformats.org/wordprocessingml/2006/main" xmlns:w14="http://schemas.microsoft.com/office/word/2010/wordml" xmlns:w15="http://schemas.microsoft.com/office/word/2012/wordml" xmlns:w16cex="http://schemas.microsoft.com/office/word/2018/wordml/cex" xmlns:w16cid="http://schemas.microsoft.com/office/word/2016/wordml/cid" xmlns:w16="http://schemas.microsoft.com/office/word/2018/wordml" xmlns:w16sdtdh="http://schemas.microsoft.com/office/word/2020/wordml/sdtdatahash" xmlns:w16se="http://schemas.microsoft.com/office/word/2015/wordml/symex" xmlns:wpg="http://schemas.microsoft.com/office/word/2010/wordprocessingGroup" xmlns:wpi="http://schemas.microsoft.com/office/word/2010/wordprocessingInk" xmlns:wne="http://schemas.microsoft.com/office/word/2006/wordml" xmlns:wps="http://schemas.microsoft.com/office/word/2010/wordprocessingShape" mc:Ignorable="w14 w15 w16se w16cid w16 w16cex w16sdtdh wp14">
+<w:document xmlns:wpc="http://schemas.microsoft.com/office/word/2010/wordprocessingCanvas" xmlns:cx="http://schemas.microsoft.com/office/drawing/2014/chartex" xmlns:cx1="http://schemas.microsoft.com/office/drawing/2015/9/8/chartex" xmlns:cx2="http://schemas.microsoft.com/office/drawing/2015/10/21/chartex" xmlns:cx3="http://schemas.microsoft.com/office/drawing/2016/5/9/chartex" xmlns:cx4="http://schemas.microsoft.com/office/drawing/2016/5/10/chartex" xmlns:cx5="http://schemas.microsoft.com/office/drawing/2016/5/11/chartex" xmlns:cx6="http://schemas.microsoft.com/office/drawing/2016/5/12/chartex" xmlns:cx7="http://schemas.microsoft.com/office/drawing/2016/5/13/chartex" xmlns:cx8="http://schemas.microsoft.com/office/drawing/2016/5/14/chartex" xmlns:mc="http://schemas.openxmlformats.org/markup-compatibility/2006" xmlns:aink="http://schemas.microsoft.com/office/drawing/2016/ink" xmlns:am3d="http://schemas.microsoft.com/office/drawing/2017/model3d" xmlns:o="urn:schemas-microsoft-com:office:office" xmlns:oel="http://schemas.microsoft.com/office/2019/extlst" xmlns:r="http://schemas.openxmlformats.org/officeDocument/2006/relationships" xmlns:m="http://schemas.openxmlformats.org/officeDocument/2006/math" xmlns:v="urn:schemas-microsoft-com:vml" xmlns:wp14="http://schemas.microsoft.com/office/word/2010/wordprocessingDrawing" xmlns:wp="http://schemas.openxmlformats.org/drawingml/2006/wordprocessingDrawing" xmlns:w10="urn:schemas-microsoft-com:office:word" xmlns:w="http://schemas.openxmlformats.org/wordprocessingml/2006/main" xmlns:w14="http://schemas.microsoft.com/office/word/2010/wordml" xmlns:w15="http://schemas.microsoft.com/office/word/2012/wordml" xmlns:w16cex="http://schemas.microsoft.com/office/word/2018/wordml/cex" xmlns:w16cid="http://schemas.microsoft.com/office/word/2016/wordml/cid" xmlns:w16="http://schemas.microsoft.com/office/word/2018/wordml" xmlns:w16du="http://schemas.microsoft.com/office/word/2023/wordml/word16du" xmlns:w16sdtdh="http://schemas.microsoft.com/office/word/2020/wordml/sdtdatahash" xmlns:w16sdtfl="http://schemas.microsoft.com/office/word/2024/wordml/sdtformatlock" xmlns:w16se="http://schemas.microsoft.com/office/word/2015/wordml/symex" xmlns:wpg="http://schemas.microsoft.com/office/word/2010/wordprocessingGroup" xmlns:wpi="http://schemas.microsoft.com/office/word/2010/wordprocessingInk" xmlns:wne="http://schemas.microsoft.com/office/word/2006/wordml" xmlns:wps="http://schemas.microsoft.com/office/word/2010/wordprocessingShape" mc:Ignorable="w14 w15 w16se w16cid w16 w16cex w16sdtdh w16sdtfl w16du wp14">
   <w:body>
     <w:p>
       <w:pPr>
@@ -71,12 +71,21 @@
         </w:rPr>
         <w:fldChar w:fldCharType="separate"/>
       </w:r>
+      <w:proofErr w:type="spellStart"/>
       <w:r>
         <w:rPr>
           <w:sz w:val="36"/>
           <w:szCs w:val="36"/>
         </w:rPr>
-        <w:t>Integra 2.2.4_000</w:t>
+        <w:t>Integr</w:t>
+      </w:r>
+      <w:proofErr w:type="spellEnd"/>
+      <w:r>
+        <w:rPr>
+          <w:sz w:val="36"/>
+          <w:szCs w:val="36"/>
+        </w:rPr>
+        <w:t>@ 2.2.4_001</w:t>
       </w:r>
       <w:r>
         <w:rPr>
@@ -342,7 +351,7 @@
               <w:t>1</w:t>
             </w:r>
             <w:r>
-              <w:t>1</w:t>
+              <w:t>3</w:t>
             </w:r>
             <w:bookmarkEnd w:id="3"/>
             <w:bookmarkEnd w:id="4"/>
@@ -375,7 +384,10 @@
             </w:pPr>
             <w:bookmarkStart w:id="5" w:name="fecha_doc"/>
             <w:r>
-              <w:t>29</w:t>
+              <w:t>1</w:t>
+            </w:r>
+            <w:r>
+              <w:t>4</w:t>
             </w:r>
             <w:r>
               <w:t>-</w:t>
@@ -384,13 +396,13 @@
               <w:t>0</w:t>
             </w:r>
             <w:r>
-              <w:t>1</w:t>
+              <w:t>7</w:t>
             </w:r>
             <w:r>
               <w:t>-202</w:t>
             </w:r>
             <w:r>
-              <w:t>4</w:t>
+              <w:t>5</w:t>
             </w:r>
             <w:bookmarkEnd w:id="5"/>
           </w:p>
@@ -551,7 +563,7 @@
               <w:t>0</w:t>
             </w:r>
             <w:r>
-              <w:t>11</w:t>
+              <w:t>13</w:t>
             </w:r>
             <w:r>
               <w:fldChar w:fldCharType="end"/>
@@ -596,7 +608,7 @@
               <w:fldChar w:fldCharType="separate"/>
             </w:r>
             <w:r>
-              <w:t>29-01-2024</w:t>
+              <w:t>14-07-2025</w:t>
             </w:r>
             <w:r>
               <w:fldChar w:fldCharType="end"/>
@@ -1970,6 +1982,271 @@
     </w:tbl>
     <w:p>
       <w:pPr>
+        <w:rPr>
+          <w:rFonts w:cs="Calibri"/>
+        </w:rPr>
+      </w:pPr>
+    </w:p>
+    <w:tbl>
+      <w:tblPr>
+        <w:tblW w:w="0" w:type="auto"/>
+        <w:tblLayout w:type="fixed"/>
+        <w:tblCellMar>
+          <w:left w:w="70" w:type="dxa"/>
+          <w:right w:w="70" w:type="dxa"/>
+        </w:tblCellMar>
+        <w:tblLook w:val="0000" w:firstRow="0" w:lastRow="0" w:firstColumn="0" w:lastColumn="0" w:noHBand="0" w:noVBand="0"/>
+      </w:tblPr>
+      <w:tblGrid>
+        <w:gridCol w:w="1488"/>
+        <w:gridCol w:w="8080"/>
+      </w:tblGrid>
+      <w:tr>
+        <w:tc>
+          <w:tcPr>
+            <w:tcW w:w="1488" w:type="dxa"/>
+          </w:tcPr>
+          <w:p>
+            <w:pPr>
+              <w:pStyle w:val="Tabla"/>
+              <w:framePr w:hSpace="0" w:wrap="auto" w:vAnchor="margin" w:yAlign="inline"/>
+              <w:suppressOverlap w:val="0"/>
+            </w:pPr>
+            <w:r>
+              <w:t>Rev.</w:t>
+            </w:r>
+          </w:p>
+        </w:tc>
+        <w:tc>
+          <w:tcPr>
+            <w:tcW w:w="8080" w:type="dxa"/>
+          </w:tcPr>
+          <w:p>
+            <w:pPr>
+              <w:pStyle w:val="Tabla"/>
+              <w:framePr w:hSpace="0" w:wrap="auto" w:vAnchor="margin" w:yAlign="inline"/>
+              <w:suppressOverlap w:val="0"/>
+            </w:pPr>
+            <w:r>
+              <w:t>0</w:t>
+            </w:r>
+            <w:r>
+              <w:t>12</w:t>
+            </w:r>
+          </w:p>
+        </w:tc>
+      </w:tr>
+      <w:tr>
+        <w:tc>
+          <w:tcPr>
+            <w:tcW w:w="1488" w:type="dxa"/>
+          </w:tcPr>
+          <w:p>
+            <w:pPr>
+              <w:pStyle w:val="Tabla"/>
+              <w:framePr w:hSpace="0" w:wrap="auto" w:vAnchor="margin" w:yAlign="inline"/>
+              <w:suppressOverlap w:val="0"/>
+            </w:pPr>
+            <w:r>
+              <w:t>Fecha</w:t>
+            </w:r>
+          </w:p>
+        </w:tc>
+        <w:tc>
+          <w:tcPr>
+            <w:tcW w:w="8080" w:type="dxa"/>
+          </w:tcPr>
+          <w:p>
+            <w:pPr>
+              <w:pStyle w:val="Tabla"/>
+              <w:framePr w:hSpace="0" w:wrap="auto" w:vAnchor="margin" w:yAlign="inline"/>
+              <w:suppressOverlap w:val="0"/>
+            </w:pPr>
+            <w:r>
+              <w:t>16-05-2024</w:t>
+            </w:r>
+          </w:p>
+        </w:tc>
+      </w:tr>
+      <w:tr>
+        <w:tc>
+          <w:tcPr>
+            <w:tcW w:w="1488" w:type="dxa"/>
+          </w:tcPr>
+          <w:p>
+            <w:pPr>
+              <w:pStyle w:val="Tabla"/>
+              <w:framePr w:hSpace="0" w:wrap="auto" w:vAnchor="margin" w:yAlign="inline"/>
+              <w:suppressOverlap w:val="0"/>
+            </w:pPr>
+            <w:r>
+              <w:t>Descripción</w:t>
+            </w:r>
+          </w:p>
+        </w:tc>
+        <w:tc>
+          <w:tcPr>
+            <w:tcW w:w="8080" w:type="dxa"/>
+          </w:tcPr>
+          <w:p>
+            <w:pPr>
+              <w:pStyle w:val="Tabla"/>
+              <w:framePr w:hSpace="0" w:wrap="auto" w:vAnchor="margin" w:yAlign="inline"/>
+              <w:suppressOverlap w:val="0"/>
+            </w:pPr>
+            <w:r>
+              <w:t>Se actualiza el documento para hacer referencia a la versión 2.2.4_001 de Integr@.</w:t>
+            </w:r>
+          </w:p>
+        </w:tc>
+      </w:tr>
+    </w:tbl>
+    <w:p>
+      <w:pPr>
+        <w:pStyle w:val="Apartado"/>
+        <w:ind w:left="0"/>
+        <w:rPr>
+          <w:rFonts w:cs="Calibri"/>
+        </w:rPr>
+      </w:pPr>
+    </w:p>
+    <w:tbl>
+      <w:tblPr>
+        <w:tblW w:w="0" w:type="auto"/>
+        <w:tblLayout w:type="fixed"/>
+        <w:tblCellMar>
+          <w:left w:w="70" w:type="dxa"/>
+          <w:right w:w="70" w:type="dxa"/>
+        </w:tblCellMar>
+        <w:tblLook w:val="0000" w:firstRow="0" w:lastRow="0" w:firstColumn="0" w:lastColumn="0" w:noHBand="0" w:noVBand="0"/>
+      </w:tblPr>
+      <w:tblGrid>
+        <w:gridCol w:w="1488"/>
+        <w:gridCol w:w="8080"/>
+      </w:tblGrid>
+      <w:tr>
+        <w:tc>
+          <w:tcPr>
+            <w:tcW w:w="1488" w:type="dxa"/>
+          </w:tcPr>
+          <w:p>
+            <w:pPr>
+              <w:pStyle w:val="Tabla"/>
+              <w:framePr w:hSpace="0" w:wrap="auto" w:vAnchor="margin" w:yAlign="inline"/>
+              <w:suppressOverlap w:val="0"/>
+            </w:pPr>
+            <w:r>
+              <w:t>Rev.</w:t>
+            </w:r>
+          </w:p>
+        </w:tc>
+        <w:tc>
+          <w:tcPr>
+            <w:tcW w:w="8080" w:type="dxa"/>
+          </w:tcPr>
+          <w:p>
+            <w:pPr>
+              <w:pStyle w:val="Tabla"/>
+              <w:framePr w:hSpace="0" w:wrap="auto" w:vAnchor="margin" w:yAlign="inline"/>
+              <w:suppressOverlap w:val="0"/>
+            </w:pPr>
+            <w:r>
+              <w:t>0</w:t>
+            </w:r>
+            <w:r>
+              <w:t>1</w:t>
+            </w:r>
+            <w:r>
+              <w:t>3</w:t>
+            </w:r>
+          </w:p>
+        </w:tc>
+      </w:tr>
+      <w:tr>
+        <w:tc>
+          <w:tcPr>
+            <w:tcW w:w="1488" w:type="dxa"/>
+          </w:tcPr>
+          <w:p>
+            <w:pPr>
+              <w:pStyle w:val="Tabla"/>
+              <w:framePr w:hSpace="0" w:wrap="auto" w:vAnchor="margin" w:yAlign="inline"/>
+              <w:suppressOverlap w:val="0"/>
+            </w:pPr>
+            <w:r>
+              <w:t>Fecha</w:t>
+            </w:r>
+          </w:p>
+        </w:tc>
+        <w:tc>
+          <w:tcPr>
+            <w:tcW w:w="8080" w:type="dxa"/>
+          </w:tcPr>
+          <w:p>
+            <w:pPr>
+              <w:pStyle w:val="Tabla"/>
+              <w:framePr w:hSpace="0" w:wrap="auto" w:vAnchor="margin" w:yAlign="inline"/>
+              <w:suppressOverlap w:val="0"/>
+            </w:pPr>
+            <w:r>
+              <w:t>1</w:t>
+            </w:r>
+            <w:r>
+              <w:t>4</w:t>
+            </w:r>
+            <w:r>
+              <w:t>-0</w:t>
+            </w:r>
+            <w:r>
+              <w:t>7</w:t>
+            </w:r>
+            <w:r>
+              <w:t>-202</w:t>
+            </w:r>
+            <w:r>
+              <w:t>5</w:t>
+            </w:r>
+          </w:p>
+        </w:tc>
+      </w:tr>
+      <w:tr>
+        <w:tc>
+          <w:tcPr>
+            <w:tcW w:w="1488" w:type="dxa"/>
+          </w:tcPr>
+          <w:p>
+            <w:pPr>
+              <w:pStyle w:val="Tabla"/>
+              <w:framePr w:hSpace="0" w:wrap="auto" w:vAnchor="margin" w:yAlign="inline"/>
+              <w:suppressOverlap w:val="0"/>
+            </w:pPr>
+            <w:r>
+              <w:t>Descripción</w:t>
+            </w:r>
+          </w:p>
+        </w:tc>
+        <w:tc>
+          <w:tcPr>
+            <w:tcW w:w="8080" w:type="dxa"/>
+          </w:tcPr>
+          <w:p>
+            <w:pPr>
+              <w:pStyle w:val="Default"/>
+              <w:jc w:val="both"/>
+            </w:pPr>
+            <w:r>
+              <w:rPr>
+                <w:sz w:val="20"/>
+                <w:szCs w:val="20"/>
+              </w:rPr>
+              <w:t xml:space="preserve">Se actualiza información de ejemplo para datos de política XML_AGE_1.9. </w:t>
+            </w:r>
+          </w:p>
+        </w:tc>
+      </w:tr>
+    </w:tbl>
+    <w:p>
+      <w:pPr>
         <w:pStyle w:val="Apartado"/>
         <w:ind w:left="0"/>
         <w:rPr>
@@ -2092,7 +2369,7 @@
               <w:t>0</w:t>
             </w:r>
             <w:r>
-              <w:t>11</w:t>
+              <w:t>13</w:t>
             </w:r>
             <w:r>
               <w:fldChar w:fldCharType="end"/>
@@ -2139,7 +2416,7 @@
               <w:fldChar w:fldCharType="separate"/>
             </w:r>
             <w:r>
-              <w:t>29-01-2024</w:t>
+              <w:t>14-07-2025</w:t>
             </w:r>
             <w:r>
               <w:fldChar w:fldCharType="end"/>
@@ -2223,11 +2500,13 @@
           <w:tab w:val="left" w:pos="1078"/>
         </w:tabs>
         <w:rPr>
+          <w:rFonts w:asciiTheme="minorHAnsi" w:eastAsiaTheme="minorEastAsia" w:hAnsiTheme="minorHAnsi" w:cstheme="minorBidi"/>
           <w:b w:val="0"/>
           <w:spacing w:val="0"/>
           <w:kern w:val="2"/>
-          <w:sz w:val="22"/>
-          <w:szCs w:val="22"/>
+          <w:sz w:val="24"/>
+          <w:szCs w:val="24"/>
+          <w14:ligatures w14:val="standardContextual"/>
         </w:rPr>
       </w:pPr>
       <w:r>
@@ -2251,7 +2530,7 @@
         </w:rPr>
         <w:fldChar w:fldCharType="separate"/>
       </w:r>
-      <w:hyperlink w:anchor="_Toc157416997" w:history="1">
+      <w:hyperlink w:anchor="_Toc203401679" w:history="1">
         <w:r>
           <w:rPr>
             <w:rStyle w:val="Hipervnculo"/>
@@ -2261,11 +2540,13 @@
         </w:r>
         <w:r>
           <w:rPr>
+            <w:rFonts w:asciiTheme="minorHAnsi" w:eastAsiaTheme="minorEastAsia" w:hAnsiTheme="minorHAnsi" w:cstheme="minorBidi"/>
             <w:b w:val="0"/>
             <w:spacing w:val="0"/>
             <w:kern w:val="2"/>
-            <w:sz w:val="22"/>
-            <w:szCs w:val="22"/>
+            <w:sz w:val="24"/>
+            <w:szCs w:val="24"/>
+            <w14:ligatures w14:val="standardContextual"/>
           </w:rPr>
           <w:tab/>
         </w:r>
@@ -2292,7 +2573,7 @@
           <w:rPr>
             <w:webHidden/>
           </w:rPr>
-          <w:instrText xml:space="preserve"> PAGEREF _Toc157416997 \h </w:instrText>
+          <w:instrText xml:space="preserve"> PAGEREF _Toc203401679 \h </w:instrText>
         </w:r>
         <w:r>
           <w:rPr>
@@ -2326,14 +2607,16 @@
           <w:tab w:val="left" w:pos="1078"/>
         </w:tabs>
         <w:rPr>
+          <w:rFonts w:asciiTheme="minorHAnsi" w:eastAsiaTheme="minorEastAsia" w:hAnsiTheme="minorHAnsi" w:cstheme="minorBidi"/>
           <w:b w:val="0"/>
           <w:spacing w:val="0"/>
           <w:kern w:val="2"/>
-          <w:sz w:val="22"/>
-          <w:szCs w:val="22"/>
-        </w:rPr>
-      </w:pPr>
-      <w:hyperlink w:anchor="_Toc157416998" w:history="1">
+          <w:sz w:val="24"/>
+          <w:szCs w:val="24"/>
+          <w14:ligatures w14:val="standardContextual"/>
+        </w:rPr>
+      </w:pPr>
+      <w:hyperlink w:anchor="_Toc203401680" w:history="1">
         <w:r>
           <w:rPr>
             <w:rStyle w:val="Hipervnculo"/>
@@ -2343,11 +2626,13 @@
         </w:r>
         <w:r>
           <w:rPr>
+            <w:rFonts w:asciiTheme="minorHAnsi" w:eastAsiaTheme="minorEastAsia" w:hAnsiTheme="minorHAnsi" w:cstheme="minorBidi"/>
             <w:b w:val="0"/>
             <w:spacing w:val="0"/>
             <w:kern w:val="2"/>
-            <w:sz w:val="22"/>
-            <w:szCs w:val="22"/>
+            <w:sz w:val="24"/>
+            <w:szCs w:val="24"/>
+            <w14:ligatures w14:val="standardContextual"/>
           </w:rPr>
           <w:tab/>
         </w:r>
@@ -2374,7 +2659,7 @@
           <w:rPr>
             <w:webHidden/>
           </w:rPr>
-          <w:instrText xml:space="preserve"> PAGEREF _Toc157416998 \h </w:instrText>
+          <w:instrText xml:space="preserve"> PAGEREF _Toc203401680 \h </w:instrText>
         </w:r>
         <w:r>
           <w:rPr>
@@ -2408,14 +2693,16 @@
           <w:tab w:val="left" w:pos="1078"/>
         </w:tabs>
         <w:rPr>
+          <w:rFonts w:asciiTheme="minorHAnsi" w:eastAsiaTheme="minorEastAsia" w:hAnsiTheme="minorHAnsi" w:cstheme="minorBidi"/>
           <w:b w:val="0"/>
           <w:spacing w:val="0"/>
           <w:kern w:val="2"/>
-          <w:sz w:val="22"/>
-          <w:szCs w:val="22"/>
-        </w:rPr>
-      </w:pPr>
-      <w:hyperlink w:anchor="_Toc157416999" w:history="1">
+          <w:sz w:val="24"/>
+          <w:szCs w:val="24"/>
+          <w14:ligatures w14:val="standardContextual"/>
+        </w:rPr>
+      </w:pPr>
+      <w:hyperlink w:anchor="_Toc203401681" w:history="1">
         <w:r>
           <w:rPr>
             <w:rStyle w:val="Hipervnculo"/>
@@ -2425,11 +2712,13 @@
         </w:r>
         <w:r>
           <w:rPr>
+            <w:rFonts w:asciiTheme="minorHAnsi" w:eastAsiaTheme="minorEastAsia" w:hAnsiTheme="minorHAnsi" w:cstheme="minorBidi"/>
             <w:b w:val="0"/>
             <w:spacing w:val="0"/>
             <w:kern w:val="2"/>
-            <w:sz w:val="22"/>
-            <w:szCs w:val="22"/>
+            <w:sz w:val="24"/>
+            <w:szCs w:val="24"/>
+            <w14:ligatures w14:val="standardContextual"/>
           </w:rPr>
           <w:tab/>
         </w:r>
@@ -2456,7 +2745,7 @@
           <w:rPr>
             <w:webHidden/>
           </w:rPr>
-          <w:instrText xml:space="preserve"> PAGEREF _Toc157416999 \h </w:instrText>
+          <w:instrText xml:space="preserve"> PAGEREF _Toc203401681 \h </w:instrText>
         </w:r>
         <w:r>
           <w:rPr>
@@ -2490,14 +2779,16 @@
           <w:tab w:val="left" w:pos="1078"/>
         </w:tabs>
         <w:rPr>
+          <w:rFonts w:asciiTheme="minorHAnsi" w:eastAsiaTheme="minorEastAsia" w:hAnsiTheme="minorHAnsi" w:cstheme="minorBidi"/>
           <w:b w:val="0"/>
           <w:spacing w:val="0"/>
           <w:kern w:val="2"/>
-          <w:sz w:val="22"/>
-          <w:szCs w:val="22"/>
-        </w:rPr>
-      </w:pPr>
-      <w:hyperlink w:anchor="_Toc157417000" w:history="1">
+          <w:sz w:val="24"/>
+          <w:szCs w:val="24"/>
+          <w14:ligatures w14:val="standardContextual"/>
+        </w:rPr>
+      </w:pPr>
+      <w:hyperlink w:anchor="_Toc203401682" w:history="1">
         <w:r>
           <w:rPr>
             <w:rStyle w:val="Hipervnculo"/>
@@ -2506,11 +2797,13 @@
         </w:r>
         <w:r>
           <w:rPr>
+            <w:rFonts w:asciiTheme="minorHAnsi" w:eastAsiaTheme="minorEastAsia" w:hAnsiTheme="minorHAnsi" w:cstheme="minorBidi"/>
             <w:b w:val="0"/>
             <w:spacing w:val="0"/>
             <w:kern w:val="2"/>
-            <w:sz w:val="22"/>
-            <w:szCs w:val="22"/>
+            <w:sz w:val="24"/>
+            <w:szCs w:val="24"/>
+            <w14:ligatures w14:val="standardContextual"/>
           </w:rPr>
           <w:tab/>
         </w:r>
@@ -2536,7 +2829,7 @@
           <w:rPr>
             <w:webHidden/>
           </w:rPr>
-          <w:instrText xml:space="preserve"> PAGEREF _Toc157417000 \h </w:instrText>
+          <w:instrText xml:space="preserve"> PAGEREF _Toc203401682 \h </w:instrText>
         </w:r>
         <w:r>
           <w:rPr>
@@ -2570,14 +2863,16 @@
           <w:tab w:val="left" w:pos="1078"/>
         </w:tabs>
         <w:rPr>
+          <w:rFonts w:asciiTheme="minorHAnsi" w:eastAsiaTheme="minorEastAsia" w:hAnsiTheme="minorHAnsi" w:cstheme="minorBidi"/>
           <w:b w:val="0"/>
           <w:spacing w:val="0"/>
           <w:kern w:val="2"/>
-          <w:sz w:val="22"/>
-          <w:szCs w:val="22"/>
-        </w:rPr>
-      </w:pPr>
-      <w:hyperlink w:anchor="_Toc157417001" w:history="1">
+          <w:sz w:val="24"/>
+          <w:szCs w:val="24"/>
+          <w14:ligatures w14:val="standardContextual"/>
+        </w:rPr>
+      </w:pPr>
+      <w:hyperlink w:anchor="_Toc203401683" w:history="1">
         <w:r>
           <w:rPr>
             <w:rStyle w:val="Hipervnculo"/>
@@ -2587,11 +2882,13 @@
         </w:r>
         <w:r>
           <w:rPr>
+            <w:rFonts w:asciiTheme="minorHAnsi" w:eastAsiaTheme="minorEastAsia" w:hAnsiTheme="minorHAnsi" w:cstheme="minorBidi"/>
             <w:b w:val="0"/>
             <w:spacing w:val="0"/>
             <w:kern w:val="2"/>
-            <w:sz w:val="22"/>
-            <w:szCs w:val="22"/>
+            <w:sz w:val="24"/>
+            <w:szCs w:val="24"/>
+            <w14:ligatures w14:val="standardContextual"/>
           </w:rPr>
           <w:tab/>
         </w:r>
@@ -2618,7 +2915,7 @@
           <w:rPr>
             <w:webHidden/>
           </w:rPr>
-          <w:instrText xml:space="preserve"> PAGEREF _Toc157417001 \h </w:instrText>
+          <w:instrText xml:space="preserve"> PAGEREF _Toc203401683 \h </w:instrText>
         </w:r>
         <w:r>
           <w:rPr>
@@ -2649,13 +2946,15 @@
       <w:pPr>
         <w:pStyle w:val="TDC2"/>
         <w:rPr>
+          <w:rFonts w:asciiTheme="minorHAnsi" w:eastAsiaTheme="minorEastAsia" w:hAnsiTheme="minorHAnsi" w:cstheme="minorBidi"/>
           <w:spacing w:val="0"/>
           <w:kern w:val="2"/>
-          <w:sz w:val="22"/>
-          <w:szCs w:val="22"/>
-        </w:rPr>
-      </w:pPr>
-      <w:hyperlink w:anchor="_Toc157417002" w:history="1">
+          <w:sz w:val="24"/>
+          <w:szCs w:val="24"/>
+          <w14:ligatures w14:val="standardContextual"/>
+        </w:rPr>
+      </w:pPr>
+      <w:hyperlink w:anchor="_Toc203401684" w:history="1">
         <w:r>
           <w:rPr>
             <w:rStyle w:val="Hipervnculo"/>
@@ -2665,10 +2964,12 @@
         </w:r>
         <w:r>
           <w:rPr>
+            <w:rFonts w:asciiTheme="minorHAnsi" w:eastAsiaTheme="minorEastAsia" w:hAnsiTheme="minorHAnsi" w:cstheme="minorBidi"/>
             <w:spacing w:val="0"/>
             <w:kern w:val="2"/>
-            <w:sz w:val="22"/>
-            <w:szCs w:val="22"/>
+            <w:sz w:val="24"/>
+            <w:szCs w:val="24"/>
+            <w14:ligatures w14:val="standardContextual"/>
           </w:rPr>
           <w:tab/>
         </w:r>
@@ -2695,7 +2996,7 @@
           <w:rPr>
             <w:webHidden/>
           </w:rPr>
-          <w:instrText xml:space="preserve"> PAGEREF _Toc157417002 \h </w:instrText>
+          <w:instrText xml:space="preserve"> PAGEREF _Toc203401684 \h </w:instrText>
         </w:r>
         <w:r>
           <w:rPr>
@@ -2726,13 +3027,15 @@
       <w:pPr>
         <w:pStyle w:val="TDC2"/>
         <w:rPr>
+          <w:rFonts w:asciiTheme="minorHAnsi" w:eastAsiaTheme="minorEastAsia" w:hAnsiTheme="minorHAnsi" w:cstheme="minorBidi"/>
           <w:spacing w:val="0"/>
           <w:kern w:val="2"/>
-          <w:sz w:val="22"/>
-          <w:szCs w:val="22"/>
-        </w:rPr>
-      </w:pPr>
-      <w:hyperlink w:anchor="_Toc157417003" w:history="1">
+          <w:sz w:val="24"/>
+          <w:szCs w:val="24"/>
+          <w14:ligatures w14:val="standardContextual"/>
+        </w:rPr>
+      </w:pPr>
+      <w:hyperlink w:anchor="_Toc203401685" w:history="1">
         <w:r>
           <w:rPr>
             <w:rStyle w:val="Hipervnculo"/>
@@ -2742,10 +3045,12 @@
         </w:r>
         <w:r>
           <w:rPr>
+            <w:rFonts w:asciiTheme="minorHAnsi" w:eastAsiaTheme="minorEastAsia" w:hAnsiTheme="minorHAnsi" w:cstheme="minorBidi"/>
             <w:spacing w:val="0"/>
             <w:kern w:val="2"/>
-            <w:sz w:val="22"/>
-            <w:szCs w:val="22"/>
+            <w:sz w:val="24"/>
+            <w:szCs w:val="24"/>
+            <w14:ligatures w14:val="standardContextual"/>
           </w:rPr>
           <w:tab/>
         </w:r>
@@ -2772,7 +3077,7 @@
           <w:rPr>
             <w:webHidden/>
           </w:rPr>
-          <w:instrText xml:space="preserve"> PAGEREF _Toc157417003 \h </w:instrText>
+          <w:instrText xml:space="preserve"> PAGEREF _Toc203401685 \h </w:instrText>
         </w:r>
         <w:r>
           <w:rPr>
@@ -2806,14 +3111,16 @@
           <w:tab w:val="left" w:pos="1078"/>
         </w:tabs>
         <w:rPr>
+          <w:rFonts w:asciiTheme="minorHAnsi" w:eastAsiaTheme="minorEastAsia" w:hAnsiTheme="minorHAnsi" w:cstheme="minorBidi"/>
           <w:b w:val="0"/>
           <w:spacing w:val="0"/>
           <w:kern w:val="2"/>
-          <w:sz w:val="22"/>
-          <w:szCs w:val="22"/>
-        </w:rPr>
-      </w:pPr>
-      <w:hyperlink w:anchor="_Toc157417004" w:history="1">
+          <w:sz w:val="24"/>
+          <w:szCs w:val="24"/>
+          <w14:ligatures w14:val="standardContextual"/>
+        </w:rPr>
+      </w:pPr>
+      <w:hyperlink w:anchor="_Toc203401686" w:history="1">
         <w:r>
           <w:rPr>
             <w:rStyle w:val="Hipervnculo"/>
@@ -2823,11 +3130,13 @@
         </w:r>
         <w:r>
           <w:rPr>
+            <w:rFonts w:asciiTheme="minorHAnsi" w:eastAsiaTheme="minorEastAsia" w:hAnsiTheme="minorHAnsi" w:cstheme="minorBidi"/>
             <w:b w:val="0"/>
             <w:spacing w:val="0"/>
             <w:kern w:val="2"/>
-            <w:sz w:val="22"/>
-            <w:szCs w:val="22"/>
+            <w:sz w:val="24"/>
+            <w:szCs w:val="24"/>
+            <w14:ligatures w14:val="standardContextual"/>
           </w:rPr>
           <w:tab/>
         </w:r>
@@ -2854,7 +3163,7 @@
           <w:rPr>
             <w:webHidden/>
           </w:rPr>
-          <w:instrText xml:space="preserve"> PAGEREF _Toc157417004 \h </w:instrText>
+          <w:instrText xml:space="preserve"> PAGEREF _Toc203401686 \h </w:instrText>
         </w:r>
         <w:r>
           <w:rPr>
@@ -2885,13 +3194,15 @@
       <w:pPr>
         <w:pStyle w:val="TDC2"/>
         <w:rPr>
+          <w:rFonts w:asciiTheme="minorHAnsi" w:eastAsiaTheme="minorEastAsia" w:hAnsiTheme="minorHAnsi" w:cstheme="minorBidi"/>
           <w:spacing w:val="0"/>
           <w:kern w:val="2"/>
-          <w:sz w:val="22"/>
-          <w:szCs w:val="22"/>
-        </w:rPr>
-      </w:pPr>
-      <w:hyperlink w:anchor="_Toc157417005" w:history="1">
+          <w:sz w:val="24"/>
+          <w:szCs w:val="24"/>
+          <w14:ligatures w14:val="standardContextual"/>
+        </w:rPr>
+      </w:pPr>
+      <w:hyperlink w:anchor="_Toc203401687" w:history="1">
         <w:r>
           <w:rPr>
             <w:rStyle w:val="Hipervnculo"/>
@@ -2901,10 +3212,12 @@
         </w:r>
         <w:r>
           <w:rPr>
+            <w:rFonts w:asciiTheme="minorHAnsi" w:eastAsiaTheme="minorEastAsia" w:hAnsiTheme="minorHAnsi" w:cstheme="minorBidi"/>
             <w:spacing w:val="0"/>
             <w:kern w:val="2"/>
-            <w:sz w:val="22"/>
-            <w:szCs w:val="22"/>
+            <w:sz w:val="24"/>
+            <w:szCs w:val="24"/>
+            <w14:ligatures w14:val="standardContextual"/>
           </w:rPr>
           <w:tab/>
         </w:r>
@@ -2931,7 +3244,7 @@
           <w:rPr>
             <w:webHidden/>
           </w:rPr>
-          <w:instrText xml:space="preserve"> PAGEREF _Toc157417005 \h </w:instrText>
+          <w:instrText xml:space="preserve"> PAGEREF _Toc203401687 \h </w:instrText>
         </w:r>
         <w:r>
           <w:rPr>
@@ -2962,13 +3275,15 @@
       <w:pPr>
         <w:pStyle w:val="TDC3"/>
         <w:rPr>
+          <w:rFonts w:asciiTheme="minorHAnsi" w:eastAsiaTheme="minorEastAsia" w:hAnsiTheme="minorHAnsi" w:cstheme="minorBidi"/>
           <w:spacing w:val="0"/>
           <w:kern w:val="2"/>
-          <w:sz w:val="22"/>
-          <w:szCs w:val="22"/>
-        </w:rPr>
-      </w:pPr>
-      <w:hyperlink w:anchor="_Toc157417006" w:history="1">
+          <w:sz w:val="24"/>
+          <w:szCs w:val="24"/>
+          <w14:ligatures w14:val="standardContextual"/>
+        </w:rPr>
+      </w:pPr>
+      <w:hyperlink w:anchor="_Toc203401688" w:history="1">
         <w:r>
           <w:rPr>
             <w:rStyle w:val="Hipervnculo"/>
@@ -2978,10 +3293,12 @@
         </w:r>
         <w:r>
           <w:rPr>
+            <w:rFonts w:asciiTheme="minorHAnsi" w:eastAsiaTheme="minorEastAsia" w:hAnsiTheme="minorHAnsi" w:cstheme="minorBidi"/>
             <w:spacing w:val="0"/>
             <w:kern w:val="2"/>
-            <w:sz w:val="22"/>
-            <w:szCs w:val="22"/>
+            <w:sz w:val="24"/>
+            <w:szCs w:val="24"/>
+            <w14:ligatures w14:val="standardContextual"/>
           </w:rPr>
           <w:tab/>
         </w:r>
@@ -3008,7 +3325,7 @@
           <w:rPr>
             <w:webHidden/>
           </w:rPr>
-          <w:instrText xml:space="preserve"> PAGEREF _Toc157417006 \h </w:instrText>
+          <w:instrText xml:space="preserve"> PAGEREF _Toc203401688 \h </w:instrText>
         </w:r>
         <w:r>
           <w:rPr>
@@ -3042,14 +3359,16 @@
           <w:tab w:val="left" w:pos="1078"/>
         </w:tabs>
         <w:rPr>
+          <w:rFonts w:asciiTheme="minorHAnsi" w:eastAsiaTheme="minorEastAsia" w:hAnsiTheme="minorHAnsi" w:cstheme="minorBidi"/>
           <w:b w:val="0"/>
           <w:spacing w:val="0"/>
           <w:kern w:val="2"/>
-          <w:sz w:val="22"/>
-          <w:szCs w:val="22"/>
-        </w:rPr>
-      </w:pPr>
-      <w:hyperlink w:anchor="_Toc157417007" w:history="1">
+          <w:sz w:val="24"/>
+          <w:szCs w:val="24"/>
+          <w14:ligatures w14:val="standardContextual"/>
+        </w:rPr>
+      </w:pPr>
+      <w:hyperlink w:anchor="_Toc203401689" w:history="1">
         <w:r>
           <w:rPr>
             <w:rStyle w:val="Hipervnculo"/>
@@ -3059,11 +3378,13 @@
         </w:r>
         <w:r>
           <w:rPr>
+            <w:rFonts w:asciiTheme="minorHAnsi" w:eastAsiaTheme="minorEastAsia" w:hAnsiTheme="minorHAnsi" w:cstheme="minorBidi"/>
             <w:b w:val="0"/>
             <w:spacing w:val="0"/>
             <w:kern w:val="2"/>
-            <w:sz w:val="22"/>
-            <w:szCs w:val="22"/>
+            <w:sz w:val="24"/>
+            <w:szCs w:val="24"/>
+            <w14:ligatures w14:val="standardContextual"/>
           </w:rPr>
           <w:tab/>
         </w:r>
@@ -3090,7 +3411,7 @@
           <w:rPr>
             <w:webHidden/>
           </w:rPr>
-          <w:instrText xml:space="preserve"> PAGEREF _Toc157417007 \h </w:instrText>
+          <w:instrText xml:space="preserve"> PAGEREF _Toc203401689 \h </w:instrText>
         </w:r>
         <w:r>
           <w:rPr>
@@ -3121,13 +3442,15 @@
       <w:pPr>
         <w:pStyle w:val="TDC2"/>
         <w:rPr>
+          <w:rFonts w:asciiTheme="minorHAnsi" w:eastAsiaTheme="minorEastAsia" w:hAnsiTheme="minorHAnsi" w:cstheme="minorBidi"/>
           <w:spacing w:val="0"/>
           <w:kern w:val="2"/>
-          <w:sz w:val="22"/>
-          <w:szCs w:val="22"/>
-        </w:rPr>
-      </w:pPr>
-      <w:hyperlink w:anchor="_Toc157417008" w:history="1">
+          <w:sz w:val="24"/>
+          <w:szCs w:val="24"/>
+          <w14:ligatures w14:val="standardContextual"/>
+        </w:rPr>
+      </w:pPr>
+      <w:hyperlink w:anchor="_Toc203401690" w:history="1">
         <w:r>
           <w:rPr>
             <w:rStyle w:val="Hipervnculo"/>
@@ -3136,10 +3459,12 @@
         </w:r>
         <w:r>
           <w:rPr>
+            <w:rFonts w:asciiTheme="minorHAnsi" w:eastAsiaTheme="minorEastAsia" w:hAnsiTheme="minorHAnsi" w:cstheme="minorBidi"/>
             <w:spacing w:val="0"/>
             <w:kern w:val="2"/>
-            <w:sz w:val="22"/>
-            <w:szCs w:val="22"/>
+            <w:sz w:val="24"/>
+            <w:szCs w:val="24"/>
+            <w14:ligatures w14:val="standardContextual"/>
           </w:rPr>
           <w:tab/>
         </w:r>
@@ -3165,7 +3490,7 @@
           <w:rPr>
             <w:webHidden/>
           </w:rPr>
-          <w:instrText xml:space="preserve"> PAGEREF _Toc157417008 \h </w:instrText>
+          <w:instrText xml:space="preserve"> PAGEREF _Toc203401690 \h </w:instrText>
         </w:r>
         <w:r>
           <w:rPr>
@@ -3196,13 +3521,15 @@
       <w:pPr>
         <w:pStyle w:val="TDC2"/>
         <w:rPr>
+          <w:rFonts w:asciiTheme="minorHAnsi" w:eastAsiaTheme="minorEastAsia" w:hAnsiTheme="minorHAnsi" w:cstheme="minorBidi"/>
           <w:spacing w:val="0"/>
           <w:kern w:val="2"/>
-          <w:sz w:val="22"/>
-          <w:szCs w:val="22"/>
-        </w:rPr>
-      </w:pPr>
-      <w:hyperlink w:anchor="_Toc157417009" w:history="1">
+          <w:sz w:val="24"/>
+          <w:szCs w:val="24"/>
+          <w14:ligatures w14:val="standardContextual"/>
+        </w:rPr>
+      </w:pPr>
+      <w:hyperlink w:anchor="_Toc203401691" w:history="1">
         <w:r>
           <w:rPr>
             <w:rStyle w:val="Hipervnculo"/>
@@ -3211,10 +3538,12 @@
         </w:r>
         <w:r>
           <w:rPr>
+            <w:rFonts w:asciiTheme="minorHAnsi" w:eastAsiaTheme="minorEastAsia" w:hAnsiTheme="minorHAnsi" w:cstheme="minorBidi"/>
             <w:spacing w:val="0"/>
             <w:kern w:val="2"/>
-            <w:sz w:val="22"/>
-            <w:szCs w:val="22"/>
+            <w:sz w:val="24"/>
+            <w:szCs w:val="24"/>
+            <w14:ligatures w14:val="standardContextual"/>
           </w:rPr>
           <w:tab/>
         </w:r>
@@ -3240,7 +3569,7 @@
           <w:rPr>
             <w:webHidden/>
           </w:rPr>
-          <w:instrText xml:space="preserve"> PAGEREF _Toc157417009 \h </w:instrText>
+          <w:instrText xml:space="preserve"> PAGEREF _Toc203401691 \h </w:instrText>
         </w:r>
         <w:r>
           <w:rPr>
@@ -3271,13 +3600,15 @@
       <w:pPr>
         <w:pStyle w:val="TDC2"/>
         <w:rPr>
+          <w:rFonts w:asciiTheme="minorHAnsi" w:eastAsiaTheme="minorEastAsia" w:hAnsiTheme="minorHAnsi" w:cstheme="minorBidi"/>
           <w:spacing w:val="0"/>
           <w:kern w:val="2"/>
-          <w:sz w:val="22"/>
-          <w:szCs w:val="22"/>
-        </w:rPr>
-      </w:pPr>
-      <w:hyperlink w:anchor="_Toc157417010" w:history="1">
+          <w:sz w:val="24"/>
+          <w:szCs w:val="24"/>
+          <w14:ligatures w14:val="standardContextual"/>
+        </w:rPr>
+      </w:pPr>
+      <w:hyperlink w:anchor="_Toc203401692" w:history="1">
         <w:r>
           <w:rPr>
             <w:rStyle w:val="Hipervnculo"/>
@@ -3286,10 +3617,12 @@
         </w:r>
         <w:r>
           <w:rPr>
+            <w:rFonts w:asciiTheme="minorHAnsi" w:eastAsiaTheme="minorEastAsia" w:hAnsiTheme="minorHAnsi" w:cstheme="minorBidi"/>
             <w:spacing w:val="0"/>
             <w:kern w:val="2"/>
-            <w:sz w:val="22"/>
-            <w:szCs w:val="22"/>
+            <w:sz w:val="24"/>
+            <w:szCs w:val="24"/>
+            <w14:ligatures w14:val="standardContextual"/>
           </w:rPr>
           <w:tab/>
         </w:r>
@@ -3315,7 +3648,7 @@
           <w:rPr>
             <w:webHidden/>
           </w:rPr>
-          <w:instrText xml:space="preserve"> PAGEREF _Toc157417010 \h </w:instrText>
+          <w:instrText xml:space="preserve"> PAGEREF _Toc203401692 \h </w:instrText>
         </w:r>
         <w:r>
           <w:rPr>
@@ -3346,13 +3679,15 @@
       <w:pPr>
         <w:pStyle w:val="TDC2"/>
         <w:rPr>
+          <w:rFonts w:asciiTheme="minorHAnsi" w:eastAsiaTheme="minorEastAsia" w:hAnsiTheme="minorHAnsi" w:cstheme="minorBidi"/>
           <w:spacing w:val="0"/>
           <w:kern w:val="2"/>
-          <w:sz w:val="22"/>
-          <w:szCs w:val="22"/>
-        </w:rPr>
-      </w:pPr>
-      <w:hyperlink w:anchor="_Toc157417011" w:history="1">
+          <w:sz w:val="24"/>
+          <w:szCs w:val="24"/>
+          <w14:ligatures w14:val="standardContextual"/>
+        </w:rPr>
+      </w:pPr>
+      <w:hyperlink w:anchor="_Toc203401693" w:history="1">
         <w:r>
           <w:rPr>
             <w:rStyle w:val="Hipervnculo"/>
@@ -3361,10 +3696,12 @@
         </w:r>
         <w:r>
           <w:rPr>
+            <w:rFonts w:asciiTheme="minorHAnsi" w:eastAsiaTheme="minorEastAsia" w:hAnsiTheme="minorHAnsi" w:cstheme="minorBidi"/>
             <w:spacing w:val="0"/>
             <w:kern w:val="2"/>
-            <w:sz w:val="22"/>
-            <w:szCs w:val="22"/>
+            <w:sz w:val="24"/>
+            <w:szCs w:val="24"/>
+            <w14:ligatures w14:val="standardContextual"/>
           </w:rPr>
           <w:tab/>
         </w:r>
@@ -3390,7 +3727,7 @@
           <w:rPr>
             <w:webHidden/>
           </w:rPr>
-          <w:instrText xml:space="preserve"> PAGEREF _Toc157417011 \h </w:instrText>
+          <w:instrText xml:space="preserve"> PAGEREF _Toc203401693 \h </w:instrText>
         </w:r>
         <w:r>
           <w:rPr>
@@ -3421,13 +3758,15 @@
       <w:pPr>
         <w:pStyle w:val="TDC2"/>
         <w:rPr>
+          <w:rFonts w:asciiTheme="minorHAnsi" w:eastAsiaTheme="minorEastAsia" w:hAnsiTheme="minorHAnsi" w:cstheme="minorBidi"/>
           <w:spacing w:val="0"/>
           <w:kern w:val="2"/>
-          <w:sz w:val="22"/>
-          <w:szCs w:val="22"/>
-        </w:rPr>
-      </w:pPr>
-      <w:hyperlink w:anchor="_Toc157417012" w:history="1">
+          <w:sz w:val="24"/>
+          <w:szCs w:val="24"/>
+          <w14:ligatures w14:val="standardContextual"/>
+        </w:rPr>
+      </w:pPr>
+      <w:hyperlink w:anchor="_Toc203401694" w:history="1">
         <w:r>
           <w:rPr>
             <w:rStyle w:val="Hipervnculo"/>
@@ -3436,10 +3775,12 @@
         </w:r>
         <w:r>
           <w:rPr>
+            <w:rFonts w:asciiTheme="minorHAnsi" w:eastAsiaTheme="minorEastAsia" w:hAnsiTheme="minorHAnsi" w:cstheme="minorBidi"/>
             <w:spacing w:val="0"/>
             <w:kern w:val="2"/>
-            <w:sz w:val="22"/>
-            <w:szCs w:val="22"/>
+            <w:sz w:val="24"/>
+            <w:szCs w:val="24"/>
+            <w14:ligatures w14:val="standardContextual"/>
           </w:rPr>
           <w:tab/>
         </w:r>
@@ -3465,7 +3806,7 @@
           <w:rPr>
             <w:webHidden/>
           </w:rPr>
-          <w:instrText xml:space="preserve"> PAGEREF _Toc157417012 \h </w:instrText>
+          <w:instrText xml:space="preserve"> PAGEREF _Toc203401694 \h </w:instrText>
         </w:r>
         <w:r>
           <w:rPr>
@@ -3499,14 +3840,16 @@
           <w:tab w:val="left" w:pos="1078"/>
         </w:tabs>
         <w:rPr>
+          <w:rFonts w:asciiTheme="minorHAnsi" w:eastAsiaTheme="minorEastAsia" w:hAnsiTheme="minorHAnsi" w:cstheme="minorBidi"/>
           <w:b w:val="0"/>
           <w:spacing w:val="0"/>
           <w:kern w:val="2"/>
-          <w:sz w:val="22"/>
-          <w:szCs w:val="22"/>
-        </w:rPr>
-      </w:pPr>
-      <w:hyperlink w:anchor="_Toc157417013" w:history="1">
+          <w:sz w:val="24"/>
+          <w:szCs w:val="24"/>
+          <w14:ligatures w14:val="standardContextual"/>
+        </w:rPr>
+      </w:pPr>
+      <w:hyperlink w:anchor="_Toc203401695" w:history="1">
         <w:r>
           <w:rPr>
             <w:rStyle w:val="Hipervnculo"/>
@@ -3515,11 +3858,13 @@
         </w:r>
         <w:r>
           <w:rPr>
+            <w:rFonts w:asciiTheme="minorHAnsi" w:eastAsiaTheme="minorEastAsia" w:hAnsiTheme="minorHAnsi" w:cstheme="minorBidi"/>
             <w:b w:val="0"/>
             <w:spacing w:val="0"/>
             <w:kern w:val="2"/>
-            <w:sz w:val="22"/>
-            <w:szCs w:val="22"/>
+            <w:sz w:val="24"/>
+            <w:szCs w:val="24"/>
+            <w14:ligatures w14:val="standardContextual"/>
           </w:rPr>
           <w:tab/>
         </w:r>
@@ -3545,7 +3890,7 @@
           <w:rPr>
             <w:webHidden/>
           </w:rPr>
-          <w:instrText xml:space="preserve"> PAGEREF _Toc157417013 \h </w:instrText>
+          <w:instrText xml:space="preserve"> PAGEREF _Toc203401695 \h </w:instrText>
         </w:r>
         <w:r>
           <w:rPr>
@@ -3576,13 +3921,15 @@
       <w:pPr>
         <w:pStyle w:val="TDC2"/>
         <w:rPr>
+          <w:rFonts w:asciiTheme="minorHAnsi" w:eastAsiaTheme="minorEastAsia" w:hAnsiTheme="minorHAnsi" w:cstheme="minorBidi"/>
           <w:spacing w:val="0"/>
           <w:kern w:val="2"/>
-          <w:sz w:val="22"/>
-          <w:szCs w:val="22"/>
-        </w:rPr>
-      </w:pPr>
-      <w:hyperlink w:anchor="_Toc157417014" w:history="1">
+          <w:sz w:val="24"/>
+          <w:szCs w:val="24"/>
+          <w14:ligatures w14:val="standardContextual"/>
+        </w:rPr>
+      </w:pPr>
+      <w:hyperlink w:anchor="_Toc203401696" w:history="1">
         <w:r>
           <w:rPr>
             <w:rStyle w:val="Hipervnculo"/>
@@ -3591,10 +3938,12 @@
         </w:r>
         <w:r>
           <w:rPr>
+            <w:rFonts w:asciiTheme="minorHAnsi" w:eastAsiaTheme="minorEastAsia" w:hAnsiTheme="minorHAnsi" w:cstheme="minorBidi"/>
             <w:spacing w:val="0"/>
             <w:kern w:val="2"/>
-            <w:sz w:val="22"/>
-            <w:szCs w:val="22"/>
+            <w:sz w:val="24"/>
+            <w:szCs w:val="24"/>
+            <w14:ligatures w14:val="standardContextual"/>
           </w:rPr>
           <w:tab/>
         </w:r>
@@ -3620,7 +3969,7 @@
           <w:rPr>
             <w:webHidden/>
           </w:rPr>
-          <w:instrText xml:space="preserve"> PAGEREF _Toc157417014 \h </w:instrText>
+          <w:instrText xml:space="preserve"> PAGEREF _Toc203401696 \h </w:instrText>
         </w:r>
         <w:r>
           <w:rPr>
@@ -3651,13 +4000,15 @@
       <w:pPr>
         <w:pStyle w:val="TDC3"/>
         <w:rPr>
+          <w:rFonts w:asciiTheme="minorHAnsi" w:eastAsiaTheme="minorEastAsia" w:hAnsiTheme="minorHAnsi" w:cstheme="minorBidi"/>
           <w:spacing w:val="0"/>
           <w:kern w:val="2"/>
-          <w:sz w:val="22"/>
-          <w:szCs w:val="22"/>
-        </w:rPr>
-      </w:pPr>
-      <w:hyperlink w:anchor="_Toc157417015" w:history="1">
+          <w:sz w:val="24"/>
+          <w:szCs w:val="24"/>
+          <w14:ligatures w14:val="standardContextual"/>
+        </w:rPr>
+      </w:pPr>
+      <w:hyperlink w:anchor="_Toc203401697" w:history="1">
         <w:r>
           <w:rPr>
             <w:rStyle w:val="Hipervnculo"/>
@@ -3666,10 +4017,12 @@
         </w:r>
         <w:r>
           <w:rPr>
+            <w:rFonts w:asciiTheme="minorHAnsi" w:eastAsiaTheme="minorEastAsia" w:hAnsiTheme="minorHAnsi" w:cstheme="minorBidi"/>
             <w:spacing w:val="0"/>
             <w:kern w:val="2"/>
-            <w:sz w:val="22"/>
-            <w:szCs w:val="22"/>
+            <w:sz w:val="24"/>
+            <w:szCs w:val="24"/>
+            <w14:ligatures w14:val="standardContextual"/>
           </w:rPr>
           <w:tab/>
         </w:r>
@@ -3695,7 +4048,7 @@
           <w:rPr>
             <w:webHidden/>
           </w:rPr>
-          <w:instrText xml:space="preserve"> PAGEREF _Toc157417015 \h </w:instrText>
+          <w:instrText xml:space="preserve"> PAGEREF _Toc203401697 \h </w:instrText>
         </w:r>
         <w:r>
           <w:rPr>
@@ -3726,13 +4079,15 @@
       <w:pPr>
         <w:pStyle w:val="TDC3"/>
         <w:rPr>
+          <w:rFonts w:asciiTheme="minorHAnsi" w:eastAsiaTheme="minorEastAsia" w:hAnsiTheme="minorHAnsi" w:cstheme="minorBidi"/>
           <w:spacing w:val="0"/>
           <w:kern w:val="2"/>
-          <w:sz w:val="22"/>
-          <w:szCs w:val="22"/>
-        </w:rPr>
-      </w:pPr>
-      <w:hyperlink w:anchor="_Toc157417016" w:history="1">
+          <w:sz w:val="24"/>
+          <w:szCs w:val="24"/>
+          <w14:ligatures w14:val="standardContextual"/>
+        </w:rPr>
+      </w:pPr>
+      <w:hyperlink w:anchor="_Toc203401698" w:history="1">
         <w:r>
           <w:rPr>
             <w:rStyle w:val="Hipervnculo"/>
@@ -3741,10 +4096,12 @@
         </w:r>
         <w:r>
           <w:rPr>
+            <w:rFonts w:asciiTheme="minorHAnsi" w:eastAsiaTheme="minorEastAsia" w:hAnsiTheme="minorHAnsi" w:cstheme="minorBidi"/>
             <w:spacing w:val="0"/>
             <w:kern w:val="2"/>
-            <w:sz w:val="22"/>
-            <w:szCs w:val="22"/>
+            <w:sz w:val="24"/>
+            <w:szCs w:val="24"/>
+            <w14:ligatures w14:val="standardContextual"/>
           </w:rPr>
           <w:tab/>
         </w:r>
@@ -3770,7 +4127,7 @@
           <w:rPr>
             <w:webHidden/>
           </w:rPr>
-          <w:instrText xml:space="preserve"> PAGEREF _Toc157417016 \h </w:instrText>
+          <w:instrText xml:space="preserve"> PAGEREF _Toc203401698 \h </w:instrText>
         </w:r>
         <w:r>
           <w:rPr>
@@ -3801,13 +4158,15 @@
       <w:pPr>
         <w:pStyle w:val="TDC3"/>
         <w:rPr>
+          <w:rFonts w:asciiTheme="minorHAnsi" w:eastAsiaTheme="minorEastAsia" w:hAnsiTheme="minorHAnsi" w:cstheme="minorBidi"/>
           <w:spacing w:val="0"/>
           <w:kern w:val="2"/>
-          <w:sz w:val="22"/>
-          <w:szCs w:val="22"/>
-        </w:rPr>
-      </w:pPr>
-      <w:hyperlink w:anchor="_Toc157417017" w:history="1">
+          <w:sz w:val="24"/>
+          <w:szCs w:val="24"/>
+          <w14:ligatures w14:val="standardContextual"/>
+        </w:rPr>
+      </w:pPr>
+      <w:hyperlink w:anchor="_Toc203401699" w:history="1">
         <w:r>
           <w:rPr>
             <w:rStyle w:val="Hipervnculo"/>
@@ -3816,10 +4175,12 @@
         </w:r>
         <w:r>
           <w:rPr>
+            <w:rFonts w:asciiTheme="minorHAnsi" w:eastAsiaTheme="minorEastAsia" w:hAnsiTheme="minorHAnsi" w:cstheme="minorBidi"/>
             <w:spacing w:val="0"/>
             <w:kern w:val="2"/>
-            <w:sz w:val="22"/>
-            <w:szCs w:val="22"/>
+            <w:sz w:val="24"/>
+            <w:szCs w:val="24"/>
+            <w14:ligatures w14:val="standardContextual"/>
           </w:rPr>
           <w:tab/>
         </w:r>
@@ -3845,7 +4206,7 @@
           <w:rPr>
             <w:webHidden/>
           </w:rPr>
-          <w:instrText xml:space="preserve"> PAGEREF _Toc157417017 \h </w:instrText>
+          <w:instrText xml:space="preserve"> PAGEREF _Toc203401699 \h </w:instrText>
         </w:r>
         <w:r>
           <w:rPr>
@@ -3876,13 +4237,15 @@
       <w:pPr>
         <w:pStyle w:val="TDC3"/>
         <w:rPr>
+          <w:rFonts w:asciiTheme="minorHAnsi" w:eastAsiaTheme="minorEastAsia" w:hAnsiTheme="minorHAnsi" w:cstheme="minorBidi"/>
           <w:spacing w:val="0"/>
           <w:kern w:val="2"/>
-          <w:sz w:val="22"/>
-          <w:szCs w:val="22"/>
-        </w:rPr>
-      </w:pPr>
-      <w:hyperlink w:anchor="_Toc157417018" w:history="1">
+          <w:sz w:val="24"/>
+          <w:szCs w:val="24"/>
+          <w14:ligatures w14:val="standardContextual"/>
+        </w:rPr>
+      </w:pPr>
+      <w:hyperlink w:anchor="_Toc203401700" w:history="1">
         <w:r>
           <w:rPr>
             <w:rStyle w:val="Hipervnculo"/>
@@ -3891,10 +4254,12 @@
         </w:r>
         <w:r>
           <w:rPr>
+            <w:rFonts w:asciiTheme="minorHAnsi" w:eastAsiaTheme="minorEastAsia" w:hAnsiTheme="minorHAnsi" w:cstheme="minorBidi"/>
             <w:spacing w:val="0"/>
             <w:kern w:val="2"/>
-            <w:sz w:val="22"/>
-            <w:szCs w:val="22"/>
+            <w:sz w:val="24"/>
+            <w:szCs w:val="24"/>
+            <w14:ligatures w14:val="standardContextual"/>
           </w:rPr>
           <w:tab/>
         </w:r>
@@ -3920,7 +4285,7 @@
           <w:rPr>
             <w:webHidden/>
           </w:rPr>
-          <w:instrText xml:space="preserve"> PAGEREF _Toc157417018 \h </w:instrText>
+          <w:instrText xml:space="preserve"> PAGEREF _Toc203401700 \h </w:instrText>
         </w:r>
         <w:r>
           <w:rPr>
@@ -3951,13 +4316,15 @@
       <w:pPr>
         <w:pStyle w:val="TDC3"/>
         <w:rPr>
+          <w:rFonts w:asciiTheme="minorHAnsi" w:eastAsiaTheme="minorEastAsia" w:hAnsiTheme="minorHAnsi" w:cstheme="minorBidi"/>
           <w:spacing w:val="0"/>
           <w:kern w:val="2"/>
-          <w:sz w:val="22"/>
-          <w:szCs w:val="22"/>
-        </w:rPr>
-      </w:pPr>
-      <w:hyperlink w:anchor="_Toc157417019" w:history="1">
+          <w:sz w:val="24"/>
+          <w:szCs w:val="24"/>
+          <w14:ligatures w14:val="standardContextual"/>
+        </w:rPr>
+      </w:pPr>
+      <w:hyperlink w:anchor="_Toc203401701" w:history="1">
         <w:r>
           <w:rPr>
             <w:rStyle w:val="Hipervnculo"/>
@@ -3966,10 +4333,12 @@
         </w:r>
         <w:r>
           <w:rPr>
+            <w:rFonts w:asciiTheme="minorHAnsi" w:eastAsiaTheme="minorEastAsia" w:hAnsiTheme="minorHAnsi" w:cstheme="minorBidi"/>
             <w:spacing w:val="0"/>
             <w:kern w:val="2"/>
-            <w:sz w:val="22"/>
-            <w:szCs w:val="22"/>
+            <w:sz w:val="24"/>
+            <w:szCs w:val="24"/>
+            <w14:ligatures w14:val="standardContextual"/>
           </w:rPr>
           <w:tab/>
         </w:r>
@@ -3995,7 +4364,7 @@
           <w:rPr>
             <w:webHidden/>
           </w:rPr>
-          <w:instrText xml:space="preserve"> PAGEREF _Toc157417019 \h </w:instrText>
+          <w:instrText xml:space="preserve"> PAGEREF _Toc203401701 \h </w:instrText>
         </w:r>
         <w:r>
           <w:rPr>
@@ -4026,13 +4395,15 @@
       <w:pPr>
         <w:pStyle w:val="TDC3"/>
         <w:rPr>
+          <w:rFonts w:asciiTheme="minorHAnsi" w:eastAsiaTheme="minorEastAsia" w:hAnsiTheme="minorHAnsi" w:cstheme="minorBidi"/>
           <w:spacing w:val="0"/>
           <w:kern w:val="2"/>
-          <w:sz w:val="22"/>
-          <w:szCs w:val="22"/>
-        </w:rPr>
-      </w:pPr>
-      <w:hyperlink w:anchor="_Toc157417020" w:history="1">
+          <w:sz w:val="24"/>
+          <w:szCs w:val="24"/>
+          <w14:ligatures w14:val="standardContextual"/>
+        </w:rPr>
+      </w:pPr>
+      <w:hyperlink w:anchor="_Toc203401702" w:history="1">
         <w:r>
           <w:rPr>
             <w:rStyle w:val="Hipervnculo"/>
@@ -4041,10 +4412,12 @@
         </w:r>
         <w:r>
           <w:rPr>
+            <w:rFonts w:asciiTheme="minorHAnsi" w:eastAsiaTheme="minorEastAsia" w:hAnsiTheme="minorHAnsi" w:cstheme="minorBidi"/>
             <w:spacing w:val="0"/>
             <w:kern w:val="2"/>
-            <w:sz w:val="22"/>
-            <w:szCs w:val="22"/>
+            <w:sz w:val="24"/>
+            <w:szCs w:val="24"/>
+            <w14:ligatures w14:val="standardContextual"/>
           </w:rPr>
           <w:tab/>
         </w:r>
@@ -4070,7 +4443,7 @@
           <w:rPr>
             <w:webHidden/>
           </w:rPr>
-          <w:instrText xml:space="preserve"> PAGEREF _Toc157417020 \h </w:instrText>
+          <w:instrText xml:space="preserve"> PAGEREF _Toc203401702 \h </w:instrText>
         </w:r>
         <w:r>
           <w:rPr>
@@ -4101,13 +4474,15 @@
       <w:pPr>
         <w:pStyle w:val="TDC2"/>
         <w:rPr>
+          <w:rFonts w:asciiTheme="minorHAnsi" w:eastAsiaTheme="minorEastAsia" w:hAnsiTheme="minorHAnsi" w:cstheme="minorBidi"/>
           <w:spacing w:val="0"/>
           <w:kern w:val="2"/>
-          <w:sz w:val="22"/>
-          <w:szCs w:val="22"/>
-        </w:rPr>
-      </w:pPr>
-      <w:hyperlink w:anchor="_Toc157417021" w:history="1">
+          <w:sz w:val="24"/>
+          <w:szCs w:val="24"/>
+          <w14:ligatures w14:val="standardContextual"/>
+        </w:rPr>
+      </w:pPr>
+      <w:hyperlink w:anchor="_Toc203401703" w:history="1">
         <w:r>
           <w:rPr>
             <w:rStyle w:val="Hipervnculo"/>
@@ -4116,10 +4491,12 @@
         </w:r>
         <w:r>
           <w:rPr>
+            <w:rFonts w:asciiTheme="minorHAnsi" w:eastAsiaTheme="minorEastAsia" w:hAnsiTheme="minorHAnsi" w:cstheme="minorBidi"/>
             <w:spacing w:val="0"/>
             <w:kern w:val="2"/>
-            <w:sz w:val="22"/>
-            <w:szCs w:val="22"/>
+            <w:sz w:val="24"/>
+            <w:szCs w:val="24"/>
+            <w14:ligatures w14:val="standardContextual"/>
           </w:rPr>
           <w:tab/>
         </w:r>
@@ -4145,7 +4522,7 @@
           <w:rPr>
             <w:webHidden/>
           </w:rPr>
-          <w:instrText xml:space="preserve"> PAGEREF _Toc157417021 \h </w:instrText>
+          <w:instrText xml:space="preserve"> PAGEREF _Toc203401703 \h </w:instrText>
         </w:r>
         <w:r>
           <w:rPr>
@@ -4176,13 +4553,15 @@
       <w:pPr>
         <w:pStyle w:val="TDC3"/>
         <w:rPr>
+          <w:rFonts w:asciiTheme="minorHAnsi" w:eastAsiaTheme="minorEastAsia" w:hAnsiTheme="minorHAnsi" w:cstheme="minorBidi"/>
           <w:spacing w:val="0"/>
           <w:kern w:val="2"/>
-          <w:sz w:val="22"/>
-          <w:szCs w:val="22"/>
-        </w:rPr>
-      </w:pPr>
-      <w:hyperlink w:anchor="_Toc157417022" w:history="1">
+          <w:sz w:val="24"/>
+          <w:szCs w:val="24"/>
+          <w14:ligatures w14:val="standardContextual"/>
+        </w:rPr>
+      </w:pPr>
+      <w:hyperlink w:anchor="_Toc203401704" w:history="1">
         <w:r>
           <w:rPr>
             <w:rStyle w:val="Hipervnculo"/>
@@ -4191,10 +4570,12 @@
         </w:r>
         <w:r>
           <w:rPr>
+            <w:rFonts w:asciiTheme="minorHAnsi" w:eastAsiaTheme="minorEastAsia" w:hAnsiTheme="minorHAnsi" w:cstheme="minorBidi"/>
             <w:spacing w:val="0"/>
             <w:kern w:val="2"/>
-            <w:sz w:val="22"/>
-            <w:szCs w:val="22"/>
+            <w:sz w:val="24"/>
+            <w:szCs w:val="24"/>
+            <w14:ligatures w14:val="standardContextual"/>
           </w:rPr>
           <w:tab/>
         </w:r>
@@ -4220,7 +4601,7 @@
           <w:rPr>
             <w:webHidden/>
           </w:rPr>
-          <w:instrText xml:space="preserve"> PAGEREF _Toc157417022 \h </w:instrText>
+          <w:instrText xml:space="preserve"> PAGEREF _Toc203401704 \h </w:instrText>
         </w:r>
         <w:r>
           <w:rPr>
@@ -4251,13 +4632,15 @@
       <w:pPr>
         <w:pStyle w:val="TDC3"/>
         <w:rPr>
+          <w:rFonts w:asciiTheme="minorHAnsi" w:eastAsiaTheme="minorEastAsia" w:hAnsiTheme="minorHAnsi" w:cstheme="minorBidi"/>
           <w:spacing w:val="0"/>
           <w:kern w:val="2"/>
-          <w:sz w:val="22"/>
-          <w:szCs w:val="22"/>
-        </w:rPr>
-      </w:pPr>
-      <w:hyperlink w:anchor="_Toc157417023" w:history="1">
+          <w:sz w:val="24"/>
+          <w:szCs w:val="24"/>
+          <w14:ligatures w14:val="standardContextual"/>
+        </w:rPr>
+      </w:pPr>
+      <w:hyperlink w:anchor="_Toc203401705" w:history="1">
         <w:r>
           <w:rPr>
             <w:rStyle w:val="Hipervnculo"/>
@@ -4266,10 +4649,12 @@
         </w:r>
         <w:r>
           <w:rPr>
+            <w:rFonts w:asciiTheme="minorHAnsi" w:eastAsiaTheme="minorEastAsia" w:hAnsiTheme="minorHAnsi" w:cstheme="minorBidi"/>
             <w:spacing w:val="0"/>
             <w:kern w:val="2"/>
-            <w:sz w:val="22"/>
-            <w:szCs w:val="22"/>
+            <w:sz w:val="24"/>
+            <w:szCs w:val="24"/>
+            <w14:ligatures w14:val="standardContextual"/>
           </w:rPr>
           <w:tab/>
         </w:r>
@@ -4295,7 +4680,7 @@
           <w:rPr>
             <w:webHidden/>
           </w:rPr>
-          <w:instrText xml:space="preserve"> PAGEREF _Toc157417023 \h </w:instrText>
+          <w:instrText xml:space="preserve"> PAGEREF _Toc203401705 \h </w:instrText>
         </w:r>
         <w:r>
           <w:rPr>
@@ -4326,13 +4711,15 @@
       <w:pPr>
         <w:pStyle w:val="TDC3"/>
         <w:rPr>
+          <w:rFonts w:asciiTheme="minorHAnsi" w:eastAsiaTheme="minorEastAsia" w:hAnsiTheme="minorHAnsi" w:cstheme="minorBidi"/>
           <w:spacing w:val="0"/>
           <w:kern w:val="2"/>
-          <w:sz w:val="22"/>
-          <w:szCs w:val="22"/>
-        </w:rPr>
-      </w:pPr>
-      <w:hyperlink w:anchor="_Toc157417024" w:history="1">
+          <w:sz w:val="24"/>
+          <w:szCs w:val="24"/>
+          <w14:ligatures w14:val="standardContextual"/>
+        </w:rPr>
+      </w:pPr>
+      <w:hyperlink w:anchor="_Toc203401706" w:history="1">
         <w:r>
           <w:rPr>
             <w:rStyle w:val="Hipervnculo"/>
@@ -4341,10 +4728,12 @@
         </w:r>
         <w:r>
           <w:rPr>
+            <w:rFonts w:asciiTheme="minorHAnsi" w:eastAsiaTheme="minorEastAsia" w:hAnsiTheme="minorHAnsi" w:cstheme="minorBidi"/>
             <w:spacing w:val="0"/>
             <w:kern w:val="2"/>
-            <w:sz w:val="22"/>
-            <w:szCs w:val="22"/>
+            <w:sz w:val="24"/>
+            <w:szCs w:val="24"/>
+            <w14:ligatures w14:val="standardContextual"/>
           </w:rPr>
           <w:tab/>
         </w:r>
@@ -4370,7 +4759,7 @@
           <w:rPr>
             <w:webHidden/>
           </w:rPr>
-          <w:instrText xml:space="preserve"> PAGEREF _Toc157417024 \h </w:instrText>
+          <w:instrText xml:space="preserve"> PAGEREF _Toc203401706 \h </w:instrText>
         </w:r>
         <w:r>
           <w:rPr>
@@ -4401,13 +4790,15 @@
       <w:pPr>
         <w:pStyle w:val="TDC3"/>
         <w:rPr>
+          <w:rFonts w:asciiTheme="minorHAnsi" w:eastAsiaTheme="minorEastAsia" w:hAnsiTheme="minorHAnsi" w:cstheme="minorBidi"/>
           <w:spacing w:val="0"/>
           <w:kern w:val="2"/>
-          <w:sz w:val="22"/>
-          <w:szCs w:val="22"/>
-        </w:rPr>
-      </w:pPr>
-      <w:hyperlink w:anchor="_Toc157417025" w:history="1">
+          <w:sz w:val="24"/>
+          <w:szCs w:val="24"/>
+          <w14:ligatures w14:val="standardContextual"/>
+        </w:rPr>
+      </w:pPr>
+      <w:hyperlink w:anchor="_Toc203401707" w:history="1">
         <w:r>
           <w:rPr>
             <w:rStyle w:val="Hipervnculo"/>
@@ -4416,10 +4807,12 @@
         </w:r>
         <w:r>
           <w:rPr>
+            <w:rFonts w:asciiTheme="minorHAnsi" w:eastAsiaTheme="minorEastAsia" w:hAnsiTheme="minorHAnsi" w:cstheme="minorBidi"/>
             <w:spacing w:val="0"/>
             <w:kern w:val="2"/>
-            <w:sz w:val="22"/>
-            <w:szCs w:val="22"/>
+            <w:sz w:val="24"/>
+            <w:szCs w:val="24"/>
+            <w14:ligatures w14:val="standardContextual"/>
           </w:rPr>
           <w:tab/>
         </w:r>
@@ -4445,7 +4838,7 @@
           <w:rPr>
             <w:webHidden/>
           </w:rPr>
-          <w:instrText xml:space="preserve"> PAGEREF _Toc157417025 \h </w:instrText>
+          <w:instrText xml:space="preserve"> PAGEREF _Toc203401707 \h </w:instrText>
         </w:r>
         <w:r>
           <w:rPr>
@@ -4476,13 +4869,15 @@
       <w:pPr>
         <w:pStyle w:val="TDC3"/>
         <w:rPr>
+          <w:rFonts w:asciiTheme="minorHAnsi" w:eastAsiaTheme="minorEastAsia" w:hAnsiTheme="minorHAnsi" w:cstheme="minorBidi"/>
           <w:spacing w:val="0"/>
           <w:kern w:val="2"/>
-          <w:sz w:val="22"/>
-          <w:szCs w:val="22"/>
-        </w:rPr>
-      </w:pPr>
-      <w:hyperlink w:anchor="_Toc157417026" w:history="1">
+          <w:sz w:val="24"/>
+          <w:szCs w:val="24"/>
+          <w14:ligatures w14:val="standardContextual"/>
+        </w:rPr>
+      </w:pPr>
+      <w:hyperlink w:anchor="_Toc203401708" w:history="1">
         <w:r>
           <w:rPr>
             <w:rStyle w:val="Hipervnculo"/>
@@ -4491,10 +4886,12 @@
         </w:r>
         <w:r>
           <w:rPr>
+            <w:rFonts w:asciiTheme="minorHAnsi" w:eastAsiaTheme="minorEastAsia" w:hAnsiTheme="minorHAnsi" w:cstheme="minorBidi"/>
             <w:spacing w:val="0"/>
             <w:kern w:val="2"/>
-            <w:sz w:val="22"/>
-            <w:szCs w:val="22"/>
+            <w:sz w:val="24"/>
+            <w:szCs w:val="24"/>
+            <w14:ligatures w14:val="standardContextual"/>
           </w:rPr>
           <w:tab/>
         </w:r>
@@ -4520,7 +4917,7 @@
           <w:rPr>
             <w:webHidden/>
           </w:rPr>
-          <w:instrText xml:space="preserve"> PAGEREF _Toc157417026 \h </w:instrText>
+          <w:instrText xml:space="preserve"> PAGEREF _Toc203401708 \h </w:instrText>
         </w:r>
         <w:r>
           <w:rPr>
@@ -4575,7 +4972,7 @@
         </w:rPr>
         <w:br w:type="page"/>
       </w:r>
-      <w:bookmarkStart w:id="17" w:name="_Toc157416997"/>
+      <w:bookmarkStart w:id="17" w:name="_Toc203401679"/>
       <w:r>
         <w:rPr>
           <w:rFonts w:cs="Calibri"/>
@@ -4667,7 +5064,14 @@
           <w:rFonts w:ascii="Calibri" w:hAnsi="Calibri" w:cs="Calibri"/>
           <w:sz w:val="24"/>
         </w:rPr>
-        <w:t>2.2.4_000</w:t>
+        <w:t>2.2.4_00</w:t>
+      </w:r>
+      <w:r>
+        <w:rPr>
+          <w:rFonts w:ascii="Calibri" w:hAnsi="Calibri" w:cs="Calibri"/>
+          <w:sz w:val="24"/>
+        </w:rPr>
+        <w:t>1</w:t>
       </w:r>
       <w:r>
         <w:rPr>
@@ -4726,7 +5130,7 @@
           <w:rFonts w:cs="Calibri"/>
         </w:rPr>
       </w:pPr>
-      <w:bookmarkStart w:id="18" w:name="_Toc157416998"/>
+      <w:bookmarkStart w:id="18" w:name="_Toc203401680"/>
       <w:r>
         <w:rPr>
           <w:rFonts w:cs="Calibri"/>
@@ -4821,7 +5225,7 @@
           <w:rFonts w:cs="Calibri"/>
         </w:rPr>
       </w:pPr>
-      <w:bookmarkStart w:id="19" w:name="_Toc157416999"/>
+      <w:bookmarkStart w:id="19" w:name="_Toc203401681"/>
       <w:r>
         <w:rPr>
           <w:rFonts w:cs="Calibri"/>
@@ -8316,7 +8720,7 @@
         <w:lastRenderedPageBreak/>
         <w:t xml:space="preserve"> </w:t>
       </w:r>
-      <w:bookmarkStart w:id="20" w:name="_Toc157417000"/>
+      <w:bookmarkStart w:id="20" w:name="_Toc203401682"/>
       <w:r>
         <w:t>Introducción</w:t>
       </w:r>
@@ -8486,13 +8890,20 @@
           <w:rFonts w:cs="Calibri"/>
           <w:snapToGrid w:val="0"/>
         </w:rPr>
-        <w:t>2.2.4_000</w:t>
+        <w:t>2.2.4_00</w:t>
       </w:r>
       <w:r>
         <w:rPr>
           <w:rFonts w:cs="Calibri"/>
           <w:snapToGrid w:val="0"/>
         </w:rPr>
+        <w:t>1</w:t>
+      </w:r>
+      <w:r>
+        <w:rPr>
+          <w:rFonts w:cs="Calibri"/>
+          <w:snapToGrid w:val="0"/>
+        </w:rPr>
         <w:t>.</w:t>
       </w:r>
     </w:p>
@@ -8516,7 +8927,7 @@
         </w:rPr>
         <w:br w:type="page"/>
       </w:r>
-      <w:bookmarkStart w:id="21" w:name="_Toc157417001"/>
+      <w:bookmarkStart w:id="21" w:name="_Toc203401683"/>
       <w:r>
         <w:rPr>
           <w:rFonts w:cs="Calibri"/>
@@ -8558,7 +8969,7 @@
           <w:rFonts w:cs="Calibri"/>
         </w:rPr>
       </w:pPr>
-      <w:bookmarkStart w:id="22" w:name="_Toc157417002"/>
+      <w:bookmarkStart w:id="22" w:name="_Toc203401684"/>
       <w:r>
         <w:rPr>
           <w:rFonts w:cs="Calibri"/>
@@ -8863,7 +9274,7 @@
           <w:rFonts w:cs="Calibri"/>
         </w:rPr>
       </w:pPr>
-      <w:bookmarkStart w:id="23" w:name="_Toc157417003"/>
+      <w:bookmarkStart w:id="23" w:name="_Toc203401685"/>
       <w:r>
         <w:rPr>
           <w:rFonts w:cs="Calibri"/>
@@ -9114,6 +9525,7 @@
           </w:tcPr>
           <w:p>
             <w:pPr>
+              <w:ind w:left="1134" w:hanging="1134"/>
               <w:rPr>
                 <w:rFonts w:cs="Calibri"/>
               </w:rPr>
@@ -9197,7 +9609,7 @@
           <w:rFonts w:cs="Calibri"/>
         </w:rPr>
       </w:pPr>
-      <w:bookmarkStart w:id="24" w:name="_Toc157417004"/>
+      <w:bookmarkStart w:id="24" w:name="_Toc203401686"/>
       <w:r>
         <w:rPr>
           <w:rFonts w:cs="Calibri"/>
@@ -9251,7 +9663,7 @@
           <w:rFonts w:cs="Calibri"/>
         </w:rPr>
       </w:pPr>
-      <w:bookmarkStart w:id="25" w:name="_Toc157417005"/>
+      <w:bookmarkStart w:id="25" w:name="_Toc203401687"/>
       <w:r>
         <w:rPr>
           <w:rFonts w:cs="Calibri"/>
@@ -9327,13 +9739,20 @@
           <w:rFonts w:cs="Calibri"/>
           <w:b/>
         </w:rPr>
-        <w:t>2.2.4_000</w:t>
+        <w:t>2.2.4_00</w:t>
       </w:r>
       <w:r>
         <w:rPr>
           <w:rFonts w:cs="Calibri"/>
           <w:b/>
         </w:rPr>
+        <w:t>1</w:t>
+      </w:r>
+      <w:r>
+        <w:rPr>
+          <w:rFonts w:cs="Calibri"/>
+          <w:b/>
+        </w:rPr>
         <w:t xml:space="preserve"> </w:t>
       </w:r>
       <w:r>
@@ -9390,7 +9809,14 @@
           <w:rFonts w:cs="Calibri"/>
           <w:b/>
         </w:rPr>
-        <w:t>2.2.4_000</w:t>
+        <w:t>2.2.4_00</w:t>
+      </w:r>
+      <w:r>
+        <w:rPr>
+          <w:rFonts w:cs="Calibri"/>
+          <w:b/>
+        </w:rPr>
+        <w:t>1</w:t>
       </w:r>
       <w:r>
         <w:rPr>
@@ -9657,7 +10083,7 @@
           <w:rFonts w:cs="Calibri"/>
         </w:rPr>
       </w:pPr>
-      <w:bookmarkStart w:id="26" w:name="_Toc157417006"/>
+      <w:bookmarkStart w:id="26" w:name="_Toc203401688"/>
       <w:r>
         <w:rPr>
           <w:rFonts w:cs="Calibri"/>
@@ -9844,7 +10270,7 @@
           <w:rFonts w:cs="Calibri"/>
         </w:rPr>
       </w:pPr>
-      <w:bookmarkStart w:id="27" w:name="_Toc157417007"/>
+      <w:bookmarkStart w:id="27" w:name="_Toc203401689"/>
       <w:r>
         <w:rPr>
           <w:rFonts w:cs="Calibri"/>
@@ -9906,7 +10332,7 @@
       <w:pPr>
         <w:pStyle w:val="Ttulo2"/>
       </w:pPr>
-      <w:bookmarkStart w:id="28" w:name="_Toc157417008"/>
+      <w:bookmarkStart w:id="28" w:name="_Toc203401690"/>
       <w:proofErr w:type="spellStart"/>
       <w:r>
         <w:t>AfirmaServices</w:t>
@@ -10080,7 +10506,7 @@
       <w:pPr>
         <w:pStyle w:val="Ttulo2"/>
       </w:pPr>
-      <w:bookmarkStart w:id="29" w:name="_Toc157417009"/>
+      <w:bookmarkStart w:id="29" w:name="_Toc203401691"/>
       <w:proofErr w:type="spellStart"/>
       <w:r>
         <w:t>IntegraServices</w:t>
@@ -10254,7 +10680,7 @@
       <w:pPr>
         <w:pStyle w:val="Ttulo2"/>
       </w:pPr>
-      <w:bookmarkStart w:id="30" w:name="_Toc157417010"/>
+      <w:bookmarkStart w:id="30" w:name="_Toc203401692"/>
       <w:proofErr w:type="spellStart"/>
       <w:r>
         <w:t>TSAServices</w:t>
@@ -10396,7 +10822,7 @@
       <w:pPr>
         <w:pStyle w:val="Ttulo2"/>
       </w:pPr>
-      <w:bookmarkStart w:id="31" w:name="_Toc157417011"/>
+      <w:bookmarkStart w:id="31" w:name="_Toc203401693"/>
       <w:proofErr w:type="spellStart"/>
       <w:r>
         <w:t>EvisorServices</w:t>
@@ -10555,7 +10981,7 @@
       <w:pPr>
         <w:pStyle w:val="Ttulo2"/>
       </w:pPr>
-      <w:bookmarkStart w:id="32" w:name="_Toc157417012"/>
+      <w:bookmarkStart w:id="32" w:name="_Toc203401694"/>
       <w:proofErr w:type="spellStart"/>
       <w:r>
         <w:t>CipherServices</w:t>
@@ -10730,7 +11156,7 @@
       <w:r>
         <w:br w:type="page"/>
       </w:r>
-      <w:bookmarkStart w:id="33" w:name="_Toc157417013"/>
+      <w:bookmarkStart w:id="33" w:name="_Toc203401695"/>
       <w:r>
         <w:lastRenderedPageBreak/>
         <w:t>Configuración</w:t>
@@ -10755,7 +11181,7 @@
       <w:pPr>
         <w:pStyle w:val="Ttulo2"/>
       </w:pPr>
-      <w:bookmarkStart w:id="34" w:name="_Toc157417014"/>
+      <w:bookmarkStart w:id="34" w:name="_Toc203401696"/>
       <w:r>
         <w:t>Configuración estática</w:t>
       </w:r>
@@ -10950,7 +11376,7 @@
       <w:pPr>
         <w:pStyle w:val="Ttulo3"/>
       </w:pPr>
-      <w:bookmarkStart w:id="36" w:name="_Toc157417015"/>
+      <w:bookmarkStart w:id="36" w:name="_Toc203401697"/>
       <w:r>
         <w:t>Carpeta transformersTemplates</w:t>
       </w:r>
@@ -14501,7 +14927,7 @@
         <w:pStyle w:val="Ttulo3"/>
       </w:pPr>
       <w:bookmarkStart w:id="44" w:name="_Toc453065742"/>
-      <w:bookmarkStart w:id="45" w:name="_Toc157417016"/>
+      <w:bookmarkStart w:id="45" w:name="_Toc203401698"/>
       <w:r>
         <w:t xml:space="preserve">Archivo </w:t>
       </w:r>
@@ -14880,7 +15306,7 @@
         <w:pStyle w:val="Ttulo3"/>
       </w:pPr>
       <w:bookmarkStart w:id="46" w:name="_Toc453065743"/>
-      <w:bookmarkStart w:id="47" w:name="_Toc157417017"/>
+      <w:bookmarkStart w:id="47" w:name="_Toc203401699"/>
       <w:r>
         <w:lastRenderedPageBreak/>
         <w:t xml:space="preserve">Archivo </w:t>
@@ -15062,7 +15488,7 @@
         <w:pStyle w:val="Ttulo3"/>
       </w:pPr>
       <w:bookmarkStart w:id="48" w:name="_Toc453065744"/>
-      <w:bookmarkStart w:id="49" w:name="_Toc157417018"/>
+      <w:bookmarkStart w:id="49" w:name="_Toc203401700"/>
       <w:r>
         <w:t xml:space="preserve">Archivo </w:t>
       </w:r>
@@ -15097,7 +15523,7 @@
         <w:pStyle w:val="Ttulo3"/>
       </w:pPr>
       <w:bookmarkStart w:id="50" w:name="_Toc453065745"/>
-      <w:bookmarkStart w:id="51" w:name="_Toc157417019"/>
+      <w:bookmarkStart w:id="51" w:name="_Toc203401701"/>
       <w:r>
         <w:t xml:space="preserve">Archivo </w:t>
       </w:r>
@@ -15307,7 +15733,7 @@
         <w:pStyle w:val="Ttulo3"/>
       </w:pPr>
       <w:bookmarkStart w:id="52" w:name="_Toc453065746"/>
-      <w:bookmarkStart w:id="53" w:name="_Toc157417020"/>
+      <w:bookmarkStart w:id="53" w:name="_Toc203401702"/>
       <w:r>
         <w:t xml:space="preserve">Archivo </w:t>
       </w:r>
@@ -15830,7 +16256,7 @@
       <w:pPr>
         <w:pStyle w:val="Ttulo2"/>
       </w:pPr>
-      <w:bookmarkStart w:id="56" w:name="_Toc157417021"/>
+      <w:bookmarkStart w:id="56" w:name="_Toc203401703"/>
       <w:r>
         <w:t>Configuración dinámica</w:t>
       </w:r>
@@ -16406,7 +16832,7 @@
       <w:pPr>
         <w:pStyle w:val="Ttulo3"/>
       </w:pPr>
-      <w:bookmarkStart w:id="59" w:name="_Toc157417022"/>
+      <w:bookmarkStart w:id="59" w:name="_Toc203401704"/>
       <w:r>
         <w:t>Archivo mappingFiles</w:t>
       </w:r>
@@ -16440,14 +16866,12 @@
         </w:rPr>
         <w:t xml:space="preserve"> se mapean </w:t>
       </w:r>
-      <w:proofErr w:type="gramStart"/>
-      <w:r>
-        <w:rPr>
-          <w:lang w:val="es-ES_tradnl"/>
-        </w:rPr>
-        <w:t>los nombre</w:t>
-      </w:r>
-      <w:proofErr w:type="gramEnd"/>
+      <w:r>
+        <w:rPr>
+          <w:lang w:val="es-ES_tradnl"/>
+        </w:rPr>
+        <w:t>los nombres</w:t>
+      </w:r>
       <w:r>
         <w:rPr>
           <w:lang w:val="es-ES_tradnl"/>
@@ -16515,7 +16939,7 @@
       <w:pPr>
         <w:pStyle w:val="Ttulo3"/>
       </w:pPr>
-      <w:bookmarkStart w:id="60" w:name="_Toc157417023"/>
+      <w:bookmarkStart w:id="60" w:name="_Toc203401705"/>
       <w:bookmarkEnd w:id="58"/>
       <w:r>
         <w:t>Configuraciones generales Integr@</w:t>
@@ -17183,7 +17607,21 @@
         <w:rPr>
           <w:lang w:val="es-ES_tradnl"/>
         </w:rPr>
-        <w:t xml:space="preserve"> o no), XAdES (</w:t>
+        <w:t xml:space="preserve"> o no), </w:t>
+      </w:r>
+      <w:proofErr w:type="spellStart"/>
+      <w:r>
+        <w:rPr>
+          <w:lang w:val="es-ES_tradnl"/>
+        </w:rPr>
+        <w:t>XAdES</w:t>
+      </w:r>
+      <w:proofErr w:type="spellEnd"/>
+      <w:r>
+        <w:rPr>
+          <w:lang w:val="es-ES_tradnl"/>
+        </w:rPr>
+        <w:t xml:space="preserve"> (</w:t>
       </w:r>
       <w:proofErr w:type="spellStart"/>
       <w:r>
@@ -20542,6 +20980,7 @@
           <w:rFonts w:ascii="Courier New" w:hAnsi="Courier New" w:cs="Courier New"/>
           <w:noProof/>
           <w:sz w:val="20"/>
+          <w:lang w:val="en-GB"/>
         </w:rPr>
       </w:pPr>
       <w:r>
@@ -20549,13 +20988,30 @@
           <w:rFonts w:ascii="Courier New" w:hAnsi="Courier New" w:cs="Courier New"/>
           <w:noProof/>
           <w:sz w:val="20"/>
-        </w:rPr>
-        <w:t>XML_AGE_1.9_URL-IDENTIFIER_XML = http://administracionelectronica.gob.es/es/ctt/politicafirma/politica_firma_AGE_v1_9.pdf</w:t>
-      </w:r>
-    </w:p>
-    <w:p/>
-    <w:p>
-      <w:r>
+          <w:lang w:val="en-GB"/>
+        </w:rPr>
+        <w:t xml:space="preserve">XML_AGE_1.9_URL-IDENTIFIER_XML = </w:t>
+      </w:r>
+      <w:r>
+        <w:rPr>
+          <w:rFonts w:ascii="Courier New" w:hAnsi="Courier New" w:cs="Courier New"/>
+          <w:noProof/>
+          <w:sz w:val="20"/>
+          <w:lang w:val="en-GB"/>
+        </w:rPr>
+        <w:t>urn:oid:2.16.724.1.3.1.1.2.1.9</w:t>
+      </w:r>
+    </w:p>
+    <w:p>
+      <w:pPr>
+        <w:rPr>
+          <w:lang w:val="en-GB"/>
+        </w:rPr>
+      </w:pPr>
+    </w:p>
+    <w:p>
+      <w:r>
+        <w:lastRenderedPageBreak/>
         <w:t xml:space="preserve">Si la política de firma se refiere a firmas </w:t>
       </w:r>
       <w:r>
@@ -20971,6 +21427,7 @@
           <w:rFonts w:ascii="Courier New" w:hAnsi="Courier New" w:cs="Courier New"/>
           <w:noProof/>
           <w:sz w:val="20"/>
+          <w:lang w:val="en-GB"/>
         </w:rPr>
       </w:pPr>
       <w:r>
@@ -20978,11 +21435,27 @@
           <w:rFonts w:ascii="Courier New" w:hAnsi="Courier New" w:cs="Courier New"/>
           <w:noProof/>
           <w:sz w:val="20"/>
-        </w:rPr>
-        <w:t>XML_AGE_1.9_URL-HASH_VALUE = 7SxX3erFuH31TvAw9LZ70N7p1vA=</w:t>
-      </w:r>
-    </w:p>
-    <w:p/>
+          <w:lang w:val="en-GB"/>
+        </w:rPr>
+        <w:t xml:space="preserve">XML_AGE_1.9_URL-HASH_VALUE = </w:t>
+      </w:r>
+      <w:r>
+        <w:rPr>
+          <w:rFonts w:ascii="Courier New" w:hAnsi="Courier New" w:cs="Courier New"/>
+          <w:noProof/>
+          <w:sz w:val="20"/>
+          <w:lang w:val="en-GB"/>
+        </w:rPr>
+        <w:t>G7roucf600+f03r/o0bAOQ6WAs0=</w:t>
+      </w:r>
+    </w:p>
+    <w:p>
+      <w:pPr>
+        <w:rPr>
+          <w:lang w:val="en-GB"/>
+        </w:rPr>
+      </w:pPr>
+    </w:p>
     <w:p>
       <w:pPr>
         <w:pStyle w:val="Ttulo6"/>
@@ -22223,14 +22696,12 @@
       <w:r>
         <w:t>Los elementos pueden ser XML o ASN.1. Cada elemento estará separado por coma (,). Para especificar que se debe elegir entre varios se usará el operador lógico OR (|</w:t>
       </w:r>
-      <w:proofErr w:type="gramStart"/>
       <w:r>
         <w:t>).</w:t>
       </w:r>
       <w:r>
-        <w:t>Tendrá</w:t>
-      </w:r>
-      <w:proofErr w:type="gramEnd"/>
+        <w:t xml:space="preserve"> Tendrá</w:t>
+      </w:r>
       <w:r>
         <w:t xml:space="preserve"> el formato </w:t>
       </w:r>
@@ -24905,7 +25376,6 @@
         <w:t xml:space="preserve">ID_POLICY-[ELEMENT_NAME]-NOT_ALLOWED_VALUE </w:t>
       </w:r>
       <w:proofErr w:type="spellStart"/>
-      <w:proofErr w:type="gramStart"/>
       <w:r>
         <w:rPr>
           <w:lang w:val="en-US"/>
@@ -24913,7 +25383,6 @@
         <w:t>donde</w:t>
       </w:r>
       <w:proofErr w:type="spellEnd"/>
-      <w:proofErr w:type="gramEnd"/>
     </w:p>
     <w:p>
       <w:pPr>
@@ -26570,7 +27039,7 @@
       <w:pPr>
         <w:pStyle w:val="Ttulo3"/>
       </w:pPr>
-      <w:bookmarkStart w:id="80" w:name="_Toc157417024"/>
+      <w:bookmarkStart w:id="80" w:name="_Toc203401706"/>
       <w:r>
         <w:t>Configuraciones de acceso a TS@</w:t>
       </w:r>
@@ -28921,7 +29390,7 @@
         <w:pStyle w:val="Ttulo3"/>
       </w:pPr>
       <w:bookmarkStart w:id="82" w:name="_Toc453065738"/>
-      <w:bookmarkStart w:id="83" w:name="_Toc157417025"/>
+      <w:bookmarkStart w:id="83" w:name="_Toc203401707"/>
       <w:r>
         <w:t>Configuraciones de acceso a @firma</w:t>
       </w:r>
@@ -29960,7 +30429,7 @@
         <w:pStyle w:val="Ttulo3"/>
       </w:pPr>
       <w:bookmarkStart w:id="85" w:name="_Toc453065740"/>
-      <w:bookmarkStart w:id="86" w:name="_Toc157417026"/>
+      <w:bookmarkStart w:id="86" w:name="_Toc203401708"/>
       <w:r>
         <w:t>Configuraciones de acceso a eVisor</w:t>
       </w:r>
@@ -31066,7 +31535,7 @@
 </file>
 
 <file path=word/endnotes.xml><?xml version="1.0" encoding="utf-8"?>
-<w:endnotes xmlns:wpc="http://schemas.microsoft.com/office/word/2010/wordprocessingCanvas" xmlns:cx="http://schemas.microsoft.com/office/drawing/2014/chartex" xmlns:cx1="http://schemas.microsoft.com/office/drawing/2015/9/8/chartex" xmlns:cx2="http://schemas.microsoft.com/office/drawing/2015/10/21/chartex" xmlns:cx3="http://schemas.microsoft.com/office/drawing/2016/5/9/chartex" xmlns:cx4="http://schemas.microsoft.com/office/drawing/2016/5/10/chartex" xmlns:cx5="http://schemas.microsoft.com/office/drawing/2016/5/11/chartex" xmlns:cx6="http://schemas.microsoft.com/office/drawing/2016/5/12/chartex" xmlns:cx7="http://schemas.microsoft.com/office/drawing/2016/5/13/chartex" xmlns:cx8="http://schemas.microsoft.com/office/drawing/2016/5/14/chartex" xmlns:mc="http://schemas.openxmlformats.org/markup-compatibility/2006" xmlns:aink="http://schemas.microsoft.com/office/drawing/2016/ink" xmlns:am3d="http://schemas.microsoft.com/office/drawing/2017/model3d" xmlns:o="urn:schemas-microsoft-com:office:office" xmlns:oel="http://schemas.microsoft.com/office/2019/extlst" xmlns:r="http://schemas.openxmlformats.org/officeDocument/2006/relationships" xmlns:m="http://schemas.openxmlformats.org/officeDocument/2006/math" xmlns:v="urn:schemas-microsoft-com:vml" xmlns:wp14="http://schemas.microsoft.com/office/word/2010/wordprocessingDrawing" xmlns:wp="http://schemas.openxmlformats.org/drawingml/2006/wordprocessingDrawing" xmlns:w10="urn:schemas-microsoft-com:office:word" xmlns:w="http://schemas.openxmlformats.org/wordprocessingml/2006/main" xmlns:w14="http://schemas.microsoft.com/office/word/2010/wordml" xmlns:w15="http://schemas.microsoft.com/office/word/2012/wordml" xmlns:w16cex="http://schemas.microsoft.com/office/word/2018/wordml/cex" xmlns:w16cid="http://schemas.microsoft.com/office/word/2016/wordml/cid" xmlns:w16="http://schemas.microsoft.com/office/word/2018/wordml" xmlns:w16sdtdh="http://schemas.microsoft.com/office/word/2020/wordml/sdtdatahash" xmlns:w16se="http://schemas.microsoft.com/office/word/2015/wordml/symex" xmlns:wpg="http://schemas.microsoft.com/office/word/2010/wordprocessingGroup" xmlns:wpi="http://schemas.microsoft.com/office/word/2010/wordprocessingInk" xmlns:wne="http://schemas.microsoft.com/office/word/2006/wordml" xmlns:wps="http://schemas.microsoft.com/office/word/2010/wordprocessingShape" mc:Ignorable="w14 w15 w16se w16cid w16 w16cex w16sdtdh wp14">
+<w:endnotes xmlns:wpc="http://schemas.microsoft.com/office/word/2010/wordprocessingCanvas" xmlns:cx="http://schemas.microsoft.com/office/drawing/2014/chartex" xmlns:cx1="http://schemas.microsoft.com/office/drawing/2015/9/8/chartex" xmlns:cx2="http://schemas.microsoft.com/office/drawing/2015/10/21/chartex" xmlns:cx3="http://schemas.microsoft.com/office/drawing/2016/5/9/chartex" xmlns:cx4="http://schemas.microsoft.com/office/drawing/2016/5/10/chartex" xmlns:cx5="http://schemas.microsoft.com/office/drawing/2016/5/11/chartex" xmlns:cx6="http://schemas.microsoft.com/office/drawing/2016/5/12/chartex" xmlns:cx7="http://schemas.microsoft.com/office/drawing/2016/5/13/chartex" xmlns:cx8="http://schemas.microsoft.com/office/drawing/2016/5/14/chartex" xmlns:mc="http://schemas.openxmlformats.org/markup-compatibility/2006" xmlns:aink="http://schemas.microsoft.com/office/drawing/2016/ink" xmlns:am3d="http://schemas.microsoft.com/office/drawing/2017/model3d" xmlns:o="urn:schemas-microsoft-com:office:office" xmlns:oel="http://schemas.microsoft.com/office/2019/extlst" xmlns:r="http://schemas.openxmlformats.org/officeDocument/2006/relationships" xmlns:m="http://schemas.openxmlformats.org/officeDocument/2006/math" xmlns:v="urn:schemas-microsoft-com:vml" xmlns:wp14="http://schemas.microsoft.com/office/word/2010/wordprocessingDrawing" xmlns:wp="http://schemas.openxmlformats.org/drawingml/2006/wordprocessingDrawing" xmlns:w10="urn:schemas-microsoft-com:office:word" xmlns:w="http://schemas.openxmlformats.org/wordprocessingml/2006/main" xmlns:w14="http://schemas.microsoft.com/office/word/2010/wordml" xmlns:w15="http://schemas.microsoft.com/office/word/2012/wordml" xmlns:w16cex="http://schemas.microsoft.com/office/word/2018/wordml/cex" xmlns:w16cid="http://schemas.microsoft.com/office/word/2016/wordml/cid" xmlns:w16="http://schemas.microsoft.com/office/word/2018/wordml" xmlns:w16du="http://schemas.microsoft.com/office/word/2023/wordml/word16du" xmlns:w16sdtdh="http://schemas.microsoft.com/office/word/2020/wordml/sdtdatahash" xmlns:w16sdtfl="http://schemas.microsoft.com/office/word/2024/wordml/sdtformatlock" xmlns:w16se="http://schemas.microsoft.com/office/word/2015/wordml/symex" xmlns:wpg="http://schemas.microsoft.com/office/word/2010/wordprocessingGroup" xmlns:wpi="http://schemas.microsoft.com/office/word/2010/wordprocessingInk" xmlns:wne="http://schemas.microsoft.com/office/word/2006/wordml" xmlns:wps="http://schemas.microsoft.com/office/word/2010/wordprocessingShape" mc:Ignorable="w14 w15 w16se w16cid w16 w16cex w16sdtdh w16sdtfl w16du wp14">
   <w:endnote w:type="separator" w:id="-1">
     <w:p>
       <w:r>
@@ -31085,7 +31554,7 @@
 </file>
 
 <file path=word/footer1.xml><?xml version="1.0" encoding="utf-8"?>
-<w:ftr xmlns:wpc="http://schemas.microsoft.com/office/word/2010/wordprocessingCanvas" xmlns:cx="http://schemas.microsoft.com/office/drawing/2014/chartex" xmlns:cx1="http://schemas.microsoft.com/office/drawing/2015/9/8/chartex" xmlns:cx2="http://schemas.microsoft.com/office/drawing/2015/10/21/chartex" xmlns:cx3="http://schemas.microsoft.com/office/drawing/2016/5/9/chartex" xmlns:cx4="http://schemas.microsoft.com/office/drawing/2016/5/10/chartex" xmlns:cx5="http://schemas.microsoft.com/office/drawing/2016/5/11/chartex" xmlns:cx6="http://schemas.microsoft.com/office/drawing/2016/5/12/chartex" xmlns:cx7="http://schemas.microsoft.com/office/drawing/2016/5/13/chartex" xmlns:cx8="http://schemas.microsoft.com/office/drawing/2016/5/14/chartex" xmlns:mc="http://schemas.openxmlformats.org/markup-compatibility/2006" xmlns:aink="http://schemas.microsoft.com/office/drawing/2016/ink" xmlns:am3d="http://schemas.microsoft.com/office/drawing/2017/model3d" xmlns:o="urn:schemas-microsoft-com:office:office" xmlns:oel="http://schemas.microsoft.com/office/2019/extlst" xmlns:r="http://schemas.openxmlformats.org/officeDocument/2006/relationships" xmlns:m="http://schemas.openxmlformats.org/officeDocument/2006/math" xmlns:v="urn:schemas-microsoft-com:vml" xmlns:wp14="http://schemas.microsoft.com/office/word/2010/wordprocessingDrawing" xmlns:wp="http://schemas.openxmlformats.org/drawingml/2006/wordprocessingDrawing" xmlns:w10="urn:schemas-microsoft-com:office:word" xmlns:w="http://schemas.openxmlformats.org/wordprocessingml/2006/main" xmlns:w14="http://schemas.microsoft.com/office/word/2010/wordml" xmlns:w15="http://schemas.microsoft.com/office/word/2012/wordml" xmlns:w16cex="http://schemas.microsoft.com/office/word/2018/wordml/cex" xmlns:w16cid="http://schemas.microsoft.com/office/word/2016/wordml/cid" xmlns:w16="http://schemas.microsoft.com/office/word/2018/wordml" xmlns:w16sdtdh="http://schemas.microsoft.com/office/word/2020/wordml/sdtdatahash" xmlns:w16se="http://schemas.microsoft.com/office/word/2015/wordml/symex" xmlns:wpg="http://schemas.microsoft.com/office/word/2010/wordprocessingGroup" xmlns:wpi="http://schemas.microsoft.com/office/word/2010/wordprocessingInk" xmlns:wne="http://schemas.microsoft.com/office/word/2006/wordml" xmlns:wps="http://schemas.microsoft.com/office/word/2010/wordprocessingShape" mc:Ignorable="w14 w15 w16se w16cid w16 w16cex w16sdtdh wp14">
+<w:ftr xmlns:wpc="http://schemas.microsoft.com/office/word/2010/wordprocessingCanvas" xmlns:cx="http://schemas.microsoft.com/office/drawing/2014/chartex" xmlns:cx1="http://schemas.microsoft.com/office/drawing/2015/9/8/chartex" xmlns:cx2="http://schemas.microsoft.com/office/drawing/2015/10/21/chartex" xmlns:cx3="http://schemas.microsoft.com/office/drawing/2016/5/9/chartex" xmlns:cx4="http://schemas.microsoft.com/office/drawing/2016/5/10/chartex" xmlns:cx5="http://schemas.microsoft.com/office/drawing/2016/5/11/chartex" xmlns:cx6="http://schemas.microsoft.com/office/drawing/2016/5/12/chartex" xmlns:cx7="http://schemas.microsoft.com/office/drawing/2016/5/13/chartex" xmlns:cx8="http://schemas.microsoft.com/office/drawing/2016/5/14/chartex" xmlns:mc="http://schemas.openxmlformats.org/markup-compatibility/2006" xmlns:aink="http://schemas.microsoft.com/office/drawing/2016/ink" xmlns:am3d="http://schemas.microsoft.com/office/drawing/2017/model3d" xmlns:o="urn:schemas-microsoft-com:office:office" xmlns:oel="http://schemas.microsoft.com/office/2019/extlst" xmlns:r="http://schemas.openxmlformats.org/officeDocument/2006/relationships" xmlns:m="http://schemas.openxmlformats.org/officeDocument/2006/math" xmlns:v="urn:schemas-microsoft-com:vml" xmlns:wp14="http://schemas.microsoft.com/office/word/2010/wordprocessingDrawing" xmlns:wp="http://schemas.openxmlformats.org/drawingml/2006/wordprocessingDrawing" xmlns:w10="urn:schemas-microsoft-com:office:word" xmlns:w="http://schemas.openxmlformats.org/wordprocessingml/2006/main" xmlns:w14="http://schemas.microsoft.com/office/word/2010/wordml" xmlns:w15="http://schemas.microsoft.com/office/word/2012/wordml" xmlns:w16cex="http://schemas.microsoft.com/office/word/2018/wordml/cex" xmlns:w16cid="http://schemas.microsoft.com/office/word/2016/wordml/cid" xmlns:w16="http://schemas.microsoft.com/office/word/2018/wordml" xmlns:w16du="http://schemas.microsoft.com/office/word/2023/wordml/word16du" xmlns:w16sdtdh="http://schemas.microsoft.com/office/word/2020/wordml/sdtdatahash" xmlns:w16sdtfl="http://schemas.microsoft.com/office/word/2024/wordml/sdtformatlock" xmlns:w16se="http://schemas.microsoft.com/office/word/2015/wordml/symex" xmlns:wpg="http://schemas.microsoft.com/office/word/2010/wordprocessingGroup" xmlns:wpi="http://schemas.microsoft.com/office/word/2010/wordprocessingInk" xmlns:wne="http://schemas.microsoft.com/office/word/2006/wordml" xmlns:wps="http://schemas.microsoft.com/office/word/2010/wordprocessingShape" mc:Ignorable="w14 w15 w16se w16cid w16 w16cex w16sdtdh w16sdtfl w16du wp14">
   <w:p>
     <w:pPr>
       <w:pStyle w:val="Piedepgina"/>
@@ -31345,7 +31814,7 @@
 </file>
 
 <file path=word/footnotes.xml><?xml version="1.0" encoding="utf-8"?>
-<w:footnotes xmlns:wpc="http://schemas.microsoft.com/office/word/2010/wordprocessingCanvas" xmlns:cx="http://schemas.microsoft.com/office/drawing/2014/chartex" xmlns:cx1="http://schemas.microsoft.com/office/drawing/2015/9/8/chartex" xmlns:cx2="http://schemas.microsoft.com/office/drawing/2015/10/21/chartex" xmlns:cx3="http://schemas.microsoft.com/office/drawing/2016/5/9/chartex" xmlns:cx4="http://schemas.microsoft.com/office/drawing/2016/5/10/chartex" xmlns:cx5="http://schemas.microsoft.com/office/drawing/2016/5/11/chartex" xmlns:cx6="http://schemas.microsoft.com/office/drawing/2016/5/12/chartex" xmlns:cx7="http://schemas.microsoft.com/office/drawing/2016/5/13/chartex" xmlns:cx8="http://schemas.microsoft.com/office/drawing/2016/5/14/chartex" xmlns:mc="http://schemas.openxmlformats.org/markup-compatibility/2006" xmlns:aink="http://schemas.microsoft.com/office/drawing/2016/ink" xmlns:am3d="http://schemas.microsoft.com/office/drawing/2017/model3d" xmlns:o="urn:schemas-microsoft-com:office:office" xmlns:oel="http://schemas.microsoft.com/office/2019/extlst" xmlns:r="http://schemas.openxmlformats.org/officeDocument/2006/relationships" xmlns:m="http://schemas.openxmlformats.org/officeDocument/2006/math" xmlns:v="urn:schemas-microsoft-com:vml" xmlns:wp14="http://schemas.microsoft.com/office/word/2010/wordprocessingDrawing" xmlns:wp="http://schemas.openxmlformats.org/drawingml/2006/wordprocessingDrawing" xmlns:w10="urn:schemas-microsoft-com:office:word" xmlns:w="http://schemas.openxmlformats.org/wordprocessingml/2006/main" xmlns:w14="http://schemas.microsoft.com/office/word/2010/wordml" xmlns:w15="http://schemas.microsoft.com/office/word/2012/wordml" xmlns:w16cex="http://schemas.microsoft.com/office/word/2018/wordml/cex" xmlns:w16cid="http://schemas.microsoft.com/office/word/2016/wordml/cid" xmlns:w16="http://schemas.microsoft.com/office/word/2018/wordml" xmlns:w16sdtdh="http://schemas.microsoft.com/office/word/2020/wordml/sdtdatahash" xmlns:w16se="http://schemas.microsoft.com/office/word/2015/wordml/symex" xmlns:wpg="http://schemas.microsoft.com/office/word/2010/wordprocessingGroup" xmlns:wpi="http://schemas.microsoft.com/office/word/2010/wordprocessingInk" xmlns:wne="http://schemas.microsoft.com/office/word/2006/wordml" xmlns:wps="http://schemas.microsoft.com/office/word/2010/wordprocessingShape" mc:Ignorable="w14 w15 w16se w16cid w16 w16cex w16sdtdh wp14">
+<w:footnotes xmlns:wpc="http://schemas.microsoft.com/office/word/2010/wordprocessingCanvas" xmlns:cx="http://schemas.microsoft.com/office/drawing/2014/chartex" xmlns:cx1="http://schemas.microsoft.com/office/drawing/2015/9/8/chartex" xmlns:cx2="http://schemas.microsoft.com/office/drawing/2015/10/21/chartex" xmlns:cx3="http://schemas.microsoft.com/office/drawing/2016/5/9/chartex" xmlns:cx4="http://schemas.microsoft.com/office/drawing/2016/5/10/chartex" xmlns:cx5="http://schemas.microsoft.com/office/drawing/2016/5/11/chartex" xmlns:cx6="http://schemas.microsoft.com/office/drawing/2016/5/12/chartex" xmlns:cx7="http://schemas.microsoft.com/office/drawing/2016/5/13/chartex" xmlns:cx8="http://schemas.microsoft.com/office/drawing/2016/5/14/chartex" xmlns:mc="http://schemas.openxmlformats.org/markup-compatibility/2006" xmlns:aink="http://schemas.microsoft.com/office/drawing/2016/ink" xmlns:am3d="http://schemas.microsoft.com/office/drawing/2017/model3d" xmlns:o="urn:schemas-microsoft-com:office:office" xmlns:oel="http://schemas.microsoft.com/office/2019/extlst" xmlns:r="http://schemas.openxmlformats.org/officeDocument/2006/relationships" xmlns:m="http://schemas.openxmlformats.org/officeDocument/2006/math" xmlns:v="urn:schemas-microsoft-com:vml" xmlns:wp14="http://schemas.microsoft.com/office/word/2010/wordprocessingDrawing" xmlns:wp="http://schemas.openxmlformats.org/drawingml/2006/wordprocessingDrawing" xmlns:w10="urn:schemas-microsoft-com:office:word" xmlns:w="http://schemas.openxmlformats.org/wordprocessingml/2006/main" xmlns:w14="http://schemas.microsoft.com/office/word/2010/wordml" xmlns:w15="http://schemas.microsoft.com/office/word/2012/wordml" xmlns:w16cex="http://schemas.microsoft.com/office/word/2018/wordml/cex" xmlns:w16cid="http://schemas.microsoft.com/office/word/2016/wordml/cid" xmlns:w16="http://schemas.microsoft.com/office/word/2018/wordml" xmlns:w16du="http://schemas.microsoft.com/office/word/2023/wordml/word16du" xmlns:w16sdtdh="http://schemas.microsoft.com/office/word/2020/wordml/sdtdatahash" xmlns:w16sdtfl="http://schemas.microsoft.com/office/word/2024/wordml/sdtformatlock" xmlns:w16se="http://schemas.microsoft.com/office/word/2015/wordml/symex" xmlns:wpg="http://schemas.microsoft.com/office/word/2010/wordprocessingGroup" xmlns:wpi="http://schemas.microsoft.com/office/word/2010/wordprocessingInk" xmlns:wne="http://schemas.microsoft.com/office/word/2006/wordml" xmlns:wps="http://schemas.microsoft.com/office/word/2010/wordprocessingShape" mc:Ignorable="w14 w15 w16se w16cid w16 w16cex w16sdtdh w16sdtfl w16du wp14">
   <w:footnote w:type="separator" w:id="-1">
     <w:p>
       <w:r>
@@ -31364,7 +31833,7 @@
 </file>
 
 <file path=word/header1.xml><?xml version="1.0" encoding="utf-8"?>
-<w:hdr xmlns:wpc="http://schemas.microsoft.com/office/word/2010/wordprocessingCanvas" xmlns:cx="http://schemas.microsoft.com/office/drawing/2014/chartex" xmlns:cx1="http://schemas.microsoft.com/office/drawing/2015/9/8/chartex" xmlns:cx2="http://schemas.microsoft.com/office/drawing/2015/10/21/chartex" xmlns:cx3="http://schemas.microsoft.com/office/drawing/2016/5/9/chartex" xmlns:cx4="http://schemas.microsoft.com/office/drawing/2016/5/10/chartex" xmlns:cx5="http://schemas.microsoft.com/office/drawing/2016/5/11/chartex" xmlns:cx6="http://schemas.microsoft.com/office/drawing/2016/5/12/chartex" xmlns:cx7="http://schemas.microsoft.com/office/drawing/2016/5/13/chartex" xmlns:cx8="http://schemas.microsoft.com/office/drawing/2016/5/14/chartex" xmlns:mc="http://schemas.openxmlformats.org/markup-compatibility/2006" xmlns:aink="http://schemas.microsoft.com/office/drawing/2016/ink" xmlns:am3d="http://schemas.microsoft.com/office/drawing/2017/model3d" xmlns:o="urn:schemas-microsoft-com:office:office" xmlns:oel="http://schemas.microsoft.com/office/2019/extlst" xmlns:r="http://schemas.openxmlformats.org/officeDocument/2006/relationships" xmlns:m="http://schemas.openxmlformats.org/officeDocument/2006/math" xmlns:v="urn:schemas-microsoft-com:vml" xmlns:wp14="http://schemas.microsoft.com/office/word/2010/wordprocessingDrawing" xmlns:wp="http://schemas.openxmlformats.org/drawingml/2006/wordprocessingDrawing" xmlns:w10="urn:schemas-microsoft-com:office:word" xmlns:w="http://schemas.openxmlformats.org/wordprocessingml/2006/main" xmlns:w14="http://schemas.microsoft.com/office/word/2010/wordml" xmlns:w15="http://schemas.microsoft.com/office/word/2012/wordml" xmlns:w16cex="http://schemas.microsoft.com/office/word/2018/wordml/cex" xmlns:w16cid="http://schemas.microsoft.com/office/word/2016/wordml/cid" xmlns:w16="http://schemas.microsoft.com/office/word/2018/wordml" xmlns:w16sdtdh="http://schemas.microsoft.com/office/word/2020/wordml/sdtdatahash" xmlns:w16se="http://schemas.microsoft.com/office/word/2015/wordml/symex" xmlns:wpg="http://schemas.microsoft.com/office/word/2010/wordprocessingGroup" xmlns:wpi="http://schemas.microsoft.com/office/word/2010/wordprocessingInk" xmlns:wne="http://schemas.microsoft.com/office/word/2006/wordml" xmlns:wps="http://schemas.microsoft.com/office/word/2010/wordprocessingShape" mc:Ignorable="w14 w15 w16se w16cid w16 w16cex w16sdtdh wp14">
+<w:hdr xmlns:wpc="http://schemas.microsoft.com/office/word/2010/wordprocessingCanvas" xmlns:cx="http://schemas.microsoft.com/office/drawing/2014/chartex" xmlns:cx1="http://schemas.microsoft.com/office/drawing/2015/9/8/chartex" xmlns:cx2="http://schemas.microsoft.com/office/drawing/2015/10/21/chartex" xmlns:cx3="http://schemas.microsoft.com/office/drawing/2016/5/9/chartex" xmlns:cx4="http://schemas.microsoft.com/office/drawing/2016/5/10/chartex" xmlns:cx5="http://schemas.microsoft.com/office/drawing/2016/5/11/chartex" xmlns:cx6="http://schemas.microsoft.com/office/drawing/2016/5/12/chartex" xmlns:cx7="http://schemas.microsoft.com/office/drawing/2016/5/13/chartex" xmlns:cx8="http://schemas.microsoft.com/office/drawing/2016/5/14/chartex" xmlns:mc="http://schemas.openxmlformats.org/markup-compatibility/2006" xmlns:aink="http://schemas.microsoft.com/office/drawing/2016/ink" xmlns:am3d="http://schemas.microsoft.com/office/drawing/2017/model3d" xmlns:o="urn:schemas-microsoft-com:office:office" xmlns:oel="http://schemas.microsoft.com/office/2019/extlst" xmlns:r="http://schemas.openxmlformats.org/officeDocument/2006/relationships" xmlns:m="http://schemas.openxmlformats.org/officeDocument/2006/math" xmlns:v="urn:schemas-microsoft-com:vml" xmlns:wp14="http://schemas.microsoft.com/office/word/2010/wordprocessingDrawing" xmlns:wp="http://schemas.openxmlformats.org/drawingml/2006/wordprocessingDrawing" xmlns:w10="urn:schemas-microsoft-com:office:word" xmlns:w="http://schemas.openxmlformats.org/wordprocessingml/2006/main" xmlns:w14="http://schemas.microsoft.com/office/word/2010/wordml" xmlns:w15="http://schemas.microsoft.com/office/word/2012/wordml" xmlns:w16cex="http://schemas.microsoft.com/office/word/2018/wordml/cex" xmlns:w16cid="http://schemas.microsoft.com/office/word/2016/wordml/cid" xmlns:w16="http://schemas.microsoft.com/office/word/2018/wordml" xmlns:w16du="http://schemas.microsoft.com/office/word/2023/wordml/word16du" xmlns:w16sdtdh="http://schemas.microsoft.com/office/word/2020/wordml/sdtdatahash" xmlns:w16sdtfl="http://schemas.microsoft.com/office/word/2024/wordml/sdtformatlock" xmlns:w16se="http://schemas.microsoft.com/office/word/2015/wordml/symex" xmlns:wpg="http://schemas.microsoft.com/office/word/2010/wordprocessingGroup" xmlns:wpi="http://schemas.microsoft.com/office/word/2010/wordprocessingInk" xmlns:wne="http://schemas.microsoft.com/office/word/2006/wordml" xmlns:wps="http://schemas.microsoft.com/office/word/2010/wordprocessingShape" mc:Ignorable="w14 w15 w16se w16cid w16 w16cex w16sdtdh w16sdtfl w16du wp14">
   <w:p>
     <w:pPr>
       <w:pStyle w:val="Encabezado"/>
@@ -31509,7 +31978,7 @@
       <w:rPr>
         <w:rFonts w:cs="Calibri"/>
       </w:rPr>
-      <w:t>011</w:t>
+      <w:t>013</w:t>
     </w:r>
     <w:r>
       <w:rPr>
@@ -31558,7 +32027,7 @@
 </file>
 
 <file path=word/numbering.xml><?xml version="1.0" encoding="utf-8"?>
-<w:numbering xmlns:wpc="http://schemas.microsoft.com/office/word/2010/wordprocessingCanvas" xmlns:cx="http://schemas.microsoft.com/office/drawing/2014/chartex" xmlns:cx1="http://schemas.microsoft.com/office/drawing/2015/9/8/chartex" xmlns:cx2="http://schemas.microsoft.com/office/drawing/2015/10/21/chartex" xmlns:cx3="http://schemas.microsoft.com/office/drawing/2016/5/9/chartex" xmlns:cx4="http://schemas.microsoft.com/office/drawing/2016/5/10/chartex" xmlns:cx5="http://schemas.microsoft.com/office/drawing/2016/5/11/chartex" xmlns:cx6="http://schemas.microsoft.com/office/drawing/2016/5/12/chartex" xmlns:cx7="http://schemas.microsoft.com/office/drawing/2016/5/13/chartex" xmlns:cx8="http://schemas.microsoft.com/office/drawing/2016/5/14/chartex" xmlns:mc="http://schemas.openxmlformats.org/markup-compatibility/2006" xmlns:aink="http://schemas.microsoft.com/office/drawing/2016/ink" xmlns:am3d="http://schemas.microsoft.com/office/drawing/2017/model3d" xmlns:o="urn:schemas-microsoft-com:office:office" xmlns:oel="http://schemas.microsoft.com/office/2019/extlst" xmlns:r="http://schemas.openxmlformats.org/officeDocument/2006/relationships" xmlns:m="http://schemas.openxmlformats.org/officeDocument/2006/math" xmlns:v="urn:schemas-microsoft-com:vml" xmlns:wp14="http://schemas.microsoft.com/office/word/2010/wordprocessingDrawing" xmlns:wp="http://schemas.openxmlformats.org/drawingml/2006/wordprocessingDrawing" xmlns:w10="urn:schemas-microsoft-com:office:word" xmlns:w="http://schemas.openxmlformats.org/wordprocessingml/2006/main" xmlns:w14="http://schemas.microsoft.com/office/word/2010/wordml" xmlns:w15="http://schemas.microsoft.com/office/word/2012/wordml" xmlns:w16cex="http://schemas.microsoft.com/office/word/2018/wordml/cex" xmlns:w16cid="http://schemas.microsoft.com/office/word/2016/wordml/cid" xmlns:w16="http://schemas.microsoft.com/office/word/2018/wordml" xmlns:w16sdtdh="http://schemas.microsoft.com/office/word/2020/wordml/sdtdatahash" xmlns:w16se="http://schemas.microsoft.com/office/word/2015/wordml/symex" xmlns:wpg="http://schemas.microsoft.com/office/word/2010/wordprocessingGroup" xmlns:wpi="http://schemas.microsoft.com/office/word/2010/wordprocessingInk" xmlns:wne="http://schemas.microsoft.com/office/word/2006/wordml" xmlns:wps="http://schemas.microsoft.com/office/word/2010/wordprocessingShape" mc:Ignorable="w14 w15 w16se w16cid w16 w16cex w16sdtdh wp14">
+<w:numbering xmlns:wpc="http://schemas.microsoft.com/office/word/2010/wordprocessingCanvas" xmlns:cx="http://schemas.microsoft.com/office/drawing/2014/chartex" xmlns:cx1="http://schemas.microsoft.com/office/drawing/2015/9/8/chartex" xmlns:cx2="http://schemas.microsoft.com/office/drawing/2015/10/21/chartex" xmlns:cx3="http://schemas.microsoft.com/office/drawing/2016/5/9/chartex" xmlns:cx4="http://schemas.microsoft.com/office/drawing/2016/5/10/chartex" xmlns:cx5="http://schemas.microsoft.com/office/drawing/2016/5/11/chartex" xmlns:cx6="http://schemas.microsoft.com/office/drawing/2016/5/12/chartex" xmlns:cx7="http://schemas.microsoft.com/office/drawing/2016/5/13/chartex" xmlns:cx8="http://schemas.microsoft.com/office/drawing/2016/5/14/chartex" xmlns:mc="http://schemas.openxmlformats.org/markup-compatibility/2006" xmlns:aink="http://schemas.microsoft.com/office/drawing/2016/ink" xmlns:am3d="http://schemas.microsoft.com/office/drawing/2017/model3d" xmlns:o="urn:schemas-microsoft-com:office:office" xmlns:oel="http://schemas.microsoft.com/office/2019/extlst" xmlns:r="http://schemas.openxmlformats.org/officeDocument/2006/relationships" xmlns:m="http://schemas.openxmlformats.org/officeDocument/2006/math" xmlns:v="urn:schemas-microsoft-com:vml" xmlns:wp14="http://schemas.microsoft.com/office/word/2010/wordprocessingDrawing" xmlns:wp="http://schemas.openxmlformats.org/drawingml/2006/wordprocessingDrawing" xmlns:w10="urn:schemas-microsoft-com:office:word" xmlns:w="http://schemas.openxmlformats.org/wordprocessingml/2006/main" xmlns:w14="http://schemas.microsoft.com/office/word/2010/wordml" xmlns:w15="http://schemas.microsoft.com/office/word/2012/wordml" xmlns:w16cex="http://schemas.microsoft.com/office/word/2018/wordml/cex" xmlns:w16cid="http://schemas.microsoft.com/office/word/2016/wordml/cid" xmlns:w16="http://schemas.microsoft.com/office/word/2018/wordml" xmlns:w16du="http://schemas.microsoft.com/office/word/2023/wordml/word16du" xmlns:w16sdtdh="http://schemas.microsoft.com/office/word/2020/wordml/sdtdatahash" xmlns:w16sdtfl="http://schemas.microsoft.com/office/word/2024/wordml/sdtformatlock" xmlns:w16se="http://schemas.microsoft.com/office/word/2015/wordml/symex" xmlns:wpg="http://schemas.microsoft.com/office/word/2010/wordprocessingGroup" xmlns:wpi="http://schemas.microsoft.com/office/word/2010/wordprocessingInk" xmlns:wne="http://schemas.microsoft.com/office/word/2006/wordml" xmlns:wps="http://schemas.microsoft.com/office/word/2010/wordprocessingShape" mc:Ignorable="w14 w15 w16se w16cid w16 w16cex w16sdtdh w16sdtfl w16du wp14">
   <w:abstractNum w:abstractNumId="0" w15:restartNumberingAfterBreak="0">
     <w:nsid w:val="FFFFFF7C"/>
     <w:multiLevelType w:val="singleLevel"/>
@@ -34063,7 +34532,7 @@
 </file>
 
 <file path=word/styles.xml><?xml version="1.0" encoding="utf-8"?>
-<w:styles xmlns:mc="http://schemas.openxmlformats.org/markup-compatibility/2006" xmlns:r="http://schemas.openxmlformats.org/officeDocument/2006/relationships" xmlns:w="http://schemas.openxmlformats.org/wordprocessingml/2006/main" xmlns:w14="http://schemas.microsoft.com/office/word/2010/wordml" xmlns:w15="http://schemas.microsoft.com/office/word/2012/wordml" xmlns:w16cex="http://schemas.microsoft.com/office/word/2018/wordml/cex" xmlns:w16cid="http://schemas.microsoft.com/office/word/2016/wordml/cid" xmlns:w16="http://schemas.microsoft.com/office/word/2018/wordml" xmlns:w16sdtdh="http://schemas.microsoft.com/office/word/2020/wordml/sdtdatahash" xmlns:w16se="http://schemas.microsoft.com/office/word/2015/wordml/symex" mc:Ignorable="w14 w15 w16se w16cid w16 w16cex w16sdtdh">
+<w:styles xmlns:mc="http://schemas.openxmlformats.org/markup-compatibility/2006" xmlns:r="http://schemas.openxmlformats.org/officeDocument/2006/relationships" xmlns:w="http://schemas.openxmlformats.org/wordprocessingml/2006/main" xmlns:w14="http://schemas.microsoft.com/office/word/2010/wordml" xmlns:w15="http://schemas.microsoft.com/office/word/2012/wordml" xmlns:w16cex="http://schemas.microsoft.com/office/word/2018/wordml/cex" xmlns:w16cid="http://schemas.microsoft.com/office/word/2016/wordml/cid" xmlns:w16="http://schemas.microsoft.com/office/word/2018/wordml" xmlns:w16du="http://schemas.microsoft.com/office/word/2023/wordml/word16du" xmlns:w16sdtdh="http://schemas.microsoft.com/office/word/2020/wordml/sdtdatahash" xmlns:w16sdtfl="http://schemas.microsoft.com/office/word/2024/wordml/sdtformatlock" xmlns:w16se="http://schemas.microsoft.com/office/word/2015/wordml/symex" mc:Ignorable="w14 w15 w16se w16cid w16 w16cex w16sdtdh w16sdtfl w16du">
   <w:docDefaults>
     <w:rPrDefault>
       <w:rPr>
@@ -37205,6 +37674,21 @@
       <w:ind w:left="708"/>
     </w:pPr>
   </w:style>
+  <w:style w:type="paragraph" w:customStyle="1" w:styleId="Default">
+    <w:name w:val="Default"/>
+    <w:rsid w:val="001351BF"/>
+    <w:pPr>
+      <w:autoSpaceDE w:val="0"/>
+      <w:autoSpaceDN w:val="0"/>
+      <w:adjustRightInd w:val="0"/>
+    </w:pPr>
+    <w:rPr>
+      <w:rFonts w:ascii="Calibri" w:hAnsi="Calibri" w:cs="Calibri"/>
+      <w:color w:val="000000"/>
+      <w:sz w:val="24"/>
+      <w:szCs w:val="24"/>
+    </w:rPr>
+  </w:style>
 </w:styles>
 </file>
 
@@ -37504,8 +37988,21 @@
 </file>
 
 <file path=customXml/item1.xml><?xml version="1.0" encoding="utf-8"?>
-<ct:contentTypeSchema xmlns:ct="http://schemas.microsoft.com/office/2006/metadata/contentType" xmlns:ma="http://schemas.microsoft.com/office/2006/metadata/properties/metaAttributes" ct:_="" ma:_="" ma:contentTypeName="Document" ma:contentTypeID="0x010100F37872BBB1B48948A69B496DD8700896" ma:contentTypeVersion="30" ma:contentTypeDescription="Create a new document." ma:contentTypeScope="" ma:versionID="db6ec5eae62717a2112663bfc8d11fc5">
-  <xsd:schema xmlns:xsd="http://www.w3.org/2001/XMLSchema" xmlns:xs="http://www.w3.org/2001/XMLSchema" xmlns:p="http://schemas.microsoft.com/office/2006/metadata/properties" xmlns:ns2="e3c6f3b3-f88f-4e57-8294-d53de8f54b2b" xmlns:ns3="0e9fbc54-175b-41a1-a915-0ab6c7e45301" xmlns:ns4="30c688ba-d7e6-407b-8c35-f2a020af6bce" targetNamespace="http://schemas.microsoft.com/office/2006/metadata/properties" ma:root="true" ma:fieldsID="b607cbe47cf360e8877db2581acfff36" ns2:_="" ns3:_="" ns4:_="">
+<p:properties xmlns:p="http://schemas.microsoft.com/office/2006/metadata/properties" xmlns:xsi="http://www.w3.org/2001/XMLSchema-instance" xmlns:pc="http://schemas.microsoft.com/office/infopath/2007/PartnerControls">
+  <documentManagement>
+    <Location xmlns="e3c6f3b3-f88f-4e57-8294-d53de8f54b2b" xsi:nil="true"/>
+    <TaxCatchAll xmlns="30c688ba-d7e6-407b-8c35-f2a020af6bce" xsi:nil="true"/>
+    <Comentarios xmlns="e3c6f3b3-f88f-4e57-8294-d53de8f54b2b" xsi:nil="true"/>
+    <lcf76f155ced4ddcb4097134ff3c332f xmlns="e3c6f3b3-f88f-4e57-8294-d53de8f54b2b">
+      <Terms xmlns="http://schemas.microsoft.com/office/infopath/2007/PartnerControls"/>
+    </lcf76f155ced4ddcb4097134ff3c332f>
+  </documentManagement>
+</p:properties>
+</file>
+
+<file path=customXml/item2.xml><?xml version="1.0" encoding="utf-8"?>
+<ct:contentTypeSchema xmlns:ct="http://schemas.microsoft.com/office/2006/metadata/contentType" xmlns:ma="http://schemas.microsoft.com/office/2006/metadata/properties/metaAttributes" ct:_="" ma:_="" ma:contentTypeName="Documento" ma:contentTypeID="0x010100F37872BBB1B48948A69B496DD8700896" ma:contentTypeVersion="30" ma:contentTypeDescription="Crear nuevo documento." ma:contentTypeScope="" ma:versionID="48bd2f4f5b966e9aa5e64b228786f9db">
+  <xsd:schema xmlns:xsd="http://www.w3.org/2001/XMLSchema" xmlns:xs="http://www.w3.org/2001/XMLSchema" xmlns:p="http://schemas.microsoft.com/office/2006/metadata/properties" xmlns:ns2="e3c6f3b3-f88f-4e57-8294-d53de8f54b2b" xmlns:ns3="0e9fbc54-175b-41a1-a915-0ab6c7e45301" xmlns:ns4="30c688ba-d7e6-407b-8c35-f2a020af6bce" targetNamespace="http://schemas.microsoft.com/office/2006/metadata/properties" ma:root="true" ma:fieldsID="a9b251146c0969b4148fd5eb32063808" ns2:_="" ns3:_="" ns4:_="">
     <xsd:import namespace="e3c6f3b3-f88f-4e57-8294-d53de8f54b2b"/>
     <xsd:import namespace="0e9fbc54-175b-41a1-a915-0ab6c7e45301"/>
     <xsd:import namespace="30c688ba-d7e6-407b-8c35-f2a020af6bce"/>
@@ -37611,7 +38108,7 @@
         </xsd:restriction>
       </xsd:simpleType>
     </xsd:element>
-    <xsd:element name="lcf76f155ced4ddcb4097134ff3c332f" ma:index="23" nillable="true" ma:taxonomy="true" ma:internalName="lcf76f155ced4ddcb4097134ff3c332f" ma:taxonomyFieldName="MediaServiceImageTags" ma:displayName="Image Tags" ma:readOnly="false" ma:fieldId="{5cf76f15-5ced-4ddc-b409-7134ff3c332f}" ma:taxonomyMulti="true" ma:sspId="f703290f-f62f-40c2-94a3-a7aef626be57" ma:termSetId="09814cd3-568e-fe90-9814-8d621ff8fb84" ma:anchorId="fba54fb3-c3e1-fe81-a776-ca4b69148c4d" ma:open="true" ma:isKeyword="false">
+    <xsd:element name="lcf76f155ced4ddcb4097134ff3c332f" ma:index="23" nillable="true" ma:taxonomy="true" ma:internalName="lcf76f155ced4ddcb4097134ff3c332f" ma:taxonomyFieldName="MediaServiceImageTags" ma:displayName="Etiquetas de imagen" ma:readOnly="false" ma:fieldId="{5cf76f15-5ced-4ddc-b409-7134ff3c332f}" ma:taxonomyMulti="true" ma:sspId="f703290f-f62f-40c2-94a3-a7aef626be57" ma:termSetId="09814cd3-568e-fe90-9814-8d621ff8fb84" ma:anchorId="fba54fb3-c3e1-fe81-a776-ca4b69148c4d" ma:open="true" ma:isKeyword="false">
       <xsd:complexType>
         <xsd:sequence>
           <xsd:element ref="pc:Terms" minOccurs="0" maxOccurs="1"/>
@@ -37672,7 +38169,7 @@
   <xsd:schema xmlns:xsd="http://www.w3.org/2001/XMLSchema" xmlns:xs="http://www.w3.org/2001/XMLSchema" xmlns:dms="http://schemas.microsoft.com/office/2006/documentManagement/types" xmlns:pc="http://schemas.microsoft.com/office/infopath/2007/PartnerControls" targetNamespace="0e9fbc54-175b-41a1-a915-0ab6c7e45301" elementFormDefault="qualified">
     <xsd:import namespace="http://schemas.microsoft.com/office/2006/documentManagement/types"/>
     <xsd:import namespace="http://schemas.microsoft.com/office/infopath/2007/PartnerControls"/>
-    <xsd:element name="SharedWithUsers" ma:index="13" nillable="true" ma:displayName="Shared With" ma:internalName="SharedWithUsers" ma:readOnly="true">
+    <xsd:element name="SharedWithUsers" ma:index="13" nillable="true" ma:displayName="Compartido con" ma:internalName="SharedWithUsers" ma:readOnly="true">
       <xsd:complexType>
         <xsd:complexContent>
           <xsd:extension base="dms:UserMulti">
@@ -37691,7 +38188,7 @@
         </xsd:complexContent>
       </xsd:complexType>
     </xsd:element>
-    <xsd:element name="SharedWithDetails" ma:index="14" nillable="true" ma:displayName="Shared With Details" ma:internalName="SharedWithDetails" ma:readOnly="true">
+    <xsd:element name="SharedWithDetails" ma:index="14" nillable="true" ma:displayName="Detalles de uso compartido" ma:internalName="SharedWithDetails" ma:readOnly="true">
       <xsd:simpleType>
         <xsd:restriction base="dms:Note">
           <xsd:maxLength value="255"/>
@@ -37723,8 +38220,8 @@
         <xsd:element ref="dc:creator" minOccurs="0" maxOccurs="1"/>
         <xsd:element ref="dcterms:created" minOccurs="0" maxOccurs="1"/>
         <xsd:element ref="dc:identifier" minOccurs="0" maxOccurs="1"/>
-        <xsd:element name="contentType" minOccurs="0" maxOccurs="1" type="xsd:string" ma:index="0" ma:displayName="Content Type"/>
-        <xsd:element ref="dc:title" minOccurs="0" maxOccurs="1" ma:index="4" ma:displayName="Title"/>
+        <xsd:element name="contentType" minOccurs="0" maxOccurs="1" type="xsd:string" ma:index="0" ma:displayName="Tipo de contenido"/>
+        <xsd:element ref="dc:title" minOccurs="0" maxOccurs="1" ma:index="4" ma:displayName="Título"/>
         <xsd:element ref="dc:subject" minOccurs="0" maxOccurs="1"/>
         <xsd:element ref="dc:description" minOccurs="0" maxOccurs="1"/>
         <xsd:element name="keywords" minOccurs="0" maxOccurs="1" type="xsd:string"/>
@@ -37813,24 +38310,7 @@
 </ct:contentTypeSchema>
 </file>
 
-<file path=customXml/item2.xml><?xml version="1.0" encoding="utf-8"?>
-<p:properties xmlns:p="http://schemas.microsoft.com/office/2006/metadata/properties" xmlns:xsi="http://www.w3.org/2001/XMLSchema-instance" xmlns:pc="http://schemas.microsoft.com/office/infopath/2007/PartnerControls">
-  <documentManagement>
-    <Location xmlns="e3c6f3b3-f88f-4e57-8294-d53de8f54b2b" xsi:nil="true"/>
-    <TaxCatchAll xmlns="30c688ba-d7e6-407b-8c35-f2a020af6bce" xsi:nil="true"/>
-    <Comentarios xmlns="e3c6f3b3-f88f-4e57-8294-d53de8f54b2b" xsi:nil="true"/>
-    <lcf76f155ced4ddcb4097134ff3c332f xmlns="e3c6f3b3-f88f-4e57-8294-d53de8f54b2b">
-      <Terms xmlns="http://schemas.microsoft.com/office/infopath/2007/PartnerControls"/>
-    </lcf76f155ced4ddcb4097134ff3c332f>
-  </documentManagement>
-</p:properties>
-</file>
-
 <file path=customXml/item3.xml><?xml version="1.0" encoding="utf-8"?>
-<b:Sources xmlns:b="http://schemas.openxmlformats.org/officeDocument/2006/bibliography" xmlns="http://schemas.openxmlformats.org/officeDocument/2006/bibliography" SelectedStyle="\APA.XSL" StyleName="APA"/>
-</file>
-
-<file path=customXml/item4.xml><?xml version="1.0" encoding="utf-8"?>
 <?mso-contentType ?>
 <FormTemplates xmlns="http://schemas.microsoft.com/sharepoint/v3/contenttype/forms">
   <Display>DocumentLibraryForm</Display>
@@ -37839,8 +38319,30 @@
 </FormTemplates>
 </file>
 
+<file path=customXml/item4.xml><?xml version="1.0" encoding="utf-8"?>
+<b:Sources xmlns:b="http://schemas.openxmlformats.org/officeDocument/2006/bibliography" xmlns="http://schemas.openxmlformats.org/officeDocument/2006/bibliography" SelectedStyle="\APA.XSL" StyleName="APA"/>
+</file>
+
 <file path=customXml/itemProps1.xml><?xml version="1.0" encoding="utf-8"?>
-<ds:datastoreItem xmlns:ds="http://schemas.openxmlformats.org/officeDocument/2006/customXml" ds:itemID="{50C9621E-EFBA-4851-AC04-F8929A7CE694}">
+<ds:datastoreItem xmlns:ds="http://schemas.openxmlformats.org/officeDocument/2006/customXml" ds:itemID="{F5EE0990-2639-455E-ADD9-A07D4919791F}">
+  <ds:schemaRefs>
+    <ds:schemaRef ds:uri="http://schemas.microsoft.com/office/2006/documentManagement/types"/>
+    <ds:schemaRef ds:uri="http://purl.org/dc/elements/1.1/"/>
+    <ds:schemaRef ds:uri="http://schemas.microsoft.com/office/2006/metadata/properties"/>
+    <ds:schemaRef ds:uri="0e9fbc54-175b-41a1-a915-0ab6c7e45301"/>
+    <ds:schemaRef ds:uri="e3c6f3b3-f88f-4e57-8294-d53de8f54b2b"/>
+    <ds:schemaRef ds:uri="http://purl.org/dc/terms/"/>
+    <ds:schemaRef ds:uri="30c688ba-d7e6-407b-8c35-f2a020af6bce"/>
+    <ds:schemaRef ds:uri="http://schemas.microsoft.com/office/infopath/2007/PartnerControls"/>
+    <ds:schemaRef ds:uri="http://schemas.openxmlformats.org/package/2006/metadata/core-properties"/>
+    <ds:schemaRef ds:uri="http://www.w3.org/XML/1998/namespace"/>
+    <ds:schemaRef ds:uri="http://purl.org/dc/dcmitype/"/>
+  </ds:schemaRefs>
+</ds:datastoreItem>
+</file>
+
+<file path=customXml/itemProps2.xml><?xml version="1.0" encoding="utf-8"?>
+<ds:datastoreItem xmlns:ds="http://schemas.openxmlformats.org/officeDocument/2006/customXml" ds:itemID="{00A60616-87B9-4225-926E-1B2A6092207C}">
   <ds:schemaRefs>
     <ds:schemaRef ds:uri="http://schemas.microsoft.com/office/2006/metadata/contentType"/>
     <ds:schemaRef ds:uri="http://schemas.microsoft.com/office/2006/metadata/properties/metaAttributes"/>
@@ -37859,36 +38361,18 @@
 </ds:datastoreItem>
 </file>
 
-<file path=customXml/itemProps2.xml><?xml version="1.0" encoding="utf-8"?>
-<ds:datastoreItem xmlns:ds="http://schemas.openxmlformats.org/officeDocument/2006/customXml" ds:itemID="{F5EE0990-2639-455E-ADD9-A07D4919791F}">
+<file path=customXml/itemProps3.xml><?xml version="1.0" encoding="utf-8"?>
+<ds:datastoreItem xmlns:ds="http://schemas.openxmlformats.org/officeDocument/2006/customXml" ds:itemID="{21A4DB45-409C-4DEF-8812-8665FC39DFA9}">
   <ds:schemaRefs>
-    <ds:schemaRef ds:uri="0e9fbc54-175b-41a1-a915-0ab6c7e45301"/>
-    <ds:schemaRef ds:uri="http://purl.org/dc/terms/"/>
-    <ds:schemaRef ds:uri="30c688ba-d7e6-407b-8c35-f2a020af6bce"/>
-    <ds:schemaRef ds:uri="http://schemas.microsoft.com/office/2006/documentManagement/types"/>
-    <ds:schemaRef ds:uri="http://www.w3.org/XML/1998/namespace"/>
-    <ds:schemaRef ds:uri="http://schemas.microsoft.com/office/infopath/2007/PartnerControls"/>
-    <ds:schemaRef ds:uri="http://purl.org/dc/elements/1.1/"/>
-    <ds:schemaRef ds:uri="http://schemas.microsoft.com/office/2006/metadata/properties"/>
-    <ds:schemaRef ds:uri="http://schemas.openxmlformats.org/package/2006/metadata/core-properties"/>
-    <ds:schemaRef ds:uri="e3c6f3b3-f88f-4e57-8294-d53de8f54b2b"/>
-    <ds:schemaRef ds:uri="http://purl.org/dc/dcmitype/"/>
+    <ds:schemaRef ds:uri="http://schemas.microsoft.com/sharepoint/v3/contenttype/forms"/>
   </ds:schemaRefs>
 </ds:datastoreItem>
 </file>
 
-<file path=customXml/itemProps3.xml><?xml version="1.0" encoding="utf-8"?>
+<file path=customXml/itemProps4.xml><?xml version="1.0" encoding="utf-8"?>
 <ds:datastoreItem xmlns:ds="http://schemas.openxmlformats.org/officeDocument/2006/customXml" ds:itemID="{E3ED58A4-5EAD-440B-9F54-4CA4F76A7F32}">
   <ds:schemaRefs>
     <ds:schemaRef ds:uri="http://schemas.openxmlformats.org/officeDocument/2006/bibliography"/>
   </ds:schemaRefs>
 </ds:datastoreItem>
-</file>
-
-<file path=customXml/itemProps4.xml><?xml version="1.0" encoding="utf-8"?>
-<ds:datastoreItem xmlns:ds="http://schemas.openxmlformats.org/officeDocument/2006/customXml" ds:itemID="{21A4DB45-409C-4DEF-8812-8665FC39DFA9}">
-  <ds:schemaRefs>
-    <ds:schemaRef ds:uri="http://schemas.microsoft.com/sharepoint/v3/contenttype/forms"/>
-  </ds:schemaRefs>
-</ds:datastoreItem>
 </file>
</xml_diff>